<commit_message>
Remove a/b subheadings from introduction draft
The a-g items in the course instructions are a content checklist, not
section headings, so the introduction now reads as continuous prose.

Co-Authored-By: Claude Opus 5.5 <noreply@anthropic.com>
Claude-Session: https://claude.ai/code/session_01Ghe1P8BgNsyGdHuD4xCbdv
</commit_message>
<xml_diff>
--- a/docs/Introduction_Draft.docx
+++ b/docs/Introduction_Draft.docx
@@ -12,18 +12,6 @@
     </w:p>
     <w:p>
       <w:pPr>
-        <w:spacing w:after="120" w:before="240" w:line="480"/>
-      </w:pPr>
-      <w:r>
-        <w:rPr>
-          <w:b/>
-          <w:bCs/>
-        </w:rPr>
-        <w:t xml:space="preserve">a) Background: State of the Art</w:t>
-      </w:r>
-    </w:p>
-    <w:p>
-      <w:pPr>
         <w:spacing w:after="0" w:line="480"/>
         <w:ind w:firstLine="720"/>
       </w:pPr>
@@ -87,18 +75,6 @@
     </w:p>
     <w:p>
       <w:pPr>
-        <w:spacing w:after="120" w:before="240" w:line="480"/>
-      </w:pPr>
-      <w:r>
-        <w:rPr>
-          <w:b/>
-          <w:bCs/>
-        </w:rPr>
-        <w:t xml:space="preserve">b) Problem Addressed</w:t>
-      </w:r>
-    </w:p>
-    <w:p>
-      <w:pPr>
         <w:spacing w:after="0" w:line="480"/>
         <w:ind w:firstLine="720"/>
       </w:pPr>
@@ -117,18 +93,6 @@
     </w:p>
     <w:p>
       <w:pPr>
-        <w:spacing w:after="120" w:before="240" w:line="480"/>
-      </w:pPr>
-      <w:r>
-        <w:rPr>
-          <w:b/>
-          <w:bCs/>
-        </w:rPr>
-        <w:t xml:space="preserve">c) Objectives of the Proposed Project</w:t>
-      </w:r>
-    </w:p>
-    <w:p>
-      <w:pPr>
         <w:spacing w:after="0" w:line="480"/>
         <w:ind w:firstLine="720"/>
       </w:pPr>
@@ -138,19 +102,7 @@
           <w:iCs/>
           <w:color w:val="808080"/>
         </w:rPr>
-        <w:t xml:space="preserve">[To be written]</w:t>
-      </w:r>
-    </w:p>
-    <w:p>
-      <w:pPr>
-        <w:spacing w:after="120" w:before="240" w:line="480"/>
-      </w:pPr>
-      <w:r>
-        <w:rPr>
-          <w:b/>
-          <w:bCs/>
-        </w:rPr>
-        <w:t xml:space="preserve">d) Adopted Approach</w:t>
+        <w:t xml:space="preserve">[To be written: objectives of the proposed project]</w:t>
       </w:r>
     </w:p>
     <w:p>
@@ -164,19 +116,7 @@
           <w:iCs/>
           <w:color w:val="808080"/>
         </w:rPr>
-        <w:t xml:space="preserve">[To be written]</w:t>
-      </w:r>
-    </w:p>
-    <w:p>
-      <w:pPr>
-        <w:spacing w:after="120" w:before="240" w:line="480"/>
-      </w:pPr>
-      <w:r>
-        <w:rPr>
-          <w:b/>
-          <w:bCs/>
-        </w:rPr>
-        <w:t xml:space="preserve">e) Current Trends</w:t>
+        <w:t xml:space="preserve">[To be written: adopted approach]</w:t>
       </w:r>
     </w:p>
     <w:p>
@@ -190,19 +130,7 @@
           <w:iCs/>
           <w:color w:val="808080"/>
         </w:rPr>
-        <w:t xml:space="preserve">[To be written]</w:t>
-      </w:r>
-    </w:p>
-    <w:p>
-      <w:pPr>
-        <w:spacing w:after="120" w:before="240" w:line="480"/>
-      </w:pPr>
-      <w:r>
-        <w:rPr>
-          <w:b/>
-          <w:bCs/>
-        </w:rPr>
-        <w:t xml:space="preserve">f) Related Commercial Systems, Ethics, Economics and Sustainability</w:t>
+        <w:t xml:space="preserve">[To be written: current trends]</w:t>
       </w:r>
     </w:p>
     <w:p>
@@ -216,7 +144,7 @@
           <w:iCs/>
           <w:color w:val="808080"/>
         </w:rPr>
-        <w:t xml:space="preserve">[To be written]</w:t>
+        <w:t xml:space="preserve">[To be written: related commercial systems; research status, ethics, economics and sustainability]</w:t>
       </w:r>
     </w:p>
     <w:p>
@@ -226,6 +154,20 @@
       </w:pPr>
       <w:r>
         <w:t xml:space="preserve">References</w:t>
+      </w:r>
+    </w:p>
+    <w:p>
+      <w:pPr>
+        <w:spacing w:after="0" w:line="480"/>
+        <w:ind w:firstLine="720"/>
+      </w:pPr>
+      <w:r>
+        <w:rPr>
+          <w:i/>
+          <w:iCs/>
+          <w:color w:val="808080"/>
+        </w:rPr>
+        <w:t xml:space="preserve">[Move this list to Section 12 in the final report.]</w:t>
       </w:r>
     </w:p>
     <w:p>

</xml_diff>

<commit_message>
Complete introduction draft with figures and comparison table
Adds objectives, approach, current trends, and commercial systems, ethics,
economics and sustainability to the introduction; three figures (block
diagram, decision flow, survey chart) with the script that draws them; a
patent comparison table; and 19 references.

Co-Authored-By: Claude Opus 5.5 <noreply@anthropic.com>
Claude-Session: https://claude.ai/code/session_01Ghe1P8BgNsyGdHuD4xCbdv
</commit_message>
<xml_diff>
--- a/docs/Introduction_Draft.docx
+++ b/docs/Introduction_Draft.docx
@@ -20,8 +20,6 @@
       </w:r>
       <w:r>
         <w:rPr>
-          <w:b w:val="false"/>
-          <w:bCs w:val="false"/>
           <w:i/>
           <w:iCs/>
         </w:rPr>
@@ -32,8 +30,6 @@
       </w:r>
       <w:r>
         <w:rPr>
-          <w:b w:val="false"/>
-          <w:bCs w:val="false"/>
           <w:i/>
           <w:iCs/>
         </w:rPr>
@@ -44,8 +40,6 @@
       </w:r>
       <w:r>
         <w:rPr>
-          <w:b w:val="false"/>
-          <w:bCs w:val="false"/>
           <w:i/>
           <w:iCs/>
         </w:rPr>
@@ -61,7 +55,7 @@
         <w:ind w:firstLine="720"/>
       </w:pPr>
       <w:r>
-        <w:t xml:space="preserve">Recent research is therefore moving toward gloss-free and self-supervised models. SignDino, for example, learns sign representations from video without any gloss or text labels [4]. A parallel trend is lightweight models that work on body and hand landmarks extracted by tools such as MediaPipe [5], rather than on full video frames, which makes them small and fast enough for embedded hardware. The winning solution of Google's Isolated Sign Language Recognition competition on Kaggle, a 1D convolutional network combined with a transformer, is one example [6].</w:t>
+        <w:t xml:space="preserve">Recent research is therefore moving toward gloss-free and self-supervised models. SignDino, for example, learns sign representations from video without any gloss or text labels [4]. A parallel trend is lightweight models that work on body and hand landmarks extracted by tools such as MediaPipe [5], rather than on full video frames, which makes them small and fast enough for embedded hardware. The winning solution of the Google – Isolated Sign Language Recognition competition on Kaggle, a 1D convolutional network combined with a transformer, is one example [6].</w:t>
       </w:r>
     </w:p>
     <w:p>
@@ -89,6 +83,1038 @@
       </w:pPr>
       <w:r>
         <w:t xml:space="preserve">Our device addresses each of these weaknesses. All processing runs locally on an embedded GPU, so the device works without a network connection and no video leaves it. A built-in microphone converts the hearing person's speech to on-screen text, so a single device supports a two-way conversation. The device speaks a sentence only after the user confirms it on screen, and when its confidence is low it shows a list of candidate signs instead of guessing. The device is intended to provide access when an interpreter is unavailable, such as at a service counter, a front desk, or while waiting for an interpreter to arrive. It is not a replacement for certified interpreters.</w:t>
+      </w:r>
+    </w:p>
+    <w:p>
+      <w:pPr>
+        <w:spacing w:after="0" w:line="480"/>
+        <w:ind w:firstLine="720"/>
+      </w:pPr>
+      <w:r>
+        <w:t xml:space="preserve">The objective of this project is to design and build a portable prototype that lets a Deaf ASL user hold a short two-way conversation with a hearing person who speaks English, Turkish or Spanish, without an internet connection. The prototype is scoped to structured, everyday exchanges such as those at a service counter or front desk. Its technical goals are to recognize a vocabulary of 100–250 ASL signs, with fingerspelling as a fallback, at no less than 75% top-1 and 90% top-5 accuracy on signers not seen during training; to speak a confirmed sentence in the selected language within 1.2 s of the user's confirmation; to show the hearing person's spoken reply as English text; and to run entirely on an embedded GPU. The project also has a reliability objective: the device should abstain rather than voice a translation it is not confident in, and we will report its accuracy on the sentences it does speak, not only its overall accuracy. These figures are design targets; measured results will be reported as the project progresses.</w:t>
+      </w:r>
+    </w:p>
+    <w:p>
+      <w:pPr>
+        <w:spacing w:after="0" w:line="480"/>
+        <w:ind w:firstLine="720"/>
+      </w:pPr>
+      <w:r>
+        <w:t xml:space="preserve">Figure 1 shows the system architecture. A camera captures the signer, and MediaPipe [5] extracts body, hand and face landmarks from each frame. In natural signing, signs flow into each other with minimal pauses, and segmenting them automatically is still an open research problem [7]. The user therefore signs one sign at a time and returns the hands to a rest position between signs, and the device uses this rest pose to mark where each sign ends. A lightweight landmark-based model, following the 1D-CNN and transformer design of [6], classifies each sign and outputs its five most likely labels with confidence scores. The model will be trained on the ASL Citizen dataset [2] and evaluated on its signer-independent test split and on recordings from our own test users.</w:t>
+      </w:r>
+    </w:p>
+    <w:p>
+      <w:pPr>
+        <w:spacing w:after="60" w:before="240"/>
+        <w:jc w:val="center"/>
+      </w:pPr>
+      <w:r>
+        <w:drawing>
+          <wp:inline distT="0" distB="0" distL="0" distR="0">
+            <wp:extent cx="5760720" cy="2733675"/>
+            <wp:effectExtent t="0" r="0" b="0" l="0"/>
+            <wp:docPr id="1" name="fig1_block_diagram.png" descr="Figure 1. System block diagram. All processing runs on the embedded GPU without a network connection." title="Figure 1. System block diagram. All processing runs on the embedded GPU without a network connection."/>
+            <wp:cNvGraphicFramePr>
+              <a:graphicFrameLocks xmlns:a="http://schemas.openxmlformats.org/drawingml/2006/main" noChangeAspect="1"/>
+            </wp:cNvGraphicFramePr>
+            <a:graphic xmlns:a="http://schemas.openxmlformats.org/drawingml/2006/main">
+              <a:graphicData uri="http://schemas.openxmlformats.org/drawingml/2006/picture">
+                <pic:pic xmlns:pic="http://schemas.openxmlformats.org/drawingml/2006/picture">
+                  <pic:nvPicPr>
+                    <pic:cNvPr id="0" name="" descr=""/>
+                    <pic:cNvPicPr>
+                      <a:picLocks noChangeAspect="1" noChangeArrowheads="1"/>
+                    </pic:cNvPicPr>
+                  </pic:nvPicPr>
+                  <pic:blipFill>
+                    <a:blip r:embed="rId7" cstate="none"/>
+                    <a:srcRect/>
+                    <a:stretch>
+                      <a:fillRect/>
+                    </a:stretch>
+                  </pic:blipFill>
+                  <pic:spPr bwMode="auto">
+                    <a:xfrm>
+                      <a:off x="0" y="0"/>
+                      <a:ext cx="5760720" cy="2733675"/>
+                    </a:xfrm>
+                    <a:prstGeom prst="rect">
+                      <a:avLst/>
+                    </a:prstGeom>
+                  </pic:spPr>
+                </pic:pic>
+              </a:graphicData>
+            </a:graphic>
+          </wp:inline>
+        </w:drawing>
+      </w:r>
+    </w:p>
+    <w:p>
+      <w:pPr>
+        <w:spacing w:after="240"/>
+        <w:jc w:val="center"/>
+      </w:pPr>
+      <w:r>
+        <w:rPr>
+          <w:b/>
+          <w:bCs/>
+          <w:sz w:val="20"/>
+          <w:szCs w:val="20"/>
+        </w:rPr>
+        <w:t xml:space="preserve">Figure 1. </w:t>
+      </w:r>
+      <w:r>
+        <w:rPr>
+          <w:sz w:val="20"/>
+          <w:szCs w:val="20"/>
+        </w:rPr>
+        <w:t xml:space="preserve">System block diagram. All processing runs on the embedded GPU without a network connection.</w:t>
+      </w:r>
+    </w:p>
+    <w:p>
+      <w:pPr>
+        <w:spacing w:after="0" w:line="480"/>
+        <w:ind w:firstLine="720"/>
+      </w:pPr>
+      <w:r>
+        <w:t xml:space="preserve">The recognized signs are ASL glosses, not English. ASL has its own word order and grammar, so a sequence such as STORE ME GO must become “I am going to the store.” A sentence builder performs this step, using templates for common phrases in the target setting and a small language model as a fallback, in line with recent work that applies pretrained language models to gloss-to-text translation [8]. The English sentence is shown on screen for the user to confirm or edit. Only confirmed sentences are translated into Turkish or Spanish with NLLB-200 [9] and spoken with Piper, an offline neural text-to-speech system [10]. In the reverse direction, Whisper [11] transcribes the hearing person's reply and translates it into English text for the Deaf user.</w:t>
+      </w:r>
+    </w:p>
+    <w:p>
+      <w:pPr>
+        <w:spacing w:after="0" w:line="480"/>
+        <w:ind w:firstLine="720"/>
+      </w:pPr>
+      <w:r>
+        <w:t xml:space="preserve">Figure 2 shows how the device decides when to speak. If the recognizer's confidence for a sign is above a threshold, the top sign is accepted; otherwise the device shows the five most likely candidates and the user picks one or signs again. This follows the idea of selective prediction, in which a model may abstain on uncertain inputs to raise accuracy on the answers it does give [12]. We will evaluate this trade-off with risk–coverage curves and report accuracy separately for each test signer.</w:t>
+      </w:r>
+    </w:p>
+    <w:p>
+      <w:pPr>
+        <w:spacing w:after="60" w:before="240"/>
+        <w:jc w:val="center"/>
+      </w:pPr>
+      <w:r>
+        <w:drawing>
+          <wp:inline distT="0" distB="0" distL="0" distR="0">
+            <wp:extent cx="5486400" cy="3028950"/>
+            <wp:effectExtent t="0" r="0" b="0" l="0"/>
+            <wp:docPr id="1" name="fig2_decision_flow.png" descr="Figure 2. Decision flow for confidence-gated output. Nothing is spoken until the user confirms the English sentence." title="Figure 2. Decision flow for confidence-gated output. Nothing is spoken until the user confirms the English sentence."/>
+            <wp:cNvGraphicFramePr>
+              <a:graphicFrameLocks xmlns:a="http://schemas.openxmlformats.org/drawingml/2006/main" noChangeAspect="1"/>
+            </wp:cNvGraphicFramePr>
+            <a:graphic xmlns:a="http://schemas.openxmlformats.org/drawingml/2006/main">
+              <a:graphicData uri="http://schemas.openxmlformats.org/drawingml/2006/picture">
+                <pic:pic xmlns:pic="http://schemas.openxmlformats.org/drawingml/2006/picture">
+                  <pic:nvPicPr>
+                    <pic:cNvPr id="0" name="" descr=""/>
+                    <pic:cNvPicPr>
+                      <a:picLocks noChangeAspect="1" noChangeArrowheads="1"/>
+                    </pic:cNvPicPr>
+                  </pic:nvPicPr>
+                  <pic:blipFill>
+                    <a:blip r:embed="rId8" cstate="none"/>
+                    <a:srcRect/>
+                    <a:stretch>
+                      <a:fillRect/>
+                    </a:stretch>
+                  </pic:blipFill>
+                  <pic:spPr bwMode="auto">
+                    <a:xfrm>
+                      <a:off x="0" y="0"/>
+                      <a:ext cx="5486400" cy="3028950"/>
+                    </a:xfrm>
+                    <a:prstGeom prst="rect">
+                      <a:avLst/>
+                    </a:prstGeom>
+                  </pic:spPr>
+                </pic:pic>
+              </a:graphicData>
+            </a:graphic>
+          </wp:inline>
+        </w:drawing>
+      </w:r>
+    </w:p>
+    <w:p>
+      <w:pPr>
+        <w:spacing w:after="240"/>
+        <w:jc w:val="center"/>
+      </w:pPr>
+      <w:r>
+        <w:rPr>
+          <w:b/>
+          <w:bCs/>
+          <w:sz w:val="20"/>
+          <w:szCs w:val="20"/>
+        </w:rPr>
+        <w:t xml:space="preserve">Figure 2. </w:t>
+      </w:r>
+      <w:r>
+        <w:rPr>
+          <w:sz w:val="20"/>
+          <w:szCs w:val="20"/>
+        </w:rPr>
+        <w:t xml:space="preserve">Decision flow for confidence-gated output. Nothing is spoken until the user confirms the English sentence.</w:t>
+      </w:r>
+    </w:p>
+    <w:p>
+      <w:pPr>
+        <w:spacing w:after="0" w:line="480"/>
+        <w:ind w:firstLine="720"/>
+      </w:pPr>
+      <w:r>
+        <w:t xml:space="preserve">Three trends shape the field. First, research is moving from gloss-based pipelines toward gloss-free and self-supervised models that learn from large amounts of unlabeled video [4], and pretrained language models are increasingly used for the language side of translation [8]. Second, models are moving onto consumer and embedded hardware. Landmark-based recognizers are small enough to run in real time on phones and single-board computers, which makes offline, privacy-preserving devices practical [5], [6]. Third, the field increasingly recognizes that sign language technology must be designed with Deaf communities rather than for them. Researchers have called for systems built around specific, real-world use cases with input from Deaf culture and linguistics experts [13], and Deaf and hard-of-hearing participants in recent studies emphasize Deaf-led design and warn of harm when they are excluded from decisions [14]. Our project follows the second and third trends directly; it does not attempt gloss-free continuous translation, which still requires large models and datasets.</w:t>
+      </w:r>
+    </w:p>
+    <w:p>
+      <w:pPr>
+        <w:spacing w:after="0" w:line="480"/>
+        <w:ind w:firstLine="720"/>
+      </w:pPr>
+      <w:r>
+        <w:t xml:space="preserve">No automatic ASL translation system is yet reliable enough for general use [1]. The best-known commercial effort, SignAll, combines multiple cameras with natural language processing to translate ASL into English text [15]. Patents show several other approaches, summarized in Table 1: multiple cameras with a depth sensor [16], single-camera recognition with cloud processing [17], sensor gloves [18], and an earlier glove- or camera-based system with speech output [19]. The closest to our design is [17], which also works from a single camera and, in one embodiment, lets the user choose among the three most likely translations. Our device differs from all four in combining single-camera input, fully offline processing on an embedded GPU, confidence-gated output and speech in several languages. It is also a form factor the Deaf community is open to: 69% of survey participants were comfortable using a stand-alone system of this kind, compared with 38% for wearables (Figure 3) [1].</w:t>
+      </w:r>
+    </w:p>
+    <w:p>
+      <w:pPr>
+        <w:spacing w:after="120" w:before="240"/>
+        <w:jc w:val="center"/>
+      </w:pPr>
+      <w:r>
+        <w:rPr>
+          <w:b/>
+          <w:bCs/>
+          <w:sz w:val="20"/>
+          <w:szCs w:val="20"/>
+        </w:rPr>
+        <w:t xml:space="preserve">Table 1. </w:t>
+      </w:r>
+      <w:r>
+        <w:rPr>
+          <w:sz w:val="20"/>
+          <w:szCs w:val="20"/>
+        </w:rPr>
+        <w:t xml:space="preserve">Comparison of patented sign language translation systems with the proposed device.</w:t>
+      </w:r>
+    </w:p>
+    <w:tbl>
+      <w:tblPr>
+        <w:tblW w:type="dxa" w:w="9360"/>
+        <w:tblBorders>
+          <w:top w:val="single" w:color="auto" w:sz="4"/>
+          <w:left w:val="single" w:color="auto" w:sz="4"/>
+          <w:bottom w:val="single" w:color="auto" w:sz="4"/>
+          <w:right w:val="single" w:color="auto" w:sz="4"/>
+          <w:insideH w:val="single" w:color="auto" w:sz="4"/>
+          <w:insideV w:val="single" w:color="auto" w:sz="4"/>
+        </w:tblBorders>
+      </w:tblPr>
+      <w:tblGrid>
+        <w:gridCol w:w="1700"/>
+        <w:gridCol w:w="2100"/>
+        <w:gridCol w:w="1900"/>
+        <w:gridCol w:w="3660"/>
+      </w:tblGrid>
+      <w:tr>
+        <w:trPr>
+          <w:tblHeader/>
+        </w:trPr>
+        <w:tc>
+          <w:tcPr>
+            <w:tcW w:type="dxa" w:w="1700"/>
+            <w:tcBorders>
+              <w:top w:val="single" w:color="808080" w:sz="4"/>
+              <w:left w:val="single" w:color="808080" w:sz="4"/>
+              <w:bottom w:val="single" w:color="808080" w:sz="4"/>
+              <w:right w:val="single" w:color="808080" w:sz="4"/>
+            </w:tcBorders>
+            <w:shd w:fill="E7E6E6" w:color="auto" w:val="clear"/>
+            <w:tcMar>
+              <w:top w:type="dxa" w:w="60"/>
+              <w:left w:type="dxa" w:w="100"/>
+              <w:bottom w:type="dxa" w:w="60"/>
+              <w:right w:type="dxa" w:w="100"/>
+            </w:tcMar>
+          </w:tcPr>
+          <w:p>
+            <w:r>
+              <w:rPr>
+                <w:b/>
+                <w:bCs/>
+                <w:sz w:val="20"/>
+                <w:szCs w:val="20"/>
+              </w:rPr>
+              <w:t xml:space="preserve">System</w:t>
+            </w:r>
+          </w:p>
+        </w:tc>
+        <w:tc>
+          <w:tcPr>
+            <w:tcW w:type="dxa" w:w="2100"/>
+            <w:tcBorders>
+              <w:top w:val="single" w:color="808080" w:sz="4"/>
+              <w:left w:val="single" w:color="808080" w:sz="4"/>
+              <w:bottom w:val="single" w:color="808080" w:sz="4"/>
+              <w:right w:val="single" w:color="808080" w:sz="4"/>
+            </w:tcBorders>
+            <w:shd w:fill="E7E6E6" w:color="auto" w:val="clear"/>
+            <w:tcMar>
+              <w:top w:type="dxa" w:w="60"/>
+              <w:left w:type="dxa" w:w="100"/>
+              <w:bottom w:type="dxa" w:w="60"/>
+              <w:right w:type="dxa" w:w="100"/>
+            </w:tcMar>
+          </w:tcPr>
+          <w:p>
+            <w:r>
+              <w:rPr>
+                <w:b/>
+                <w:bCs/>
+                <w:sz w:val="20"/>
+                <w:szCs w:val="20"/>
+              </w:rPr>
+              <w:t xml:space="preserve">Input</w:t>
+            </w:r>
+          </w:p>
+        </w:tc>
+        <w:tc>
+          <w:tcPr>
+            <w:tcW w:type="dxa" w:w="1900"/>
+            <w:tcBorders>
+              <w:top w:val="single" w:color="808080" w:sz="4"/>
+              <w:left w:val="single" w:color="808080" w:sz="4"/>
+              <w:bottom w:val="single" w:color="808080" w:sz="4"/>
+              <w:right w:val="single" w:color="808080" w:sz="4"/>
+            </w:tcBorders>
+            <w:shd w:fill="E7E6E6" w:color="auto" w:val="clear"/>
+            <w:tcMar>
+              <w:top w:type="dxa" w:w="60"/>
+              <w:left w:type="dxa" w:w="100"/>
+              <w:bottom w:type="dxa" w:w="60"/>
+              <w:right w:type="dxa" w:w="100"/>
+            </w:tcMar>
+          </w:tcPr>
+          <w:p>
+            <w:r>
+              <w:rPr>
+                <w:b/>
+                <w:bCs/>
+                <w:sz w:val="20"/>
+                <w:szCs w:val="20"/>
+              </w:rPr>
+              <w:t xml:space="preserve">Processing</w:t>
+            </w:r>
+          </w:p>
+        </w:tc>
+        <w:tc>
+          <w:tcPr>
+            <w:tcW w:type="dxa" w:w="3660"/>
+            <w:tcBorders>
+              <w:top w:val="single" w:color="808080" w:sz="4"/>
+              <w:left w:val="single" w:color="808080" w:sz="4"/>
+              <w:bottom w:val="single" w:color="808080" w:sz="4"/>
+              <w:right w:val="single" w:color="808080" w:sz="4"/>
+            </w:tcBorders>
+            <w:shd w:fill="E7E6E6" w:color="auto" w:val="clear"/>
+            <w:tcMar>
+              <w:top w:type="dxa" w:w="60"/>
+              <w:left w:type="dxa" w:w="100"/>
+              <w:bottom w:type="dxa" w:w="60"/>
+              <w:right w:type="dxa" w:w="100"/>
+            </w:tcMar>
+          </w:tcPr>
+          <w:p>
+            <w:r>
+              <w:rPr>
+                <w:b/>
+                <w:bCs/>
+                <w:sz w:val="20"/>
+                <w:szCs w:val="20"/>
+              </w:rPr>
+              <w:t xml:space="preserve">Output</w:t>
+            </w:r>
+          </w:p>
+        </w:tc>
+      </w:tr>
+      <w:tr>
+        <w:trPr>
+          <w:tblHeader w:val="false"/>
+        </w:trPr>
+        <w:tc>
+          <w:tcPr>
+            <w:tcW w:type="dxa" w:w="1700"/>
+            <w:tcBorders>
+              <w:top w:val="single" w:color="808080" w:sz="4"/>
+              <w:left w:val="single" w:color="808080" w:sz="4"/>
+              <w:bottom w:val="single" w:color="808080" w:sz="4"/>
+              <w:right w:val="single" w:color="808080" w:sz="4"/>
+            </w:tcBorders>
+            <w:tcMar>
+              <w:top w:type="dxa" w:w="60"/>
+              <w:left w:type="dxa" w:w="100"/>
+              <w:bottom w:type="dxa" w:w="60"/>
+              <w:right w:type="dxa" w:w="100"/>
+            </w:tcMar>
+          </w:tcPr>
+          <w:p>
+            <w:r>
+              <w:rPr>
+                <w:b w:val="false"/>
+                <w:bCs w:val="false"/>
+                <w:sz w:val="20"/>
+                <w:szCs w:val="20"/>
+              </w:rPr>
+              <w:t xml:space="preserve">Avodah [16]</w:t>
+            </w:r>
+          </w:p>
+        </w:tc>
+        <w:tc>
+          <w:tcPr>
+            <w:tcW w:type="dxa" w:w="2100"/>
+            <w:tcBorders>
+              <w:top w:val="single" w:color="808080" w:sz="4"/>
+              <w:left w:val="single" w:color="808080" w:sz="4"/>
+              <w:bottom w:val="single" w:color="808080" w:sz="4"/>
+              <w:right w:val="single" w:color="808080" w:sz="4"/>
+            </w:tcBorders>
+            <w:tcMar>
+              <w:top w:type="dxa" w:w="60"/>
+              <w:left w:type="dxa" w:w="100"/>
+              <w:bottom w:type="dxa" w:w="60"/>
+              <w:right w:type="dxa" w:w="100"/>
+            </w:tcMar>
+          </w:tcPr>
+          <w:p>
+            <w:r>
+              <w:rPr>
+                <w:b w:val="false"/>
+                <w:bCs w:val="false"/>
+                <w:sz w:val="20"/>
+                <w:szCs w:val="20"/>
+              </w:rPr>
+              <w:t xml:space="preserve">Multiple cameras and a depth sensor</w:t>
+            </w:r>
+          </w:p>
+        </w:tc>
+        <w:tc>
+          <w:tcPr>
+            <w:tcW w:type="dxa" w:w="1900"/>
+            <w:tcBorders>
+              <w:top w:val="single" w:color="808080" w:sz="4"/>
+              <w:left w:val="single" w:color="808080" w:sz="4"/>
+              <w:bottom w:val="single" w:color="808080" w:sz="4"/>
+              <w:right w:val="single" w:color="808080" w:sz="4"/>
+            </w:tcBorders>
+            <w:tcMar>
+              <w:top w:type="dxa" w:w="60"/>
+              <w:left w:type="dxa" w:w="100"/>
+              <w:bottom w:type="dxa" w:w="60"/>
+              <w:right w:type="dxa" w:w="100"/>
+            </w:tcMar>
+          </w:tcPr>
+          <w:p>
+            <w:r>
+              <w:rPr>
+                <w:b w:val="false"/>
+                <w:bCs w:val="false"/>
+                <w:sz w:val="20"/>
+                <w:szCs w:val="20"/>
+              </w:rPr>
+              <w:t xml:space="preserve">On device and in the cloud</w:t>
+            </w:r>
+          </w:p>
+        </w:tc>
+        <w:tc>
+          <w:tcPr>
+            <w:tcW w:type="dxa" w:w="3660"/>
+            <w:tcBorders>
+              <w:top w:val="single" w:color="808080" w:sz="4"/>
+              <w:left w:val="single" w:color="808080" w:sz="4"/>
+              <w:bottom w:val="single" w:color="808080" w:sz="4"/>
+              <w:right w:val="single" w:color="808080" w:sz="4"/>
+            </w:tcBorders>
+            <w:tcMar>
+              <w:top w:type="dxa" w:w="60"/>
+              <w:left w:type="dxa" w:w="100"/>
+              <w:bottom w:type="dxa" w:w="60"/>
+              <w:right w:type="dxa" w:w="100"/>
+            </w:tcMar>
+          </w:tcPr>
+          <w:p>
+            <w:r>
+              <w:rPr>
+                <w:b w:val="false"/>
+                <w:bCs w:val="false"/>
+                <w:sz w:val="20"/>
+                <w:szCs w:val="20"/>
+              </w:rPr>
+              <w:t xml:space="preserve">Text, speech or a signing avatar; two-way</w:t>
+            </w:r>
+          </w:p>
+        </w:tc>
+      </w:tr>
+      <w:tr>
+        <w:trPr>
+          <w:tblHeader w:val="false"/>
+        </w:trPr>
+        <w:tc>
+          <w:tcPr>
+            <w:tcW w:type="dxa" w:w="1700"/>
+            <w:tcBorders>
+              <w:top w:val="single" w:color="808080" w:sz="4"/>
+              <w:left w:val="single" w:color="808080" w:sz="4"/>
+              <w:bottom w:val="single" w:color="808080" w:sz="4"/>
+              <w:right w:val="single" w:color="808080" w:sz="4"/>
+            </w:tcBorders>
+            <w:tcMar>
+              <w:top w:type="dxa" w:w="60"/>
+              <w:left w:type="dxa" w:w="100"/>
+              <w:bottom w:type="dxa" w:w="60"/>
+              <w:right w:type="dxa" w:w="100"/>
+            </w:tcMar>
+          </w:tcPr>
+          <w:p>
+            <w:r>
+              <w:rPr>
+                <w:b w:val="false"/>
+                <w:bCs w:val="false"/>
+                <w:sz w:val="20"/>
+                <w:szCs w:val="20"/>
+              </w:rPr>
+              <w:t xml:space="preserve">Sign-Speak [17]</w:t>
+            </w:r>
+          </w:p>
+        </w:tc>
+        <w:tc>
+          <w:tcPr>
+            <w:tcW w:type="dxa" w:w="2100"/>
+            <w:tcBorders>
+              <w:top w:val="single" w:color="808080" w:sz="4"/>
+              <w:left w:val="single" w:color="808080" w:sz="4"/>
+              <w:bottom w:val="single" w:color="808080" w:sz="4"/>
+              <w:right w:val="single" w:color="808080" w:sz="4"/>
+            </w:tcBorders>
+            <w:tcMar>
+              <w:top w:type="dxa" w:w="60"/>
+              <w:left w:type="dxa" w:w="100"/>
+              <w:bottom w:type="dxa" w:w="60"/>
+              <w:right w:type="dxa" w:w="100"/>
+            </w:tcMar>
+          </w:tcPr>
+          <w:p>
+            <w:r>
+              <w:rPr>
+                <w:b w:val="false"/>
+                <w:bCs w:val="false"/>
+                <w:sz w:val="20"/>
+                <w:szCs w:val="20"/>
+              </w:rPr>
+              <w:t xml:space="preserve">Single camera</w:t>
+            </w:r>
+          </w:p>
+        </w:tc>
+        <w:tc>
+          <w:tcPr>
+            <w:tcW w:type="dxa" w:w="1900"/>
+            <w:tcBorders>
+              <w:top w:val="single" w:color="808080" w:sz="4"/>
+              <w:left w:val="single" w:color="808080" w:sz="4"/>
+              <w:bottom w:val="single" w:color="808080" w:sz="4"/>
+              <w:right w:val="single" w:color="808080" w:sz="4"/>
+            </w:tcBorders>
+            <w:tcMar>
+              <w:top w:type="dxa" w:w="60"/>
+              <w:left w:type="dxa" w:w="100"/>
+              <w:bottom w:type="dxa" w:w="60"/>
+              <w:right w:type="dxa" w:w="100"/>
+            </w:tcMar>
+          </w:tcPr>
+          <w:p>
+            <w:r>
+              <w:rPr>
+                <w:b w:val="false"/>
+                <w:bCs w:val="false"/>
+                <w:sz w:val="20"/>
+                <w:szCs w:val="20"/>
+              </w:rPr>
+              <w:t xml:space="preserve">Cloud (requires WiFi)</w:t>
+            </w:r>
+          </w:p>
+        </w:tc>
+        <w:tc>
+          <w:tcPr>
+            <w:tcW w:type="dxa" w:w="3660"/>
+            <w:tcBorders>
+              <w:top w:val="single" w:color="808080" w:sz="4"/>
+              <w:left w:val="single" w:color="808080" w:sz="4"/>
+              <w:bottom w:val="single" w:color="808080" w:sz="4"/>
+              <w:right w:val="single" w:color="808080" w:sz="4"/>
+            </w:tcBorders>
+            <w:tcMar>
+              <w:top w:type="dxa" w:w="60"/>
+              <w:left w:type="dxa" w:w="100"/>
+              <w:bottom w:type="dxa" w:w="60"/>
+              <w:right w:type="dxa" w:w="100"/>
+            </w:tcMar>
+          </w:tcPr>
+          <w:p>
+            <w:r>
+              <w:rPr>
+                <w:b w:val="false"/>
+                <w:bCs w:val="false"/>
+                <w:sz w:val="20"/>
+                <w:szCs w:val="20"/>
+              </w:rPr>
+              <w:t xml:space="preserve">Text in a target language; optional menu of the three most likely translations</w:t>
+            </w:r>
+          </w:p>
+        </w:tc>
+      </w:tr>
+      <w:tr>
+        <w:trPr>
+          <w:tblHeader w:val="false"/>
+        </w:trPr>
+        <w:tc>
+          <w:tcPr>
+            <w:tcW w:type="dxa" w:w="1700"/>
+            <w:tcBorders>
+              <w:top w:val="single" w:color="808080" w:sz="4"/>
+              <w:left w:val="single" w:color="808080" w:sz="4"/>
+              <w:bottom w:val="single" w:color="808080" w:sz="4"/>
+              <w:right w:val="single" w:color="808080" w:sz="4"/>
+            </w:tcBorders>
+            <w:tcMar>
+              <w:top w:type="dxa" w:w="60"/>
+              <w:left w:type="dxa" w:w="100"/>
+              <w:bottom w:type="dxa" w:w="60"/>
+              <w:right w:type="dxa" w:w="100"/>
+            </w:tcMar>
+          </w:tcPr>
+          <w:p>
+            <w:r>
+              <w:rPr>
+                <w:b w:val="false"/>
+                <w:bCs w:val="false"/>
+                <w:sz w:val="20"/>
+                <w:szCs w:val="20"/>
+              </w:rPr>
+              <w:t xml:space="preserve">Bosch [18]</w:t>
+            </w:r>
+          </w:p>
+        </w:tc>
+        <w:tc>
+          <w:tcPr>
+            <w:tcW w:type="dxa" w:w="2100"/>
+            <w:tcBorders>
+              <w:top w:val="single" w:color="808080" w:sz="4"/>
+              <w:left w:val="single" w:color="808080" w:sz="4"/>
+              <w:bottom w:val="single" w:color="808080" w:sz="4"/>
+              <w:right w:val="single" w:color="808080" w:sz="4"/>
+            </w:tcBorders>
+            <w:tcMar>
+              <w:top w:type="dxa" w:w="60"/>
+              <w:left w:type="dxa" w:w="100"/>
+              <w:bottom w:type="dxa" w:w="60"/>
+              <w:right w:type="dxa" w:w="100"/>
+            </w:tcMar>
+          </w:tcPr>
+          <w:p>
+            <w:r>
+              <w:rPr>
+                <w:b w:val="false"/>
+                <w:bCs w:val="false"/>
+                <w:sz w:val="20"/>
+                <w:szCs w:val="20"/>
+              </w:rPr>
+              <w:t xml:space="preserve">Gloves with motion sensors</w:t>
+            </w:r>
+          </w:p>
+        </w:tc>
+        <w:tc>
+          <w:tcPr>
+            <w:tcW w:type="dxa" w:w="1900"/>
+            <w:tcBorders>
+              <w:top w:val="single" w:color="808080" w:sz="4"/>
+              <w:left w:val="single" w:color="808080" w:sz="4"/>
+              <w:bottom w:val="single" w:color="808080" w:sz="4"/>
+              <w:right w:val="single" w:color="808080" w:sz="4"/>
+            </w:tcBorders>
+            <w:tcMar>
+              <w:top w:type="dxa" w:w="60"/>
+              <w:left w:type="dxa" w:w="100"/>
+              <w:bottom w:type="dxa" w:w="60"/>
+              <w:right w:type="dxa" w:w="100"/>
+            </w:tcMar>
+          </w:tcPr>
+          <w:p>
+            <w:r>
+              <w:rPr>
+                <w:b w:val="false"/>
+                <w:bCs w:val="false"/>
+                <w:sz w:val="20"/>
+                <w:szCs w:val="20"/>
+              </w:rPr>
+              <w:t xml:space="preserve">External processor</w:t>
+            </w:r>
+          </w:p>
+        </w:tc>
+        <w:tc>
+          <w:tcPr>
+            <w:tcW w:type="dxa" w:w="3660"/>
+            <w:tcBorders>
+              <w:top w:val="single" w:color="808080" w:sz="4"/>
+              <w:left w:val="single" w:color="808080" w:sz="4"/>
+              <w:bottom w:val="single" w:color="808080" w:sz="4"/>
+              <w:right w:val="single" w:color="808080" w:sz="4"/>
+            </w:tcBorders>
+            <w:tcMar>
+              <w:top w:type="dxa" w:w="60"/>
+              <w:left w:type="dxa" w:w="100"/>
+              <w:bottom w:type="dxa" w:w="60"/>
+              <w:right w:type="dxa" w:w="100"/>
+            </w:tcMar>
+          </w:tcPr>
+          <w:p>
+            <w:r>
+              <w:rPr>
+                <w:b w:val="false"/>
+                <w:bCs w:val="false"/>
+                <w:sz w:val="20"/>
+                <w:szCs w:val="20"/>
+              </w:rPr>
+              <w:t xml:space="preserve">Text or audio in one or more languages</w:t>
+            </w:r>
+          </w:p>
+        </w:tc>
+      </w:tr>
+      <w:tr>
+        <w:trPr>
+          <w:tblHeader w:val="false"/>
+        </w:trPr>
+        <w:tc>
+          <w:tcPr>
+            <w:tcW w:type="dxa" w:w="1700"/>
+            <w:tcBorders>
+              <w:top w:val="single" w:color="808080" w:sz="4"/>
+              <w:left w:val="single" w:color="808080" w:sz="4"/>
+              <w:bottom w:val="single" w:color="808080" w:sz="4"/>
+              <w:right w:val="single" w:color="808080" w:sz="4"/>
+            </w:tcBorders>
+            <w:tcMar>
+              <w:top w:type="dxa" w:w="60"/>
+              <w:left w:type="dxa" w:w="100"/>
+              <w:bottom w:type="dxa" w:w="60"/>
+              <w:right w:type="dxa" w:w="100"/>
+            </w:tcMar>
+          </w:tcPr>
+          <w:p>
+            <w:r>
+              <w:rPr>
+                <w:b w:val="false"/>
+                <w:bCs w:val="false"/>
+                <w:sz w:val="20"/>
+                <w:szCs w:val="20"/>
+              </w:rPr>
+              <w:t xml:space="preserve">Hitachi [19] (expired)</w:t>
+            </w:r>
+          </w:p>
+        </w:tc>
+        <w:tc>
+          <w:tcPr>
+            <w:tcW w:type="dxa" w:w="2100"/>
+            <w:tcBorders>
+              <w:top w:val="single" w:color="808080" w:sz="4"/>
+              <w:left w:val="single" w:color="808080" w:sz="4"/>
+              <w:bottom w:val="single" w:color="808080" w:sz="4"/>
+              <w:right w:val="single" w:color="808080" w:sz="4"/>
+            </w:tcBorders>
+            <w:tcMar>
+              <w:top w:type="dxa" w:w="60"/>
+              <w:left w:type="dxa" w:w="100"/>
+              <w:bottom w:type="dxa" w:w="60"/>
+              <w:right w:type="dxa" w:w="100"/>
+            </w:tcMar>
+          </w:tcPr>
+          <w:p>
+            <w:r>
+              <w:rPr>
+                <w:b w:val="false"/>
+                <w:bCs w:val="false"/>
+                <w:sz w:val="20"/>
+                <w:szCs w:val="20"/>
+              </w:rPr>
+              <w:t xml:space="preserve">Data gloves or camera</w:t>
+            </w:r>
+          </w:p>
+        </w:tc>
+        <w:tc>
+          <w:tcPr>
+            <w:tcW w:type="dxa" w:w="1900"/>
+            <w:tcBorders>
+              <w:top w:val="single" w:color="808080" w:sz="4"/>
+              <w:left w:val="single" w:color="808080" w:sz="4"/>
+              <w:bottom w:val="single" w:color="808080" w:sz="4"/>
+              <w:right w:val="single" w:color="808080" w:sz="4"/>
+            </w:tcBorders>
+            <w:tcMar>
+              <w:top w:type="dxa" w:w="60"/>
+              <w:left w:type="dxa" w:w="100"/>
+              <w:bottom w:type="dxa" w:w="60"/>
+              <w:right w:type="dxa" w:w="100"/>
+            </w:tcMar>
+          </w:tcPr>
+          <w:p>
+            <w:r>
+              <w:rPr>
+                <w:b w:val="false"/>
+                <w:bCs w:val="false"/>
+                <w:sz w:val="20"/>
+                <w:szCs w:val="20"/>
+              </w:rPr>
+              <w:t xml:space="preserve">Local computer</w:t>
+            </w:r>
+          </w:p>
+        </w:tc>
+        <w:tc>
+          <w:tcPr>
+            <w:tcW w:type="dxa" w:w="3660"/>
+            <w:tcBorders>
+              <w:top w:val="single" w:color="808080" w:sz="4"/>
+              <w:left w:val="single" w:color="808080" w:sz="4"/>
+              <w:bottom w:val="single" w:color="808080" w:sz="4"/>
+              <w:right w:val="single" w:color="808080" w:sz="4"/>
+            </w:tcBorders>
+            <w:tcMar>
+              <w:top w:type="dxa" w:w="60"/>
+              <w:left w:type="dxa" w:w="100"/>
+              <w:bottom w:type="dxa" w:w="60"/>
+              <w:right w:type="dxa" w:w="100"/>
+            </w:tcMar>
+          </w:tcPr>
+          <w:p>
+            <w:r>
+              <w:rPr>
+                <w:b w:val="false"/>
+                <w:bCs w:val="false"/>
+                <w:sz w:val="20"/>
+                <w:szCs w:val="20"/>
+              </w:rPr>
+              <w:t xml:space="preserve">Text or synthesized speech</w:t>
+            </w:r>
+          </w:p>
+        </w:tc>
+      </w:tr>
+      <w:tr>
+        <w:trPr>
+          <w:tblHeader w:val="false"/>
+        </w:trPr>
+        <w:tc>
+          <w:tcPr>
+            <w:tcW w:type="dxa" w:w="1700"/>
+            <w:tcBorders>
+              <w:top w:val="single" w:color="808080" w:sz="4"/>
+              <w:left w:val="single" w:color="808080" w:sz="4"/>
+              <w:bottom w:val="single" w:color="808080" w:sz="4"/>
+              <w:right w:val="single" w:color="808080" w:sz="4"/>
+            </w:tcBorders>
+            <w:shd w:fill="E3EEFB" w:color="auto" w:val="clear"/>
+            <w:tcMar>
+              <w:top w:type="dxa" w:w="60"/>
+              <w:left w:type="dxa" w:w="100"/>
+              <w:bottom w:type="dxa" w:w="60"/>
+              <w:right w:type="dxa" w:w="100"/>
+            </w:tcMar>
+          </w:tcPr>
+          <w:p>
+            <w:r>
+              <w:rPr>
+                <w:b/>
+                <w:bCs/>
+                <w:sz w:val="20"/>
+                <w:szCs w:val="20"/>
+              </w:rPr>
+              <w:t xml:space="preserve">Proposed device</w:t>
+            </w:r>
+          </w:p>
+        </w:tc>
+        <w:tc>
+          <w:tcPr>
+            <w:tcW w:type="dxa" w:w="2100"/>
+            <w:tcBorders>
+              <w:top w:val="single" w:color="808080" w:sz="4"/>
+              <w:left w:val="single" w:color="808080" w:sz="4"/>
+              <w:bottom w:val="single" w:color="808080" w:sz="4"/>
+              <w:right w:val="single" w:color="808080" w:sz="4"/>
+            </w:tcBorders>
+            <w:shd w:fill="E3EEFB" w:color="auto" w:val="clear"/>
+            <w:tcMar>
+              <w:top w:type="dxa" w:w="60"/>
+              <w:left w:type="dxa" w:w="100"/>
+              <w:bottom w:type="dxa" w:w="60"/>
+              <w:right w:type="dxa" w:w="100"/>
+            </w:tcMar>
+          </w:tcPr>
+          <w:p>
+            <w:r>
+              <w:rPr>
+                <w:b/>
+                <w:bCs/>
+                <w:sz w:val="20"/>
+                <w:szCs w:val="20"/>
+              </w:rPr>
+              <w:t xml:space="preserve">Single RGB camera and microphone</w:t>
+            </w:r>
+          </w:p>
+        </w:tc>
+        <w:tc>
+          <w:tcPr>
+            <w:tcW w:type="dxa" w:w="1900"/>
+            <w:tcBorders>
+              <w:top w:val="single" w:color="808080" w:sz="4"/>
+              <w:left w:val="single" w:color="808080" w:sz="4"/>
+              <w:bottom w:val="single" w:color="808080" w:sz="4"/>
+              <w:right w:val="single" w:color="808080" w:sz="4"/>
+            </w:tcBorders>
+            <w:shd w:fill="E3EEFB" w:color="auto" w:val="clear"/>
+            <w:tcMar>
+              <w:top w:type="dxa" w:w="60"/>
+              <w:left w:type="dxa" w:w="100"/>
+              <w:bottom w:type="dxa" w:w="60"/>
+              <w:right w:type="dxa" w:w="100"/>
+            </w:tcMar>
+          </w:tcPr>
+          <w:p>
+            <w:r>
+              <w:rPr>
+                <w:b/>
+                <w:bCs/>
+                <w:sz w:val="20"/>
+                <w:szCs w:val="20"/>
+              </w:rPr>
+              <w:t xml:space="preserve">On device, fully offline</w:t>
+            </w:r>
+          </w:p>
+        </w:tc>
+        <w:tc>
+          <w:tcPr>
+            <w:tcW w:type="dxa" w:w="3660"/>
+            <w:tcBorders>
+              <w:top w:val="single" w:color="808080" w:sz="4"/>
+              <w:left w:val="single" w:color="808080" w:sz="4"/>
+              <w:bottom w:val="single" w:color="808080" w:sz="4"/>
+              <w:right w:val="single" w:color="808080" w:sz="4"/>
+            </w:tcBorders>
+            <w:shd w:fill="E3EEFB" w:color="auto" w:val="clear"/>
+            <w:tcMar>
+              <w:top w:type="dxa" w:w="60"/>
+              <w:left w:type="dxa" w:w="100"/>
+              <w:bottom w:type="dxa" w:w="60"/>
+              <w:right w:type="dxa" w:w="100"/>
+            </w:tcMar>
+          </w:tcPr>
+          <w:p>
+            <w:r>
+              <w:rPr>
+                <w:b/>
+                <w:bCs/>
+                <w:sz w:val="20"/>
+                <w:szCs w:val="20"/>
+              </w:rPr>
+              <w:t xml:space="preserve">Speech in English, Turkish or Spanish after user confirmation; reply shown as English text</w:t>
+            </w:r>
+          </w:p>
+        </w:tc>
+      </w:tr>
+    </w:tbl>
+    <w:p>
+      <w:pPr>
+        <w:spacing w:after="240"/>
+      </w:pPr>
+    </w:p>
+    <w:p>
+      <w:pPr>
+        <w:spacing w:after="60" w:before="240"/>
+        <w:jc w:val="center"/>
+      </w:pPr>
+      <w:r>
+        <w:drawing>
+          <wp:inline distT="0" distB="0" distL="0" distR="0">
+            <wp:extent cx="5029200" cy="1981200"/>
+            <wp:effectExtent t="0" r="0" b="0" l="0"/>
+            <wp:docPr id="1" name="fig3_hardware_preferences.png" descr="Figure 3. Hardware form factors that Deaf and hard-of-hearing survey participants were comfortable using (n = 32). Data from Tran et al. [1]." title="Figure 3. Hardware form factors that Deaf and hard-of-hearing survey participants were comfortable using (n = 32). Data from Tran et al. [1]."/>
+            <wp:cNvGraphicFramePr>
+              <a:graphicFrameLocks xmlns:a="http://schemas.openxmlformats.org/drawingml/2006/main" noChangeAspect="1"/>
+            </wp:cNvGraphicFramePr>
+            <a:graphic xmlns:a="http://schemas.openxmlformats.org/drawingml/2006/main">
+              <a:graphicData uri="http://schemas.openxmlformats.org/drawingml/2006/picture">
+                <pic:pic xmlns:pic="http://schemas.openxmlformats.org/drawingml/2006/picture">
+                  <pic:nvPicPr>
+                    <pic:cNvPr id="0" name="" descr=""/>
+                    <pic:cNvPicPr>
+                      <a:picLocks noChangeAspect="1" noChangeArrowheads="1"/>
+                    </pic:cNvPicPr>
+                  </pic:nvPicPr>
+                  <pic:blipFill>
+                    <a:blip r:embed="rId9" cstate="none"/>
+                    <a:srcRect/>
+                    <a:stretch>
+                      <a:fillRect/>
+                    </a:stretch>
+                  </pic:blipFill>
+                  <pic:spPr bwMode="auto">
+                    <a:xfrm>
+                      <a:off x="0" y="0"/>
+                      <a:ext cx="5029200" cy="1981200"/>
+                    </a:xfrm>
+                    <a:prstGeom prst="rect">
+                      <a:avLst/>
+                    </a:prstGeom>
+                  </pic:spPr>
+                </pic:pic>
+              </a:graphicData>
+            </a:graphic>
+          </wp:inline>
+        </w:drawing>
+      </w:r>
+    </w:p>
+    <w:p>
+      <w:pPr>
+        <w:spacing w:after="240"/>
+        <w:jc w:val="center"/>
+      </w:pPr>
+      <w:r>
+        <w:rPr>
+          <w:b/>
+          <w:bCs/>
+          <w:sz w:val="20"/>
+          <w:szCs w:val="20"/>
+        </w:rPr>
+        <w:t xml:space="preserve">Figure 3. </w:t>
+      </w:r>
+      <w:r>
+        <w:rPr>
+          <w:sz w:val="20"/>
+          <w:szCs w:val="20"/>
+        </w:rPr>
+        <w:t xml:space="preserve">Hardware form factors that Deaf and hard-of-hearing survey participants were comfortable using (n = 32). Data from Tran et al. [1].</w:t>
+      </w:r>
+    </w:p>
+    <w:p>
+      <w:pPr>
+        <w:spacing w:after="0" w:line="480"/>
+        <w:ind w:firstLine="720"/>
+      </w:pPr>
+      <w:r>
+        <w:t xml:space="preserve">The same survey identifies the ethical risks of this technology. More than 80% of participants were concerned about hearing people profiting from ASL, systems missing ASL grammatical features, automatic translation weakening the legal right to other accommodations, and poorer performance for some users than others [1]. We address these directly. The device is presented as a way to communicate when an interpreter is unavailable, not as a substitute that could justify withholding one. Its limits are stated plainly: it recognizes individual signs and does not capture facial grammar or continuous signing. Accuracy will be reported for each test signer, not only as an average. We will seek input from Deaf ASL users when choosing the vocabulary and testing the device, as recommended in [13] and [14]. Because video never leaves the device, the design also avoids the privacy risk of streaming a user's image to a remote server.</w:t>
+      </w:r>
+    </w:p>
+    <w:p>
+      <w:pPr>
+        <w:spacing w:after="0" w:line="480"/>
+        <w:ind w:firstLine="720"/>
+      </w:pPr>
+      <w:r>
+        <w:t xml:space="preserve">Economically, certified interpreters are costly and often must be scheduled in advance [1]. Our device is built from off-the-shelf components (an embedded GPU module, a camera, a microphone, a speaker and a display) and uses open-source models, so once built it has no per-use service fees or cloud costs. For sustainability, it runs on a low-power embedded module rather than a desktop GPU or cloud servers, which keeps energy use low and avoids continuous data transmission. Standard, replaceable components make the device repairable and upgradable, and the software can be moved to newer hardware instead of the device being discarded.</w:t>
       </w:r>
     </w:p>
     <w:p>
@@ -102,49 +1128,7 @@
           <w:iCs/>
           <w:color w:val="808080"/>
         </w:rPr>
-        <w:t xml:space="preserve">[To be written: objectives of the proposed project]</w:t>
-      </w:r>
-    </w:p>
-    <w:p>
-      <w:pPr>
-        <w:spacing w:after="0" w:line="480"/>
-        <w:ind w:firstLine="720"/>
-      </w:pPr>
-      <w:r>
-        <w:rPr>
-          <w:i/>
-          <w:iCs/>
-          <w:color w:val="808080"/>
-        </w:rPr>
-        <w:t xml:space="preserve">[To be written: adopted approach]</w:t>
-      </w:r>
-    </w:p>
-    <w:p>
-      <w:pPr>
-        <w:spacing w:after="0" w:line="480"/>
-        <w:ind w:firstLine="720"/>
-      </w:pPr>
-      <w:r>
-        <w:rPr>
-          <w:i/>
-          <w:iCs/>
-          <w:color w:val="808080"/>
-        </w:rPr>
-        <w:t xml:space="preserve">[To be written: current trends]</w:t>
-      </w:r>
-    </w:p>
-    <w:p>
-      <w:pPr>
-        <w:spacing w:after="0" w:line="480"/>
-        <w:ind w:firstLine="720"/>
-      </w:pPr>
-      <w:r>
-        <w:rPr>
-          <w:i/>
-          <w:iCs/>
-          <w:color w:val="808080"/>
-        </w:rPr>
-        <w:t xml:space="preserve">[To be written: related commercial systems; research status, ethics, economics and sustainability]</w:t>
+        <w:t xml:space="preserve">[Add a cross-reference to the budget section once it is written.]</w:t>
       </w:r>
     </w:p>
     <w:p>
@@ -222,6 +1206,123 @@
       </w:pPr>
       <w:r>
         <w:t xml:space="preserve">[6]	H. Sohn, “1st place solution – 1DCNN combined with Transformer,” Google – Isolated Sign Language Recognition competition, Kaggle, 2023. [Online]. Available: https://www.kaggle.com/competitions/asl-signs/writeups/hoyeol-sohn-1st-place-solution-1dcnn-combined-with</w:t>
+      </w:r>
+    </w:p>
+    <w:p>
+      <w:pPr>
+        <w:spacing w:after="120"/>
+        <w:ind w:left="720" w:hanging="720"/>
+      </w:pPr>
+      <w:r>
+        <w:t xml:space="preserve">[7]	A. Moryossef, Z. Jiang, M. Müller, S. Ebling, and Y. Goldberg, “Linguistically motivated sign language segmentation,” in Findings of the Association for Computational Linguistics: EMNLP 2023, arXiv:2310.13960.</w:t>
+      </w:r>
+    </w:p>
+    <w:p>
+      <w:pPr>
+        <w:spacing w:after="120"/>
+        <w:ind w:left="720" w:hanging="720"/>
+      </w:pPr>
+      <w:r>
+        <w:t xml:space="preserve">[8]	P. Fayyazsanavi, A. Anastasopoulos, and J. Košecká, “Gloss2Text: Sign language gloss translation using LLMs and semantically aware label smoothing,” 2024, arXiv:2407.01394.</w:t>
+      </w:r>
+    </w:p>
+    <w:p>
+      <w:pPr>
+        <w:spacing w:after="120"/>
+        <w:ind w:left="720" w:hanging="720"/>
+      </w:pPr>
+      <w:r>
+        <w:t xml:space="preserve">[9]	NLLB Team et al., “No Language Left Behind: Scaling human-centered machine translation,” 2022, arXiv:2207.04672.</w:t>
+      </w:r>
+    </w:p>
+    <w:p>
+      <w:pPr>
+        <w:spacing w:after="120"/>
+        <w:ind w:left="720" w:hanging="720"/>
+      </w:pPr>
+      <w:r>
+        <w:t xml:space="preserve">[10]	Rhasspy, “Piper: A fast, local neural text to speech system.” [Online]. Available: https://github.com/rhasspy/piper</w:t>
+      </w:r>
+    </w:p>
+    <w:p>
+      <w:pPr>
+        <w:spacing w:after="120"/>
+        <w:ind w:left="720" w:hanging="720"/>
+      </w:pPr>
+      <w:r>
+        <w:t xml:space="preserve">[11]	A. Radford, J. W. Kim, T. Xu, G. Brockman, C. McLeavey, and I. Sutskever, “Robust speech recognition via large-scale weak supervision,” 2022, arXiv:2212.04356.</w:t>
+      </w:r>
+    </w:p>
+    <w:p>
+      <w:pPr>
+        <w:spacing w:after="120"/>
+        <w:ind w:left="720" w:hanging="720"/>
+      </w:pPr>
+      <w:r>
+        <w:t xml:space="preserve">[12]	J. Traub et al., “Overcoming common flaws in the evaluation of selective classification systems,” 2024, arXiv:2407.01032.</w:t>
+      </w:r>
+    </w:p>
+    <w:p>
+      <w:pPr>
+        <w:spacing w:after="120"/>
+        <w:ind w:left="720" w:hanging="720"/>
+      </w:pPr>
+      <w:r>
+        <w:t xml:space="preserve">[13]	D. Bragg et al., “Sign language recognition, generation, and translation: An interdisciplinary perspective,” in Proc. 21st Int. ACM SIGACCESS Conf. Computers and Accessibility (ASSETS ’19), 2019, pp. 16–31, doi: 10.1145/3308561.3353774.</w:t>
+      </w:r>
+    </w:p>
+    <w:p>
+      <w:pPr>
+        <w:spacing w:after="120"/>
+        <w:ind w:left="720" w:hanging="720"/>
+      </w:pPr>
+      <w:r>
+        <w:t xml:space="preserve">[14]	K. Atwell, S. Imai, D. Bragg, and M. Alikhani, “‘Nothing about us without us’: Perspectives of global Deaf and hard-of-hearing community members on sign language technologies,” 2025, arXiv:2512.08839.</w:t>
+      </w:r>
+    </w:p>
+    <w:p>
+      <w:pPr>
+        <w:spacing w:after="120"/>
+        <w:ind w:left="720" w:hanging="720"/>
+      </w:pPr>
+      <w:r>
+        <w:t xml:space="preserve">[15]	SignAll, “SignAll translates sign language to English automatically,” PRWeb. [Online]. Available: https://www.prweb.com/releases/signall-translates-sign-language-to-english-automatically-868736288.html</w:t>
+      </w:r>
+    </w:p>
+    <w:p>
+      <w:pPr>
+        <w:spacing w:after="120"/>
+        <w:ind w:left="720" w:hanging="720"/>
+      </w:pPr>
+      <w:r>
+        <w:t xml:space="preserve">[16]	M. Menefee, D. Nash, and T. Chandler, “Automated sign language translation and communication using multiple input and output modalities,” U.S. Patent 10 489 639 B2, Nov. 26, 2019.</w:t>
+      </w:r>
+    </w:p>
+    <w:p>
+      <w:pPr>
+        <w:spacing w:after="120"/>
+        <w:ind w:left="720" w:hanging="720"/>
+      </w:pPr>
+      <w:r>
+        <w:t xml:space="preserve">[17]	N. A. Kelly, “Realtime AI sign language recognition,” U.S. Patent Appl. Pub. 2022/0327961 A1, Oct. 13, 2022.</w:t>
+      </w:r>
+    </w:p>
+    <w:p>
+      <w:pPr>
+        <w:spacing w:after="120"/>
+        <w:ind w:left="720" w:hanging="720"/>
+      </w:pPr>
+      <w:r>
+        <w:t xml:space="preserve">[18]	Z. Zhou et al., “System and method for automated sign language recognition,” U.S. Patent Appl. Pub. 2016/0307469 A1, Oct. 20, 2016.</w:t>
+      </w:r>
+    </w:p>
+    <w:p>
+      <w:pPr>
+        <w:spacing w:after="120"/>
+        <w:ind w:left="720" w:hanging="720"/>
+      </w:pPr>
+      <w:r>
+        <w:t xml:space="preserve">[19]	H. Sakou et al., “Sign recognition apparatus and method and sign translation system using same,” U.S. Patent 5 887 069, Mar. 23, 1999.</w:t>
       </w:r>
     </w:p>
     <w:sectPr>

</xml_diff>

<commit_message>
Redraw Figure 1 to show the touchscreen and both users
The block diagram now shows the touchscreen facing the Deaf user (used to
confirm sentences and read replies), both people, voice activity detection,
and the microphone muting while the device speaks. The approach text and
caption explain where the reply appears.

Co-Authored-By: Claude Opus 5.5 <noreply@anthropic.com>
Claude-Session: https://claude.ai/code/session_01Ghe1P8BgNsyGdHuD4xCbdv
</commit_message>
<xml_diff>
--- a/docs/Introduction_Draft.docx
+++ b/docs/Introduction_Draft.docx
@@ -111,9 +111,9 @@
       <w:r>
         <w:drawing>
           <wp:inline distT="0" distB="0" distL="0" distR="0">
-            <wp:extent cx="5760720" cy="2733675"/>
+            <wp:extent cx="5943600" cy="3200400"/>
             <wp:effectExtent t="0" r="0" b="0" l="0"/>
-            <wp:docPr id="1" name="fig1_block_diagram.png" descr="Figure 1. System block diagram. All processing runs on the embedded GPU without a network connection." title="Figure 1. System block diagram. All processing runs on the embedded GPU without a network connection."/>
+            <wp:docPr id="1" name="fig1_block_diagram.png" descr="Figure 1. System block diagram. Top: the sign-to-speech path; bottom: the reply path. The touchscreen faces the Deaf user and is used both to confirm sentences and to read replies. All processing runs on the embedded GPU without a network connection; the confidence check inside the recognizer is shown in Figure 2." title="Figure 1. System block diagram. Top: the sign-to-speech path; bottom: the reply path. The touchscreen faces the Deaf user and is used both to confirm sentences and to read replies. All processing runs on the embedded GPU without a network connection; the confidence check inside the recognizer is shown in Figure 2."/>
             <wp:cNvGraphicFramePr>
               <a:graphicFrameLocks xmlns:a="http://schemas.openxmlformats.org/drawingml/2006/main" noChangeAspect="1"/>
             </wp:cNvGraphicFramePr>
@@ -136,7 +136,7 @@
                   <pic:spPr bwMode="auto">
                     <a:xfrm>
                       <a:off x="0" y="0"/>
-                      <a:ext cx="5760720" cy="2733675"/>
+                      <a:ext cx="5943600" cy="3200400"/>
                     </a:xfrm>
                     <a:prstGeom prst="rect">
                       <a:avLst/>
@@ -168,7 +168,7 @@
           <w:sz w:val="20"/>
           <w:szCs w:val="20"/>
         </w:rPr>
-        <w:t xml:space="preserve">System block diagram. All processing runs on the embedded GPU without a network connection.</w:t>
+        <w:t xml:space="preserve">System block diagram. Top: the sign-to-speech path; bottom: the reply path. The touchscreen faces the Deaf user and is used both to confirm sentences and to read replies. All processing runs on the embedded GPU without a network connection; the confidence check inside the recognizer is shown in Figure 2.</w:t>
       </w:r>
     </w:p>
     <w:p>
@@ -177,7 +177,7 @@
         <w:ind w:firstLine="720"/>
       </w:pPr>
       <w:r>
-        <w:t xml:space="preserve">The recognized signs are ASL glosses, not English. ASL has its own word order and grammar, so a sequence such as STORE ME GO must become “I am going to the store.” A sentence builder performs this step, using templates for common phrases in the target setting and a small language model as a fallback, in line with recent work that applies pretrained language models to gloss-to-text translation [8]. The English sentence is shown on screen for the user to confirm or edit. Only confirmed sentences are translated into Turkish or Spanish with NLLB-200 [9] and spoken with Piper, an offline neural text-to-speech system [10]. In the reverse direction, Whisper [11] transcribes the hearing person's reply and translates it into English text for the Deaf user.</w:t>
+        <w:t xml:space="preserve">The recognized signs are ASL glosses, not English. ASL has its own word order and grammar, so a sequence such as STORE ME GO must become “I am going to the store.” A sentence builder performs this step, using templates for common phrases in the target setting and a small language model as a fallback, in line with recent work that applies pretrained language models to gloss-to-text translation [8]. The English sentence is shown on screen for the user to confirm or edit. Only confirmed sentences are translated into Turkish or Spanish with NLLB-200 [9] and spoken with Piper, an offline neural text-to-speech system [10]. In the reverse direction, a voice-activity detector starts listening when the hearing person speaks, and the microphone is muted while the device itself is speaking so that it does not transcribe its own voice. Whisper [11] then transcribes the reply and translates it into English, and the text appears on the same touchscreen the Deaf user uses to confirm sentences. The hearing person needs no screen: they hear the device's speaker and speak into its microphone.</w:t>
       </w:r>
     </w:p>
     <w:p>

</xml_diff>

<commit_message>
Tidy Figure 1 layout on an even grid
Equal box sizes and arrow lengths, and a touchscreen box the same width as
the others, spanning only the two rows.

Co-Authored-By: Claude Opus 5.5 <noreply@anthropic.com>
Claude-Session: https://claude.ai/code/session_01Ghe1P8BgNsyGdHuD4xCbdv
</commit_message>
<xml_diff>
--- a/docs/Introduction_Draft.docx
+++ b/docs/Introduction_Draft.docx
@@ -111,7 +111,7 @@
       <w:r>
         <w:drawing>
           <wp:inline distT="0" distB="0" distL="0" distR="0">
-            <wp:extent cx="5943600" cy="3200400"/>
+            <wp:extent cx="5943600" cy="2676525"/>
             <wp:effectExtent t="0" r="0" b="0" l="0"/>
             <wp:docPr id="1" name="fig1_block_diagram.png" descr="Figure 1. System block diagram. Top: the sign-to-speech path; bottom: the reply path. The touchscreen faces the Deaf user and is used both to confirm sentences and to read replies. All processing runs on the embedded GPU without a network connection; the confidence check inside the recognizer is shown in Figure 2." title="Figure 1. System block diagram. Top: the sign-to-speech path; bottom: the reply path. The touchscreen faces the Deaf user and is used both to confirm sentences and to read replies. All processing runs on the embedded GPU without a network connection; the confidence check inside the recognizer is shown in Figure 2."/>
             <wp:cNvGraphicFramePr>
@@ -136,7 +136,7 @@
                   <pic:spPr bwMode="auto">
                     <a:xfrm>
                       <a:off x="0" y="0"/>
-                      <a:ext cx="5943600" cy="3200400"/>
+                      <a:ext cx="5943600" cy="2676525"/>
                     </a:xfrm>
                     <a:prstGeom prst="rect">
                       <a:avLst/>

</xml_diff>

<commit_message>
Open the introduction with the communication need
Moves the interpreter-shortage context to the first paragraph, with a new
opening sentence on ASL, so the introduction starts from the problem before
the state of the art. Records that AI use is allowed for the final project.

Co-Authored-By: Claude Opus 5.5 <noreply@anthropic.com>
Claude-Session: https://claude.ai/code/session_01Ghe1P8BgNsyGdHuD4xCbdv
</commit_message>
<xml_diff>
--- a/docs/Introduction_Draft.docx
+++ b/docs/Introduction_Draft.docx
@@ -16,7 +16,16 @@
         <w:ind w:firstLine="720"/>
       </w:pPr>
       <w:r>
-        <w:t xml:space="preserve">Automatic sign language processing has advanced quickly, but no system yet translates American Sign Language (ASL) reliably enough for general real-world use [1]. Research is divided into two tasks. </w:t>
+        <w:t xml:space="preserve">American Sign Language (ASL) is a complete natural language with its own grammar and vocabulary, distinct from English, and it is the primary language of about 500,000 Deaf and hard-of-hearing people in the United States [1]. When a Deaf ASL user needs to communicate with a hearing person who does not sign, a certified interpreter is usually needed, but one is often unavailable. In a survey of 32 U.S. Deaf and hard-of-hearing ASL users, this unmet need was most frequent in medical settings, followed by professional and educational settings [1]. Interpreters are costly and can take hours to arrive, especially in rural areas or at short notice [1]. Automatic translation could help fill this gap.</w:t>
+      </w:r>
+    </w:p>
+    <w:p>
+      <w:pPr>
+        <w:spacing w:after="0" w:line="480"/>
+        <w:ind w:firstLine="720"/>
+      </w:pPr>
+      <w:r>
+        <w:t xml:space="preserve">Automatic sign language processing has advanced quickly, but no system yet translates ASL reliably enough for general real-world use [1]. Research is divided into two tasks. </w:t>
       </w:r>
       <w:r>
         <w:rPr>
@@ -73,7 +82,7 @@
         <w:ind w:firstLine="720"/>
       </w:pPr>
       <w:r>
-        <w:t xml:space="preserve">Deaf ASL users frequently need an interpreter but cannot get one. In a survey of 32 U.S. Deaf and hard-of-hearing ASL users, this happened most often in medical settings, followed by professional and educational settings [1]. Certified interpreters are costly and can take hours to arrive, especially in rural areas or at short notice [1]. Automated alternatives have three further weaknesses. First, they typically output a translation even when uncertain, and a wrong translation can be worse than none, especially in high-stakes settings. Second, cloud-based systems need a reliable internet connection and stream video of the user to remote servers, which raises privacy concerns. Third, most are one-way: they convert signing to text but give the hearing person no way to reply without a second device.</w:t>
+        <w:t xml:space="preserve">Existing automated approaches also have three practical weaknesses. First, they typically output a translation even when uncertain, and a wrong translation can be worse than none, especially in high-stakes settings. Second, cloud-based systems need a reliable internet connection and stream video of the user to remote servers, which raises privacy concerns. Third, most are one-way: they convert signing to text but give the hearing person no way to reply without a second device.</w:t>
       </w:r>
     </w:p>
     <w:p>

</xml_diff>

<commit_message>
Shorten introduction from about 1,700 to 1,090 words
Condenses objectives, approach, current trends and the commercial, ethics
and economics paragraphs. Figures 1-3, Table 1 and all 19 citations stay.

Co-Authored-By: Claude Opus 5.5 <noreply@anthropic.com>
Claude-Session: https://claude.ai/code/session_01Ghe1P8BgNsyGdHuD4xCbdv
</commit_message>
<xml_diff>
--- a/docs/Introduction_Draft.docx
+++ b/docs/Introduction_Draft.docx
@@ -100,7 +100,7 @@
         <w:ind w:firstLine="720"/>
       </w:pPr>
       <w:r>
-        <w:t xml:space="preserve">The objective of this project is to design and build a portable prototype that lets a Deaf ASL user hold a short two-way conversation with a hearing person who speaks English, Turkish or Spanish, without an internet connection. The prototype is scoped to structured, everyday exchanges such as those at a service counter or front desk. Its technical goals are to recognize a vocabulary of 100–250 ASL signs, with fingerspelling as a fallback, at no less than 75% top-1 and 90% top-5 accuracy on signers not seen during training; to speak a confirmed sentence in the selected language within 1.2 s of the user's confirmation; to show the hearing person's spoken reply as English text; and to run entirely on an embedded GPU. The project also has a reliability objective: the device should abstain rather than voice a translation it is not confident in, and we will report its accuracy on the sentences it does speak, not only its overall accuracy. These figures are design targets; measured results will be reported as the project progresses.</w:t>
+        <w:t xml:space="preserve">The objective of this project is to build a portable, fully offline prototype that lets a Deaf ASL user hold a short two-way conversation with a hearing person who speaks English, Turkish or Spanish, in structured settings such as a service counter or front desk. The prototype targets a vocabulary of 100–250 signs, with at least 75% top-1 and 90% top-5 accuracy on signers not seen during training, and speech output within 1.2 s of the user's confirmation. Just as important, the device should abstain rather than voice a translation it is not confident in.</w:t>
       </w:r>
     </w:p>
     <w:p>
@@ -109,7 +109,7 @@
         <w:ind w:firstLine="720"/>
       </w:pPr>
       <w:r>
-        <w:t xml:space="preserve">Figure 1 shows the system architecture. A camera captures the signer, and MediaPipe [5] extracts body, hand and face landmarks from each frame. In natural signing, signs flow into each other with minimal pauses, and segmenting them automatically is still an open research problem [7]. The user therefore signs one sign at a time and returns the hands to a rest position between signs, and the device uses this rest pose to mark where each sign ends. A lightweight landmark-based model, following the 1D-CNN and transformer design of [6], classifies each sign and outputs its five most likely labels with confidence scores. The model will be trained on the ASL Citizen dataset [2] and evaluated on its signer-independent test split and on recordings from our own test users.</w:t>
+        <w:t xml:space="preserve">Figure 1 shows the system. MediaPipe [5] extracts body and hand landmarks from the camera image. Because automatically segmenting continuous signing is still an open research problem [7], the user signs one sign at a time, with a rest pose in between. A lightweight landmark model based on [6] and trained on ASL Citizen [2] returns the five most likely signs with confidence scores. A sentence builder turns the signs into English, using templates with a small language model as a fallback [8]. After the user confirms the sentence on the touchscreen, NLLB-200 [9] translates it and Piper [10] speaks it. For the reply, Whisper [11] converts the hearing person's speech into English text on the same screen.</w:t>
       </w:r>
     </w:p>
     <w:p>
@@ -186,16 +186,7 @@
         <w:ind w:firstLine="720"/>
       </w:pPr>
       <w:r>
-        <w:t xml:space="preserve">The recognized signs are ASL glosses, not English. ASL has its own word order and grammar, so a sequence such as STORE ME GO must become “I am going to the store.” A sentence builder performs this step, using templates for common phrases in the target setting and a small language model as a fallback, in line with recent work that applies pretrained language models to gloss-to-text translation [8]. The English sentence is shown on screen for the user to confirm or edit. Only confirmed sentences are translated into Turkish or Spanish with NLLB-200 [9] and spoken with Piper, an offline neural text-to-speech system [10]. In the reverse direction, a voice-activity detector starts listening when the hearing person speaks, and the microphone is muted while the device itself is speaking so that it does not transcribe its own voice. Whisper [11] then transcribes the reply and translates it into English, and the text appears on the same touchscreen the Deaf user uses to confirm sentences. The hearing person needs no screen: they hear the device's speaker and speak into its microphone.</w:t>
-      </w:r>
-    </w:p>
-    <w:p>
-      <w:pPr>
-        <w:spacing w:after="0" w:line="480"/>
-        <w:ind w:firstLine="720"/>
-      </w:pPr>
-      <w:r>
-        <w:t xml:space="preserve">Figure 2 shows how the device decides when to speak. If the recognizer's confidence for a sign is above a threshold, the top sign is accepted; otherwise the device shows the five most likely candidates and the user picks one or signs again. This follows the idea of selective prediction, in which a model may abstain on uncertain inputs to raise accuracy on the answers it does give [12]. We will evaluate this trade-off with risk–coverage curves and report accuracy separately for each test signer.</w:t>
+        <w:t xml:space="preserve">Figure 2 shows when the device speaks. A sign whose confidence is above a threshold is accepted; otherwise the user picks from the top five candidates or signs again. This follows selective prediction, in which a model abstains on uncertain inputs to raise accuracy on the answers it gives [12].</w:t>
       </w:r>
     </w:p>
     <w:p>
@@ -272,7 +263,7 @@
         <w:ind w:firstLine="720"/>
       </w:pPr>
       <w:r>
-        <w:t xml:space="preserve">Three trends shape the field. First, research is moving from gloss-based pipelines toward gloss-free and self-supervised models that learn from large amounts of unlabeled video [4], and pretrained language models are increasingly used for the language side of translation [8]. Second, models are moving onto consumer and embedded hardware. Landmark-based recognizers are small enough to run in real time on phones and single-board computers, which makes offline, privacy-preserving devices practical [5], [6]. Third, the field increasingly recognizes that sign language technology must be designed with Deaf communities rather than for them. Researchers have called for systems built around specific, real-world use cases with input from Deaf culture and linguistics experts [13], and Deaf and hard-of-hearing participants in recent studies emphasize Deaf-led design and warn of harm when they are excluded from decisions [14]. Our project follows the second and third trends directly; it does not attempt gloss-free continuous translation, which still requires large models and datasets.</w:t>
+        <w:t xml:space="preserve">Beyond the shift toward gloss-free models [4], [8], two trends matter most for this project. Recognition models are moving onto phones and embedded hardware, which makes offline, private devices practical [5], [6]. And the field increasingly calls for sign language technology to be designed with Deaf communities and around specific real-world uses [13], [14].</w:t>
       </w:r>
     </w:p>
     <w:p>
@@ -281,7 +272,7 @@
         <w:ind w:firstLine="720"/>
       </w:pPr>
       <w:r>
-        <w:t xml:space="preserve">No automatic ASL translation system is yet reliable enough for general use [1]. The best-known commercial effort, SignAll, combines multiple cameras with natural language processing to translate ASL into English text [15]. Patents show several other approaches, summarized in Table 1: multiple cameras with a depth sensor [16], single-camera recognition with cloud processing [17], sensor gloves [18], and an earlier glove- or camera-based system with speech output [19]. The closest to our design is [17], which also works from a single camera and, in one embodiment, lets the user choose among the three most likely translations. Our device differs from all four in combining single-camera input, fully offline processing on an embedded GPU, confidence-gated output and speech in several languages. It is also a form factor the Deaf community is open to: 69% of survey participants were comfortable using a stand-alone system of this kind, compared with 38% for wearables (Figure 3) [1].</w:t>
+        <w:t xml:space="preserve">No automatic ASL translation system is yet reliable enough for general use [1]. SignAll, the best-known commercial effort, uses multiple cameras to translate ASL into English text [15]. Patented approaches (Table 1) include multiple cameras with depth sensing [16], single-camera recognition in the cloud [17] and sensor gloves [18], [19]. The closest to our design, [17], also lets users choose from a menu of likely translations, but it depends on a cloud connection. Our device combines single-camera input, fully offline processing, confidence-gated output and speech in several languages, in a stand-alone form that 69% of surveyed Deaf users were comfortable using (Figure 3) [1].</w:t>
       </w:r>
     </w:p>
     <w:p>
@@ -1114,7 +1105,7 @@
         <w:ind w:firstLine="720"/>
       </w:pPr>
       <w:r>
-        <w:t xml:space="preserve">The same survey identifies the ethical risks of this technology. More than 80% of participants were concerned about hearing people profiting from ASL, systems missing ASL grammatical features, automatic translation weakening the legal right to other accommodations, and poorer performance for some users than others [1]. We address these directly. The device is presented as a way to communicate when an interpreter is unavailable, not as a substitute that could justify withholding one. Its limits are stated plainly: it recognizes individual signs and does not capture facial grammar or continuous signing. Accuracy will be reported for each test signer, not only as an average. We will seek input from Deaf ASL users when choosing the vocabulary and testing the device, as recommended in [13] and [14]. Because video never leaves the device, the design also avoids the privacy risk of streaming a user's image to a remote server.</w:t>
+        <w:t xml:space="preserve">The same survey found that most Deaf participants were concerned about hearing people profiting from ASL, systems missing ASL grammar, automatic translation weakening the right to an interpreter, and unequal performance across users [1]. We therefore present the device as an aid for when no interpreter is available, not a substitute; state its limits plainly; report accuracy for each test signer; involve Deaf ASL users in choosing the vocabulary and in testing [13], [14]; and keep all video on the device.</w:t>
       </w:r>
     </w:p>
     <w:p>
@@ -1123,7 +1114,7 @@
         <w:ind w:firstLine="720"/>
       </w:pPr>
       <w:r>
-        <w:t xml:space="preserve">Economically, certified interpreters are costly and often must be scheduled in advance [1]. Our device is built from off-the-shelf components (an embedded GPU module, a camera, a microphone, a speaker and a display) and uses open-source models, so once built it has no per-use service fees or cloud costs. For sustainability, it runs on a low-power embedded module rather than a desktop GPU or cloud servers, which keeps energy use low and avoids continuous data transmission. Standard, replaceable components make the device repairable and upgradable, and the software can be moved to newer hardware instead of the device being discarded.</w:t>
+        <w:t xml:space="preserve">Interpreters are costly and often must be booked in advance [1], whereas our device uses off-the-shelf hardware and open-source models, with no per-use or cloud costs once built. Its low-power embedded module avoids cloud computing, and its standard parts can be repaired or upgraded instead of discarded.</w:t>
       </w:r>
     </w:p>
     <w:p>

</xml_diff>

<commit_message>
Redraw survey chart and use three-line tables in introduction
Replaces the two stacked-bar charts from Tran et al. with one two-panel
chart of mean ratings computed from the paper's response counts, placed at
the use-case paragraph instead of the opening. Tables switch to a classic
three-line style, and figures and tables are renumbered in order of
appearance.

Co-Authored-By: Claude Opus 5.5 <noreply@anthropic.com>
Claude-Session: https://claude.ai/code/session_01Ghe1P8BgNsyGdHuD4xCbdv
</commit_message>
<xml_diff>
--- a/docs/Introduction_Draft.docx
+++ b/docs/Introduction_Draft.docx
@@ -27,20 +27,154 @@
         <w:jc w:val="both"/>
       </w:pPr>
       <w:r>
-        <w:t xml:space="preserve">The size of this gap is visible in a recent survey of 32 U.S. Deaf and hard-of-hearing ASL users (Figure 1) [1]. Participants most often wanted an interpreter but could not get one in medical settings, followed by professional and educational settings. These are exactly the settings where interpreting is legally mandated, which shows that the problem is not only one of law but of availability. Interpreters are costly, often must be booked in advance, and can take hours to arrive, especially in rural areas or at short notice [1].</w:t>
+        <w:t xml:space="preserve">The size of this gap is visible in a recent survey of 32 U.S. Deaf and hard-of-hearing ASL users [1]. Participants most often wanted an interpreter but could not get one in medical settings, followed by professional and educational settings. These are exactly the settings where interpreting is legally mandated, which shows that the problem is not only one of law but of availability. Interpreters are costly, often must be booked in advance, and can take hours to arrive, especially in rural areas or at short notice [1].</w:t>
       </w:r>
     </w:p>
     <w:p>
       <w:pPr>
         <w:spacing w:after="120" w:line="360"/>
-      </w:pPr>
+        <w:ind w:firstLine="720"/>
+        <w:jc w:val="both"/>
+      </w:pPr>
+      <w:r>
+        <w:t xml:space="preserve">Automatic sign language processing has advanced quickly, but no system yet translates ASL reliably enough for general real-world use [1]. Research is divided into two tasks. </w:t>
+      </w:r>
       <w:r>
         <w:rPr>
           <w:i/>
           <w:iCs/>
-          <w:color w:val="808080"/>
         </w:rPr>
-        <w:t xml:space="preserve">[Figure 1. Insert the figure from Tran et al. [1] here. It is not stored in the public repository for copyright reasons.]</w:t>
+        <w:t xml:space="preserve">Isolated sign language recognition</w:t>
+      </w:r>
+      <w:r>
+        <w:t xml:space="preserve"> (ISLR) identifies a single sign from a fixed vocabulary. On the ASL Citizen dataset, which contains 83,399 videos of 2,731 signs from 52 signers, the best published baseline reaches 63.1% top-1 accuracy on signers not seen during training [2]. </w:t>
+      </w:r>
+      <w:r>
+        <w:rPr>
+          <w:i/>
+          <w:iCs/>
+        </w:rPr>
+        <w:t xml:space="preserve">Sign language translation</w:t>
+      </w:r>
+      <w:r>
+        <w:t xml:space="preserve"> (SLT) converts continuous signing into full sentences. SLT models have traditionally been trained on </w:t>
+      </w:r>
+      <w:r>
+        <w:rPr>
+          <w:i/>
+          <w:iCs/>
+        </w:rPr>
+        <w:t xml:space="preserve">glosses</w:t>
+      </w:r>
+      <w:r>
+        <w:t xml:space="preserve">, written labels for each sign in a sentence, which are expensive to annotate and scarce for ASL [3].</w:t>
+      </w:r>
+    </w:p>
+    <w:p>
+      <w:pPr>
+        <w:spacing w:after="120" w:line="360"/>
+        <w:ind w:firstLine="720"/>
+        <w:jc w:val="both"/>
+      </w:pPr>
+      <w:r>
+        <w:t xml:space="preserve">Recent research is therefore moving toward gloss-free and self-supervised models. SignDino, for example, learns sign representations from video without any gloss or text labels [4]. A parallel trend is lightweight models that work on body and hand landmarks extracted by tools such as MediaPipe [5], rather than on full video frames, which makes them small and fast enough for embedded hardware. The winning solution of the Google – Isolated Sign Language Recognition competition on Kaggle, a 1D convolutional network combined with a transformer, is one example [6].</w:t>
+      </w:r>
+    </w:p>
+    <w:p>
+      <w:pPr>
+        <w:spacing w:after="120" w:line="360"/>
+        <w:ind w:firstLine="720"/>
+        <w:jc w:val="both"/>
+      </w:pPr>
+      <w:r>
+        <w:t xml:space="preserve">Because gloss-free continuous translation still requires large models and datasets, our project uses landmark-based isolated recognition over a limited vocabulary. This approach runs offline on an embedded GPU, can be evaluated sign by sign, and produces confidence scores that the device can use to abstain rather than guess.</w:t>
+      </w:r>
+    </w:p>
+    <w:p>
+      <w:pPr>
+        <w:spacing w:after="120" w:line="360"/>
+        <w:ind w:firstLine="720"/>
+        <w:jc w:val="both"/>
+      </w:pPr>
+      <w:r>
+        <w:t xml:space="preserve">Existing automated approaches also have three practical weaknesses. First, they typically output a translation even when uncertain, and a wrong translation can be worse than none, especially in high-stakes settings. Second, cloud-based systems need a reliable internet connection and stream video of the user to remote servers, which raises privacy concerns. Third, most are one-way: they convert signing to text but give the hearing person no way to reply without a second device.</w:t>
+      </w:r>
+    </w:p>
+    <w:p>
+      <w:pPr>
+        <w:spacing w:after="120" w:line="360"/>
+        <w:ind w:firstLine="720"/>
+        <w:jc w:val="both"/>
+      </w:pPr>
+      <w:r>
+        <w:t xml:space="preserve">Our device addresses each of these weaknesses. All processing runs locally on an embedded GPU, so the device works without a network connection and no video leaves it. A built-in microphone converts the hearing person's speech to on-screen text, so a single device supports a two-way conversation. The device speaks a sentence only after the user confirms it on screen, and when its confidence is low it shows a list of candidate signs instead of guessing. The device is intended to provide access when an interpreter is unavailable, such as at a service counter, a front desk, or while waiting for an interpreter to arrive. It is not a replacement for certified interpreters.</w:t>
+      </w:r>
+    </w:p>
+    <w:p>
+      <w:pPr>
+        <w:spacing w:after="120" w:line="360"/>
+        <w:ind w:firstLine="720"/>
+        <w:jc w:val="both"/>
+      </w:pPr>
+      <w:r>
+        <w:t xml:space="preserve">The objective of this project is to design and build a portable prototype that lets a Deaf ASL user hold a short two-way conversation with a hearing person who speaks English, Turkish or Spanish, without an internet connection. The prototype is scoped to structured, everyday exchanges such as those at a service counter or front desk. Its technical goals, summarized in Table 1, are to recognize a vocabulary of 100–250 ASL signs at no less than 75% top-1 and 90% top-5 accuracy on signers not seen during training; to speak a confirmed sentence in the selected language within 1.2 s of the user's confirmation; to show the hearing person's spoken reply as English text; and to run entirely on an embedded GPU. The project also has a reliability objective: the device should abstain rather than voice a translation it is not confident in, and we will report its accuracy on the sentences it does speak, not only its overall accuracy. These figures are design targets; measured results will be reported as the project progresses.</w:t>
+      </w:r>
+    </w:p>
+    <w:p>
+      <w:pPr>
+        <w:spacing w:after="120" w:line="360"/>
+        <w:ind w:firstLine="720"/>
+        <w:jc w:val="both"/>
+      </w:pPr>
+      <w:r>
+        <w:t xml:space="preserve">We chose the service-counter setting based on Deaf users' own priorities. Figure 1 summarizes the survey ratings by setting. “Going into a business” received the highest willingness to use automatic translation, and every participant showed at least some willingness there; self-service kiosks and informal educational activities followed, while mental healthcare, education settings and formal personal events ranked lowest (Figure 1b) [1]. Business settings also show a moderate unmet need for interpreters (Figure 1a), so a device there would fill a real gap where users are most open to the technology. Participants also held their lowest accuracy expectations for kiosk-type exchanges and their highest for medical settings [1]. A service counter is therefore a realistic first target for a system with a vocabulary of a few hundred signs.</w:t>
+      </w:r>
+    </w:p>
+    <w:p>
+      <w:pPr>
+        <w:keepNext/>
+        <w:spacing w:after="60" w:before="240"/>
+        <w:jc w:val="center"/>
+      </w:pPr>
+      <w:r>
+        <w:drawing>
+          <wp:inline distT="0" distB="0" distL="0" distR="0">
+            <wp:extent cx="5760720" cy="3181350"/>
+            <wp:effectExtent t="0" r="0" b="0" l="0"/>
+            <wp:docPr id="1" name="Figure 1." descr="Mean ratings by setting from a survey of 32 Deaf and hard-of-hearing ASL users: (a) how often they wanted a professional interpreter but could not get one; (b) how willing they would be to use automatic sign language translation. Settings are ordered by (b); the target setting of this project is highlighted. Data from Tran et al. [1]; means computed from the published response distributions." title="Figure 1."/>
+            <wp:cNvGraphicFramePr>
+              <a:graphicFrameLocks xmlns:a="http://schemas.openxmlformats.org/drawingml/2006/main" noChangeAspect="1"/>
+            </wp:cNvGraphicFramePr>
+            <a:graphic xmlns:a="http://schemas.openxmlformats.org/drawingml/2006/main">
+              <a:graphicData uri="http://schemas.openxmlformats.org/drawingml/2006/picture">
+                <pic:pic xmlns:pic="http://schemas.openxmlformats.org/drawingml/2006/picture">
+                  <pic:nvPicPr>
+                    <pic:cNvPr id="0" name="" descr=""/>
+                    <pic:cNvPicPr>
+                      <a:picLocks noChangeAspect="1" noChangeArrowheads="1"/>
+                    </pic:cNvPicPr>
+                  </pic:nvPicPr>
+                  <pic:blipFill>
+                    <a:blip r:embed="rId7" cstate="none"/>
+                    <a:srcRect/>
+                    <a:stretch>
+                      <a:fillRect/>
+                    </a:stretch>
+                  </pic:blipFill>
+                  <pic:spPr bwMode="auto">
+                    <a:xfrm>
+                      <a:off x="0" y="0"/>
+                      <a:ext cx="5760720" cy="3181350"/>
+                    </a:xfrm>
+                    <a:prstGeom prst="rect">
+                      <a:avLst/>
+                    </a:prstGeom>
+                  </pic:spPr>
+                </pic:pic>
+              </a:graphicData>
+            </a:graphic>
+          </wp:inline>
+        </w:drawing>
       </w:r>
     </w:p>
     <w:p>
@@ -63,127 +197,14 @@
           <w:sz w:val="20"/>
           <w:szCs w:val="20"/>
         </w:rPr>
-        <w:t xml:space="preserve">How often Deaf and hard-of-hearing survey participants wanted a professional ASL interpreter but could not get one, by setting (n = 32). Reproduced from Tran et al. [1].</w:t>
-      </w:r>
-    </w:p>
-    <w:p>
-      <w:pPr>
-        <w:spacing w:after="120" w:line="360"/>
-        <w:ind w:firstLine="720"/>
-        <w:jc w:val="both"/>
-      </w:pPr>
-      <w:r>
-        <w:t xml:space="preserve">Automatic sign language processing has advanced quickly, but no system yet translates ASL reliably enough for general real-world use [1]. Research is divided into two tasks. </w:t>
-      </w:r>
-      <w:r>
-        <w:rPr>
-          <w:i/>
-          <w:iCs/>
-        </w:rPr>
-        <w:t xml:space="preserve">Isolated sign language recognition</w:t>
-      </w:r>
-      <w:r>
-        <w:t xml:space="preserve"> (ISLR) identifies a single sign from a fixed vocabulary. On the ASL Citizen dataset, which contains 83,399 videos of 2,731 signs from 52 signers, the best published baseline reaches 63.1% top-1 accuracy on signers not seen during training [2]. </w:t>
-      </w:r>
-      <w:r>
-        <w:rPr>
-          <w:i/>
-          <w:iCs/>
-        </w:rPr>
-        <w:t xml:space="preserve">Sign language translation</w:t>
-      </w:r>
-      <w:r>
-        <w:t xml:space="preserve"> (SLT) converts continuous signing into full sentences. SLT models have traditionally been trained on </w:t>
-      </w:r>
-      <w:r>
-        <w:rPr>
-          <w:i/>
-          <w:iCs/>
-        </w:rPr>
-        <w:t xml:space="preserve">glosses</w:t>
-      </w:r>
-      <w:r>
-        <w:t xml:space="preserve">, written labels for each sign in a sentence, which are expensive to annotate and scarce for ASL [3].</w:t>
-      </w:r>
-    </w:p>
-    <w:p>
-      <w:pPr>
-        <w:spacing w:after="120" w:line="360"/>
-        <w:ind w:firstLine="720"/>
-        <w:jc w:val="both"/>
-      </w:pPr>
-      <w:r>
-        <w:t xml:space="preserve">Recent research is therefore moving toward gloss-free and self-supervised models. SignDino, for example, learns sign representations from video without any gloss or text labels [4]. A parallel trend is lightweight models that work on body and hand landmarks extracted by tools such as MediaPipe [5], rather than on full video frames, which makes them small and fast enough for embedded hardware. The winning solution of the Google – Isolated Sign Language Recognition competition on Kaggle, a 1D convolutional network combined with a transformer, is one example [6].</w:t>
-      </w:r>
-    </w:p>
-    <w:p>
-      <w:pPr>
-        <w:spacing w:after="120" w:line="360"/>
-        <w:ind w:firstLine="720"/>
-        <w:jc w:val="both"/>
-      </w:pPr>
-      <w:r>
-        <w:t xml:space="preserve">Because gloss-free continuous translation still requires large models and datasets, our project uses landmark-based isolated recognition over a limited vocabulary. This approach runs offline on an embedded GPU, can be evaluated sign by sign, and produces confidence scores that the device can use to abstain rather than guess.</w:t>
-      </w:r>
-    </w:p>
-    <w:p>
-      <w:pPr>
-        <w:spacing w:after="120" w:line="360"/>
-        <w:ind w:firstLine="720"/>
-        <w:jc w:val="both"/>
-      </w:pPr>
-      <w:r>
-        <w:t xml:space="preserve">Existing automated approaches also have three practical weaknesses. First, they typically output a translation even when uncertain, and a wrong translation can be worse than none, especially in high-stakes settings. Second, cloud-based systems need a reliable internet connection and stream video of the user to remote servers, which raises privacy concerns. Third, most are one-way: they convert signing to text but give the hearing person no way to reply without a second device.</w:t>
-      </w:r>
-    </w:p>
-    <w:p>
-      <w:pPr>
-        <w:spacing w:after="120" w:line="360"/>
-        <w:ind w:firstLine="720"/>
-        <w:jc w:val="both"/>
-      </w:pPr>
-      <w:r>
-        <w:t xml:space="preserve">Our device addresses each of these weaknesses. All processing runs locally on an embedded GPU, so the device works without a network connection and no video leaves it. A built-in microphone converts the hearing person's speech to on-screen text, so a single device supports a two-way conversation. The device speaks a sentence only after the user confirms it on screen, and when its confidence is low it shows a list of candidate signs instead of guessing. The device is intended to provide access when an interpreter is unavailable, such as at a service counter, a front desk, or while waiting for an interpreter to arrive. It is not a replacement for certified interpreters.</w:t>
-      </w:r>
-    </w:p>
-    <w:p>
-      <w:pPr>
-        <w:spacing w:after="120" w:line="360"/>
-        <w:ind w:firstLine="720"/>
-        <w:jc w:val="both"/>
-      </w:pPr>
-      <w:r>
-        <w:t xml:space="preserve">The objective of this project is to design and build a portable prototype that lets a Deaf ASL user hold a short two-way conversation with a hearing person who speaks English, Turkish or Spanish, without an internet connection. The prototype is scoped to structured, everyday exchanges such as those at a service counter or front desk. Its technical goals, summarized in Table 2, are to recognize a vocabulary of 100–250 ASL signs at no less than 75% top-1 and 90% top-5 accuracy on signers not seen during training; to speak a confirmed sentence in the selected language within 1.2 s of the user's confirmation; to show the hearing person's spoken reply as English text; and to run entirely on an embedded GPU. The project also has a reliability objective: the device should abstain rather than voice a translation it is not confident in, and we will report its accuracy on the sentences it does speak, not only its overall accuracy. These figures are design targets; measured results will be reported as the project progresses.</w:t>
-      </w:r>
-    </w:p>
-    <w:p>
-      <w:pPr>
-        <w:spacing w:after="120" w:line="360"/>
-        <w:ind w:firstLine="720"/>
-        <w:jc w:val="both"/>
-      </w:pPr>
-      <w:r>
-        <w:t xml:space="preserve">We chose the service-counter setting based on Deaf users' own priorities. In the same survey, “going into a business” received the highest willingness to use automatic translation, and every participant showed at least some willingness there; self-service kiosks and informal educational activities followed, while mental healthcare, education settings and formal personal events ranked lowest (Figure 2) [1]. Participants also held their lowest accuracy expectations for kiosk-type exchanges and their highest for medical settings [1]. A service counter is therefore a realistic first target for a system with a vocabulary of a few hundred signs.</w:t>
-      </w:r>
-    </w:p>
-    <w:p>
-      <w:pPr>
-        <w:spacing w:after="120" w:line="360"/>
-      </w:pPr>
-      <w:r>
-        <w:rPr>
-          <w:i/>
-          <w:iCs/>
-          <w:color w:val="808080"/>
-        </w:rPr>
-        <w:t xml:space="preserve">[Figure 2. Insert the figure from Tran et al. [1] here. It is not stored in the public repository for copyright reasons.]</w:t>
-      </w:r>
-    </w:p>
-    <w:p>
-      <w:pPr>
-        <w:spacing w:after="240"/>
-        <w:ind w:left="360" w:right="360"/>
-        <w:jc w:val="both"/>
+        <w:t xml:space="preserve">Mean ratings by setting from a survey of 32 Deaf and hard-of-hearing ASL users: (a) how often they wanted a professional interpreter but could not get one; (b) how willing they would be to use automatic sign language translation. Settings are ordered by (b); the target setting of this project is highlighted. Data from Tran et al. [1]; means computed from the published response distributions.</w:t>
+      </w:r>
+    </w:p>
+    <w:p>
+      <w:pPr>
+        <w:keepNext/>
+        <w:spacing w:after="120" w:before="240"/>
+        <w:jc w:val="center"/>
       </w:pPr>
       <w:r>
         <w:rPr>
@@ -192,30 +213,7 @@
           <w:sz w:val="20"/>
           <w:szCs w:val="20"/>
         </w:rPr>
-        <w:t xml:space="preserve">Figure 2. </w:t>
-      </w:r>
-      <w:r>
-        <w:rPr>
-          <w:sz w:val="20"/>
-          <w:szCs w:val="20"/>
-        </w:rPr>
-        <w:t xml:space="preserve">Survey participants' willingness to use automatic sign language translation in different settings (n = 32). Reproduced from Tran et al. [1].</w:t>
-      </w:r>
-    </w:p>
-    <w:p>
-      <w:pPr>
-        <w:keepNext/>
-        <w:spacing w:after="120" w:before="240"/>
-        <w:jc w:val="center"/>
-      </w:pPr>
-      <w:r>
-        <w:rPr>
-          <w:b/>
-          <w:bCs/>
-          <w:sz w:val="20"/>
-          <w:szCs w:val="20"/>
-        </w:rPr>
-        <w:t xml:space="preserve">Table 2. </w:t>
+        <w:t xml:space="preserve">Table 1. </w:t>
       </w:r>
       <w:r>
         <w:rPr>
@@ -251,17 +249,16 @@
           <w:tcPr>
             <w:tcW w:type="dxa" w:w="2900"/>
             <w:tcBorders>
-              <w:top w:val="single" w:color="808080" w:sz="4"/>
-              <w:left w:val="single" w:color="808080" w:sz="4"/>
-              <w:bottom w:val="single" w:color="808080" w:sz="4"/>
-              <w:right w:val="single" w:color="808080" w:sz="4"/>
-            </w:tcBorders>
-            <w:shd w:fill="E7E6E6" w:color="auto" w:val="clear"/>
-            <w:tcMar>
-              <w:top w:type="dxa" w:w="60"/>
-              <w:left w:type="dxa" w:w="100"/>
-              <w:bottom w:type="dxa" w:w="60"/>
-              <w:right w:type="dxa" w:w="100"/>
+              <w:top w:val="single" w:color="000000" w:sz="12"/>
+              <w:left w:val="none" w:color="FFFFFF" w:sz="0"/>
+              <w:bottom w:val="single" w:color="000000" w:sz="4"/>
+              <w:right w:val="none" w:color="FFFFFF" w:sz="0"/>
+            </w:tcBorders>
+            <w:tcMar>
+              <w:top w:type="dxa" w:w="80"/>
+              <w:left w:type="dxa" w:w="80"/>
+              <w:bottom w:type="dxa" w:w="80"/>
+              <w:right w:type="dxa" w:w="80"/>
             </w:tcMar>
           </w:tcPr>
           <w:p>
@@ -269,6 +266,8 @@
               <w:rPr>
                 <w:b/>
                 <w:bCs/>
+                <w:i w:val="false"/>
+                <w:iCs w:val="false"/>
                 <w:sz w:val="20"/>
                 <w:szCs w:val="20"/>
               </w:rPr>
@@ -280,17 +279,16 @@
           <w:tcPr>
             <w:tcW w:type="dxa" w:w="2900"/>
             <w:tcBorders>
-              <w:top w:val="single" w:color="808080" w:sz="4"/>
-              <w:left w:val="single" w:color="808080" w:sz="4"/>
-              <w:bottom w:val="single" w:color="808080" w:sz="4"/>
-              <w:right w:val="single" w:color="808080" w:sz="4"/>
-            </w:tcBorders>
-            <w:shd w:fill="E7E6E6" w:color="auto" w:val="clear"/>
-            <w:tcMar>
-              <w:top w:type="dxa" w:w="60"/>
-              <w:left w:type="dxa" w:w="100"/>
-              <w:bottom w:type="dxa" w:w="60"/>
-              <w:right w:type="dxa" w:w="100"/>
+              <w:top w:val="single" w:color="000000" w:sz="12"/>
+              <w:left w:val="none" w:color="FFFFFF" w:sz="0"/>
+              <w:bottom w:val="single" w:color="000000" w:sz="4"/>
+              <w:right w:val="none" w:color="FFFFFF" w:sz="0"/>
+            </w:tcBorders>
+            <w:tcMar>
+              <w:top w:type="dxa" w:w="80"/>
+              <w:left w:type="dxa" w:w="80"/>
+              <w:bottom w:type="dxa" w:w="80"/>
+              <w:right w:type="dxa" w:w="80"/>
             </w:tcMar>
           </w:tcPr>
           <w:p>
@@ -298,6 +296,8 @@
               <w:rPr>
                 <w:b/>
                 <w:bCs/>
+                <w:i w:val="false"/>
+                <w:iCs w:val="false"/>
                 <w:sz w:val="20"/>
                 <w:szCs w:val="20"/>
               </w:rPr>
@@ -309,17 +309,16 @@
           <w:tcPr>
             <w:tcW w:type="dxa" w:w="3560"/>
             <w:tcBorders>
-              <w:top w:val="single" w:color="808080" w:sz="4"/>
-              <w:left w:val="single" w:color="808080" w:sz="4"/>
-              <w:bottom w:val="single" w:color="808080" w:sz="4"/>
-              <w:right w:val="single" w:color="808080" w:sz="4"/>
-            </w:tcBorders>
-            <w:shd w:fill="E7E6E6" w:color="auto" w:val="clear"/>
-            <w:tcMar>
-              <w:top w:type="dxa" w:w="60"/>
-              <w:left w:type="dxa" w:w="100"/>
-              <w:bottom w:type="dxa" w:w="60"/>
-              <w:right w:type="dxa" w:w="100"/>
+              <w:top w:val="single" w:color="000000" w:sz="12"/>
+              <w:left w:val="none" w:color="FFFFFF" w:sz="0"/>
+              <w:bottom w:val="single" w:color="000000" w:sz="4"/>
+              <w:right w:val="none" w:color="FFFFFF" w:sz="0"/>
+            </w:tcBorders>
+            <w:tcMar>
+              <w:top w:type="dxa" w:w="80"/>
+              <w:left w:type="dxa" w:w="80"/>
+              <w:bottom w:type="dxa" w:w="80"/>
+              <w:right w:type="dxa" w:w="80"/>
             </w:tcMar>
           </w:tcPr>
           <w:p>
@@ -327,6 +326,8 @@
               <w:rPr>
                 <w:b/>
                 <w:bCs/>
+                <w:i w:val="false"/>
+                <w:iCs w:val="false"/>
                 <w:sz w:val="20"/>
                 <w:szCs w:val="20"/>
               </w:rPr>
@@ -344,23 +345,25 @@
           <w:tcPr>
             <w:tcW w:type="dxa" w:w="2900"/>
             <w:tcBorders>
-              <w:top w:val="single" w:color="808080" w:sz="4"/>
-              <w:left w:val="single" w:color="808080" w:sz="4"/>
-              <w:bottom w:val="single" w:color="808080" w:sz="4"/>
-              <w:right w:val="single" w:color="808080" w:sz="4"/>
-            </w:tcBorders>
-            <w:tcMar>
-              <w:top w:type="dxa" w:w="60"/>
-              <w:left w:type="dxa" w:w="100"/>
-              <w:bottom w:type="dxa" w:w="60"/>
-              <w:right w:type="dxa" w:w="100"/>
-            </w:tcMar>
-          </w:tcPr>
-          <w:p>
-            <w:r>
-              <w:rPr>
-                <w:b w:val="false"/>
-                <w:bCs w:val="false"/>
+              <w:top w:val="single" w:color="000000" w:sz="4"/>
+              <w:left w:val="none" w:color="FFFFFF" w:sz="0"/>
+              <w:bottom w:val="none" w:color="FFFFFF" w:sz="0"/>
+              <w:right w:val="none" w:color="FFFFFF" w:sz="0"/>
+            </w:tcBorders>
+            <w:tcMar>
+              <w:top w:type="dxa" w:w="50"/>
+              <w:left w:type="dxa" w:w="80"/>
+              <w:bottom w:type="dxa" w:w="50"/>
+              <w:right w:type="dxa" w:w="80"/>
+            </w:tcMar>
+          </w:tcPr>
+          <w:p>
+            <w:r>
+              <w:rPr>
+                <w:b w:val="false"/>
+                <w:bCs w:val="false"/>
+                <w:i w:val="false"/>
+                <w:iCs w:val="false"/>
                 <w:sz w:val="20"/>
                 <w:szCs w:val="20"/>
               </w:rPr>
@@ -372,23 +375,25 @@
           <w:tcPr>
             <w:tcW w:type="dxa" w:w="2900"/>
             <w:tcBorders>
-              <w:top w:val="single" w:color="808080" w:sz="4"/>
-              <w:left w:val="single" w:color="808080" w:sz="4"/>
-              <w:bottom w:val="single" w:color="808080" w:sz="4"/>
-              <w:right w:val="single" w:color="808080" w:sz="4"/>
-            </w:tcBorders>
-            <w:tcMar>
-              <w:top w:type="dxa" w:w="60"/>
-              <w:left w:type="dxa" w:w="100"/>
-              <w:bottom w:type="dxa" w:w="60"/>
-              <w:right w:type="dxa" w:w="100"/>
-            </w:tcMar>
-          </w:tcPr>
-          <w:p>
-            <w:r>
-              <w:rPr>
-                <w:b w:val="false"/>
-                <w:bCs w:val="false"/>
+              <w:top w:val="single" w:color="000000" w:sz="4"/>
+              <w:left w:val="none" w:color="FFFFFF" w:sz="0"/>
+              <w:bottom w:val="none" w:color="FFFFFF" w:sz="0"/>
+              <w:right w:val="none" w:color="FFFFFF" w:sz="0"/>
+            </w:tcBorders>
+            <w:tcMar>
+              <w:top w:type="dxa" w:w="50"/>
+              <w:left w:type="dxa" w:w="80"/>
+              <w:bottom w:type="dxa" w:w="50"/>
+              <w:right w:type="dxa" w:w="80"/>
+            </w:tcMar>
+          </w:tcPr>
+          <w:p>
+            <w:r>
+              <w:rPr>
+                <w:b w:val="false"/>
+                <w:bCs w:val="false"/>
+                <w:i w:val="false"/>
+                <w:iCs w:val="false"/>
                 <w:sz w:val="20"/>
                 <w:szCs w:val="20"/>
               </w:rPr>
@@ -400,23 +405,25 @@
           <w:tcPr>
             <w:tcW w:type="dxa" w:w="3560"/>
             <w:tcBorders>
-              <w:top w:val="single" w:color="808080" w:sz="4"/>
-              <w:left w:val="single" w:color="808080" w:sz="4"/>
-              <w:bottom w:val="single" w:color="808080" w:sz="4"/>
-              <w:right w:val="single" w:color="808080" w:sz="4"/>
-            </w:tcBorders>
-            <w:tcMar>
-              <w:top w:type="dxa" w:w="60"/>
-              <w:left w:type="dxa" w:w="100"/>
-              <w:bottom w:type="dxa" w:w="60"/>
-              <w:right w:type="dxa" w:w="100"/>
-            </w:tcMar>
-          </w:tcPr>
-          <w:p>
-            <w:r>
-              <w:rPr>
-                <w:b w:val="false"/>
-                <w:bCs w:val="false"/>
+              <w:top w:val="single" w:color="000000" w:sz="4"/>
+              <w:left w:val="none" w:color="FFFFFF" w:sz="0"/>
+              <w:bottom w:val="none" w:color="FFFFFF" w:sz="0"/>
+              <w:right w:val="none" w:color="FFFFFF" w:sz="0"/>
+            </w:tcBorders>
+            <w:tcMar>
+              <w:top w:type="dxa" w:w="50"/>
+              <w:left w:type="dxa" w:w="80"/>
+              <w:bottom w:type="dxa" w:w="50"/>
+              <w:right w:type="dxa" w:w="80"/>
+            </w:tcMar>
+          </w:tcPr>
+          <w:p>
+            <w:r>
+              <w:rPr>
+                <w:b w:val="false"/>
+                <w:bCs w:val="false"/>
+                <w:i w:val="false"/>
+                <w:iCs w:val="false"/>
                 <w:sz w:val="20"/>
                 <w:szCs w:val="20"/>
               </w:rPr>
@@ -434,23 +441,25 @@
           <w:tcPr>
             <w:tcW w:type="dxa" w:w="2900"/>
             <w:tcBorders>
-              <w:top w:val="single" w:color="808080" w:sz="4"/>
-              <w:left w:val="single" w:color="808080" w:sz="4"/>
-              <w:bottom w:val="single" w:color="808080" w:sz="4"/>
-              <w:right w:val="single" w:color="808080" w:sz="4"/>
-            </w:tcBorders>
-            <w:tcMar>
-              <w:top w:type="dxa" w:w="60"/>
-              <w:left w:type="dxa" w:w="100"/>
-              <w:bottom w:type="dxa" w:w="60"/>
-              <w:right w:type="dxa" w:w="100"/>
-            </w:tcMar>
-          </w:tcPr>
-          <w:p>
-            <w:r>
-              <w:rPr>
-                <w:b w:val="false"/>
-                <w:bCs w:val="false"/>
+              <w:top w:val="none" w:color="FFFFFF" w:sz="0"/>
+              <w:left w:val="none" w:color="FFFFFF" w:sz="0"/>
+              <w:bottom w:val="none" w:color="FFFFFF" w:sz="0"/>
+              <w:right w:val="none" w:color="FFFFFF" w:sz="0"/>
+            </w:tcBorders>
+            <w:tcMar>
+              <w:top w:type="dxa" w:w="50"/>
+              <w:left w:type="dxa" w:w="80"/>
+              <w:bottom w:type="dxa" w:w="50"/>
+              <w:right w:type="dxa" w:w="80"/>
+            </w:tcMar>
+          </w:tcPr>
+          <w:p>
+            <w:r>
+              <w:rPr>
+                <w:b w:val="false"/>
+                <w:bCs w:val="false"/>
+                <w:i w:val="false"/>
+                <w:iCs w:val="false"/>
                 <w:sz w:val="20"/>
                 <w:szCs w:val="20"/>
               </w:rPr>
@@ -462,23 +471,25 @@
           <w:tcPr>
             <w:tcW w:type="dxa" w:w="2900"/>
             <w:tcBorders>
-              <w:top w:val="single" w:color="808080" w:sz="4"/>
-              <w:left w:val="single" w:color="808080" w:sz="4"/>
-              <w:bottom w:val="single" w:color="808080" w:sz="4"/>
-              <w:right w:val="single" w:color="808080" w:sz="4"/>
-            </w:tcBorders>
-            <w:tcMar>
-              <w:top w:type="dxa" w:w="60"/>
-              <w:left w:type="dxa" w:w="100"/>
-              <w:bottom w:type="dxa" w:w="60"/>
-              <w:right w:type="dxa" w:w="100"/>
-            </w:tcMar>
-          </w:tcPr>
-          <w:p>
-            <w:r>
-              <w:rPr>
-                <w:b w:val="false"/>
-                <w:bCs w:val="false"/>
+              <w:top w:val="none" w:color="FFFFFF" w:sz="0"/>
+              <w:left w:val="none" w:color="FFFFFF" w:sz="0"/>
+              <w:bottom w:val="none" w:color="FFFFFF" w:sz="0"/>
+              <w:right w:val="none" w:color="FFFFFF" w:sz="0"/>
+            </w:tcBorders>
+            <w:tcMar>
+              <w:top w:type="dxa" w:w="50"/>
+              <w:left w:type="dxa" w:w="80"/>
+              <w:bottom w:type="dxa" w:w="50"/>
+              <w:right w:type="dxa" w:w="80"/>
+            </w:tcMar>
+          </w:tcPr>
+          <w:p>
+            <w:r>
+              <w:rPr>
+                <w:b w:val="false"/>
+                <w:bCs w:val="false"/>
+                <w:i w:val="false"/>
+                <w:iCs w:val="false"/>
                 <w:sz w:val="20"/>
                 <w:szCs w:val="20"/>
               </w:rPr>
@@ -490,23 +501,25 @@
           <w:tcPr>
             <w:tcW w:type="dxa" w:w="3560"/>
             <w:tcBorders>
-              <w:top w:val="single" w:color="808080" w:sz="4"/>
-              <w:left w:val="single" w:color="808080" w:sz="4"/>
-              <w:bottom w:val="single" w:color="808080" w:sz="4"/>
-              <w:right w:val="single" w:color="808080" w:sz="4"/>
-            </w:tcBorders>
-            <w:tcMar>
-              <w:top w:type="dxa" w:w="60"/>
-              <w:left w:type="dxa" w:w="100"/>
-              <w:bottom w:type="dxa" w:w="60"/>
-              <w:right w:type="dxa" w:w="100"/>
-            </w:tcMar>
-          </w:tcPr>
-          <w:p>
-            <w:r>
-              <w:rPr>
-                <w:b w:val="false"/>
-                <w:bCs w:val="false"/>
+              <w:top w:val="none" w:color="FFFFFF" w:sz="0"/>
+              <w:left w:val="none" w:color="FFFFFF" w:sz="0"/>
+              <w:bottom w:val="none" w:color="FFFFFF" w:sz="0"/>
+              <w:right w:val="none" w:color="FFFFFF" w:sz="0"/>
+            </w:tcBorders>
+            <w:tcMar>
+              <w:top w:type="dxa" w:w="50"/>
+              <w:left w:type="dxa" w:w="80"/>
+              <w:bottom w:type="dxa" w:w="50"/>
+              <w:right w:type="dxa" w:w="80"/>
+            </w:tcMar>
+          </w:tcPr>
+          <w:p>
+            <w:r>
+              <w:rPr>
+                <w:b w:val="false"/>
+                <w:bCs w:val="false"/>
+                <w:i w:val="false"/>
+                <w:iCs w:val="false"/>
                 <w:sz w:val="20"/>
                 <w:szCs w:val="20"/>
               </w:rPr>
@@ -524,23 +537,25 @@
           <w:tcPr>
             <w:tcW w:type="dxa" w:w="2900"/>
             <w:tcBorders>
-              <w:top w:val="single" w:color="808080" w:sz="4"/>
-              <w:left w:val="single" w:color="808080" w:sz="4"/>
-              <w:bottom w:val="single" w:color="808080" w:sz="4"/>
-              <w:right w:val="single" w:color="808080" w:sz="4"/>
-            </w:tcBorders>
-            <w:tcMar>
-              <w:top w:type="dxa" w:w="60"/>
-              <w:left w:type="dxa" w:w="100"/>
-              <w:bottom w:type="dxa" w:w="60"/>
-              <w:right w:type="dxa" w:w="100"/>
-            </w:tcMar>
-          </w:tcPr>
-          <w:p>
-            <w:r>
-              <w:rPr>
-                <w:b w:val="false"/>
-                <w:bCs w:val="false"/>
+              <w:top w:val="none" w:color="FFFFFF" w:sz="0"/>
+              <w:left w:val="none" w:color="FFFFFF" w:sz="0"/>
+              <w:bottom w:val="none" w:color="FFFFFF" w:sz="0"/>
+              <w:right w:val="none" w:color="FFFFFF" w:sz="0"/>
+            </w:tcBorders>
+            <w:tcMar>
+              <w:top w:type="dxa" w:w="50"/>
+              <w:left w:type="dxa" w:w="80"/>
+              <w:bottom w:type="dxa" w:w="50"/>
+              <w:right w:type="dxa" w:w="80"/>
+            </w:tcMar>
+          </w:tcPr>
+          <w:p>
+            <w:r>
+              <w:rPr>
+                <w:b w:val="false"/>
+                <w:bCs w:val="false"/>
+                <w:i w:val="false"/>
+                <w:iCs w:val="false"/>
                 <w:sz w:val="20"/>
                 <w:szCs w:val="20"/>
               </w:rPr>
@@ -552,23 +567,25 @@
           <w:tcPr>
             <w:tcW w:type="dxa" w:w="2900"/>
             <w:tcBorders>
-              <w:top w:val="single" w:color="808080" w:sz="4"/>
-              <w:left w:val="single" w:color="808080" w:sz="4"/>
-              <w:bottom w:val="single" w:color="808080" w:sz="4"/>
-              <w:right w:val="single" w:color="808080" w:sz="4"/>
-            </w:tcBorders>
-            <w:tcMar>
-              <w:top w:type="dxa" w:w="60"/>
-              <w:left w:type="dxa" w:w="100"/>
-              <w:bottom w:type="dxa" w:w="60"/>
-              <w:right w:type="dxa" w:w="100"/>
-            </w:tcMar>
-          </w:tcPr>
-          <w:p>
-            <w:r>
-              <w:rPr>
-                <w:b w:val="false"/>
-                <w:bCs w:val="false"/>
+              <w:top w:val="none" w:color="FFFFFF" w:sz="0"/>
+              <w:left w:val="none" w:color="FFFFFF" w:sz="0"/>
+              <w:bottom w:val="none" w:color="FFFFFF" w:sz="0"/>
+              <w:right w:val="none" w:color="FFFFFF" w:sz="0"/>
+            </w:tcBorders>
+            <w:tcMar>
+              <w:top w:type="dxa" w:w="50"/>
+              <w:left w:type="dxa" w:w="80"/>
+              <w:bottom w:type="dxa" w:w="50"/>
+              <w:right w:type="dxa" w:w="80"/>
+            </w:tcMar>
+          </w:tcPr>
+          <w:p>
+            <w:r>
+              <w:rPr>
+                <w:b w:val="false"/>
+                <w:bCs w:val="false"/>
+                <w:i w:val="false"/>
+                <w:iCs w:val="false"/>
                 <w:sz w:val="20"/>
                 <w:szCs w:val="20"/>
               </w:rPr>
@@ -580,23 +597,25 @@
           <w:tcPr>
             <w:tcW w:type="dxa" w:w="3560"/>
             <w:tcBorders>
-              <w:top w:val="single" w:color="808080" w:sz="4"/>
-              <w:left w:val="single" w:color="808080" w:sz="4"/>
-              <w:bottom w:val="single" w:color="808080" w:sz="4"/>
-              <w:right w:val="single" w:color="808080" w:sz="4"/>
-            </w:tcBorders>
-            <w:tcMar>
-              <w:top w:type="dxa" w:w="60"/>
-              <w:left w:type="dxa" w:w="100"/>
-              <w:bottom w:type="dxa" w:w="60"/>
-              <w:right w:type="dxa" w:w="100"/>
-            </w:tcMar>
-          </w:tcPr>
-          <w:p>
-            <w:r>
-              <w:rPr>
-                <w:b w:val="false"/>
-                <w:bCs w:val="false"/>
+              <w:top w:val="none" w:color="FFFFFF" w:sz="0"/>
+              <w:left w:val="none" w:color="FFFFFF" w:sz="0"/>
+              <w:bottom w:val="none" w:color="FFFFFF" w:sz="0"/>
+              <w:right w:val="none" w:color="FFFFFF" w:sz="0"/>
+            </w:tcBorders>
+            <w:tcMar>
+              <w:top w:type="dxa" w:w="50"/>
+              <w:left w:type="dxa" w:w="80"/>
+              <w:bottom w:type="dxa" w:w="50"/>
+              <w:right w:type="dxa" w:w="80"/>
+            </w:tcMar>
+          </w:tcPr>
+          <w:p>
+            <w:r>
+              <w:rPr>
+                <w:b w:val="false"/>
+                <w:bCs w:val="false"/>
+                <w:i w:val="false"/>
+                <w:iCs w:val="false"/>
                 <w:sz w:val="20"/>
                 <w:szCs w:val="20"/>
               </w:rPr>
@@ -614,23 +633,25 @@
           <w:tcPr>
             <w:tcW w:type="dxa" w:w="2900"/>
             <w:tcBorders>
-              <w:top w:val="single" w:color="808080" w:sz="4"/>
-              <w:left w:val="single" w:color="808080" w:sz="4"/>
-              <w:bottom w:val="single" w:color="808080" w:sz="4"/>
-              <w:right w:val="single" w:color="808080" w:sz="4"/>
-            </w:tcBorders>
-            <w:tcMar>
-              <w:top w:type="dxa" w:w="60"/>
-              <w:left w:type="dxa" w:w="100"/>
-              <w:bottom w:type="dxa" w:w="60"/>
-              <w:right w:type="dxa" w:w="100"/>
-            </w:tcMar>
-          </w:tcPr>
-          <w:p>
-            <w:r>
-              <w:rPr>
-                <w:b w:val="false"/>
-                <w:bCs w:val="false"/>
+              <w:top w:val="none" w:color="FFFFFF" w:sz="0"/>
+              <w:left w:val="none" w:color="FFFFFF" w:sz="0"/>
+              <w:bottom w:val="none" w:color="FFFFFF" w:sz="0"/>
+              <w:right w:val="none" w:color="FFFFFF" w:sz="0"/>
+            </w:tcBorders>
+            <w:tcMar>
+              <w:top w:type="dxa" w:w="50"/>
+              <w:left w:type="dxa" w:w="80"/>
+              <w:bottom w:type="dxa" w:w="50"/>
+              <w:right w:type="dxa" w:w="80"/>
+            </w:tcMar>
+          </w:tcPr>
+          <w:p>
+            <w:r>
+              <w:rPr>
+                <w:b w:val="false"/>
+                <w:bCs w:val="false"/>
+                <w:i w:val="false"/>
+                <w:iCs w:val="false"/>
                 <w:sz w:val="20"/>
                 <w:szCs w:val="20"/>
               </w:rPr>
@@ -642,23 +663,25 @@
           <w:tcPr>
             <w:tcW w:type="dxa" w:w="2900"/>
             <w:tcBorders>
-              <w:top w:val="single" w:color="808080" w:sz="4"/>
-              <w:left w:val="single" w:color="808080" w:sz="4"/>
-              <w:bottom w:val="single" w:color="808080" w:sz="4"/>
-              <w:right w:val="single" w:color="808080" w:sz="4"/>
-            </w:tcBorders>
-            <w:tcMar>
-              <w:top w:type="dxa" w:w="60"/>
-              <w:left w:type="dxa" w:w="100"/>
-              <w:bottom w:type="dxa" w:w="60"/>
-              <w:right w:type="dxa" w:w="100"/>
-            </w:tcMar>
-          </w:tcPr>
-          <w:p>
-            <w:r>
-              <w:rPr>
-                <w:b w:val="false"/>
-                <w:bCs w:val="false"/>
+              <w:top w:val="none" w:color="FFFFFF" w:sz="0"/>
+              <w:left w:val="none" w:color="FFFFFF" w:sz="0"/>
+              <w:bottom w:val="none" w:color="FFFFFF" w:sz="0"/>
+              <w:right w:val="none" w:color="FFFFFF" w:sz="0"/>
+            </w:tcBorders>
+            <w:tcMar>
+              <w:top w:type="dxa" w:w="50"/>
+              <w:left w:type="dxa" w:w="80"/>
+              <w:bottom w:type="dxa" w:w="50"/>
+              <w:right w:type="dxa" w:w="80"/>
+            </w:tcMar>
+          </w:tcPr>
+          <w:p>
+            <w:r>
+              <w:rPr>
+                <w:b w:val="false"/>
+                <w:bCs w:val="false"/>
+                <w:i w:val="false"/>
+                <w:iCs w:val="false"/>
                 <w:sz w:val="20"/>
                 <w:szCs w:val="20"/>
               </w:rPr>
@@ -670,23 +693,25 @@
           <w:tcPr>
             <w:tcW w:type="dxa" w:w="3560"/>
             <w:tcBorders>
-              <w:top w:val="single" w:color="808080" w:sz="4"/>
-              <w:left w:val="single" w:color="808080" w:sz="4"/>
-              <w:bottom w:val="single" w:color="808080" w:sz="4"/>
-              <w:right w:val="single" w:color="808080" w:sz="4"/>
-            </w:tcBorders>
-            <w:tcMar>
-              <w:top w:type="dxa" w:w="60"/>
-              <w:left w:type="dxa" w:w="100"/>
-              <w:bottom w:type="dxa" w:w="60"/>
-              <w:right w:type="dxa" w:w="100"/>
-            </w:tcMar>
-          </w:tcPr>
-          <w:p>
-            <w:r>
-              <w:rPr>
-                <w:b w:val="false"/>
-                <w:bCs w:val="false"/>
+              <w:top w:val="none" w:color="FFFFFF" w:sz="0"/>
+              <w:left w:val="none" w:color="FFFFFF" w:sz="0"/>
+              <w:bottom w:val="none" w:color="FFFFFF" w:sz="0"/>
+              <w:right w:val="none" w:color="FFFFFF" w:sz="0"/>
+            </w:tcBorders>
+            <w:tcMar>
+              <w:top w:type="dxa" w:w="50"/>
+              <w:left w:type="dxa" w:w="80"/>
+              <w:bottom w:type="dxa" w:w="50"/>
+              <w:right w:type="dxa" w:w="80"/>
+            </w:tcMar>
+          </w:tcPr>
+          <w:p>
+            <w:r>
+              <w:rPr>
+                <w:b w:val="false"/>
+                <w:bCs w:val="false"/>
+                <w:i w:val="false"/>
+                <w:iCs w:val="false"/>
                 <w:sz w:val="20"/>
                 <w:szCs w:val="20"/>
               </w:rPr>
@@ -704,23 +729,25 @@
           <w:tcPr>
             <w:tcW w:type="dxa" w:w="2900"/>
             <w:tcBorders>
-              <w:top w:val="single" w:color="808080" w:sz="4"/>
-              <w:left w:val="single" w:color="808080" w:sz="4"/>
-              <w:bottom w:val="single" w:color="808080" w:sz="4"/>
-              <w:right w:val="single" w:color="808080" w:sz="4"/>
-            </w:tcBorders>
-            <w:tcMar>
-              <w:top w:type="dxa" w:w="60"/>
-              <w:left w:type="dxa" w:w="100"/>
-              <w:bottom w:type="dxa" w:w="60"/>
-              <w:right w:type="dxa" w:w="100"/>
-            </w:tcMar>
-          </w:tcPr>
-          <w:p>
-            <w:r>
-              <w:rPr>
-                <w:b w:val="false"/>
-                <w:bCs w:val="false"/>
+              <w:top w:val="none" w:color="FFFFFF" w:sz="0"/>
+              <w:left w:val="none" w:color="FFFFFF" w:sz="0"/>
+              <w:bottom w:val="none" w:color="FFFFFF" w:sz="0"/>
+              <w:right w:val="none" w:color="FFFFFF" w:sz="0"/>
+            </w:tcBorders>
+            <w:tcMar>
+              <w:top w:type="dxa" w:w="50"/>
+              <w:left w:type="dxa" w:w="80"/>
+              <w:bottom w:type="dxa" w:w="50"/>
+              <w:right w:type="dxa" w:w="80"/>
+            </w:tcMar>
+          </w:tcPr>
+          <w:p>
+            <w:r>
+              <w:rPr>
+                <w:b w:val="false"/>
+                <w:bCs w:val="false"/>
+                <w:i w:val="false"/>
+                <w:iCs w:val="false"/>
                 <w:sz w:val="20"/>
                 <w:szCs w:val="20"/>
               </w:rPr>
@@ -732,23 +759,25 @@
           <w:tcPr>
             <w:tcW w:type="dxa" w:w="2900"/>
             <w:tcBorders>
-              <w:top w:val="single" w:color="808080" w:sz="4"/>
-              <w:left w:val="single" w:color="808080" w:sz="4"/>
-              <w:bottom w:val="single" w:color="808080" w:sz="4"/>
-              <w:right w:val="single" w:color="808080" w:sz="4"/>
-            </w:tcBorders>
-            <w:tcMar>
-              <w:top w:type="dxa" w:w="60"/>
-              <w:left w:type="dxa" w:w="100"/>
-              <w:bottom w:type="dxa" w:w="60"/>
-              <w:right w:type="dxa" w:w="100"/>
-            </w:tcMar>
-          </w:tcPr>
-          <w:p>
-            <w:r>
-              <w:rPr>
-                <w:b w:val="false"/>
-                <w:bCs w:val="false"/>
+              <w:top w:val="none" w:color="FFFFFF" w:sz="0"/>
+              <w:left w:val="none" w:color="FFFFFF" w:sz="0"/>
+              <w:bottom w:val="none" w:color="FFFFFF" w:sz="0"/>
+              <w:right w:val="none" w:color="FFFFFF" w:sz="0"/>
+            </w:tcBorders>
+            <w:tcMar>
+              <w:top w:type="dxa" w:w="50"/>
+              <w:left w:type="dxa" w:w="80"/>
+              <w:bottom w:type="dxa" w:w="50"/>
+              <w:right w:type="dxa" w:w="80"/>
+            </w:tcMar>
+          </w:tcPr>
+          <w:p>
+            <w:r>
+              <w:rPr>
+                <w:b w:val="false"/>
+                <w:bCs w:val="false"/>
+                <w:i w:val="false"/>
+                <w:iCs w:val="false"/>
                 <w:sz w:val="20"/>
                 <w:szCs w:val="20"/>
               </w:rPr>
@@ -760,23 +789,25 @@
           <w:tcPr>
             <w:tcW w:type="dxa" w:w="3560"/>
             <w:tcBorders>
-              <w:top w:val="single" w:color="808080" w:sz="4"/>
-              <w:left w:val="single" w:color="808080" w:sz="4"/>
-              <w:bottom w:val="single" w:color="808080" w:sz="4"/>
-              <w:right w:val="single" w:color="808080" w:sz="4"/>
-            </w:tcBorders>
-            <w:tcMar>
-              <w:top w:type="dxa" w:w="60"/>
-              <w:left w:type="dxa" w:w="100"/>
-              <w:bottom w:type="dxa" w:w="60"/>
-              <w:right w:type="dxa" w:w="100"/>
-            </w:tcMar>
-          </w:tcPr>
-          <w:p>
-            <w:r>
-              <w:rPr>
-                <w:b w:val="false"/>
-                <w:bCs w:val="false"/>
+              <w:top w:val="none" w:color="FFFFFF" w:sz="0"/>
+              <w:left w:val="none" w:color="FFFFFF" w:sz="0"/>
+              <w:bottom w:val="none" w:color="FFFFFF" w:sz="0"/>
+              <w:right w:val="none" w:color="FFFFFF" w:sz="0"/>
+            </w:tcBorders>
+            <w:tcMar>
+              <w:top w:type="dxa" w:w="50"/>
+              <w:left w:type="dxa" w:w="80"/>
+              <w:bottom w:type="dxa" w:w="50"/>
+              <w:right w:type="dxa" w:w="80"/>
+            </w:tcMar>
+          </w:tcPr>
+          <w:p>
+            <w:r>
+              <w:rPr>
+                <w:b w:val="false"/>
+                <w:bCs w:val="false"/>
+                <w:i w:val="false"/>
+                <w:iCs w:val="false"/>
                 <w:sz w:val="20"/>
                 <w:szCs w:val="20"/>
               </w:rPr>
@@ -794,23 +825,25 @@
           <w:tcPr>
             <w:tcW w:type="dxa" w:w="2900"/>
             <w:tcBorders>
-              <w:top w:val="single" w:color="808080" w:sz="4"/>
-              <w:left w:val="single" w:color="808080" w:sz="4"/>
-              <w:bottom w:val="single" w:color="808080" w:sz="4"/>
-              <w:right w:val="single" w:color="808080" w:sz="4"/>
-            </w:tcBorders>
-            <w:tcMar>
-              <w:top w:type="dxa" w:w="60"/>
-              <w:left w:type="dxa" w:w="100"/>
-              <w:bottom w:type="dxa" w:w="60"/>
-              <w:right w:type="dxa" w:w="100"/>
-            </w:tcMar>
-          </w:tcPr>
-          <w:p>
-            <w:r>
-              <w:rPr>
-                <w:b w:val="false"/>
-                <w:bCs w:val="false"/>
+              <w:top w:val="none" w:color="FFFFFF" w:sz="0"/>
+              <w:left w:val="none" w:color="FFFFFF" w:sz="0"/>
+              <w:bottom w:val="none" w:color="FFFFFF" w:sz="0"/>
+              <w:right w:val="none" w:color="FFFFFF" w:sz="0"/>
+            </w:tcBorders>
+            <w:tcMar>
+              <w:top w:type="dxa" w:w="50"/>
+              <w:left w:type="dxa" w:w="80"/>
+              <w:bottom w:type="dxa" w:w="50"/>
+              <w:right w:type="dxa" w:w="80"/>
+            </w:tcMar>
+          </w:tcPr>
+          <w:p>
+            <w:r>
+              <w:rPr>
+                <w:b w:val="false"/>
+                <w:bCs w:val="false"/>
+                <w:i w:val="false"/>
+                <w:iCs w:val="false"/>
                 <w:sz w:val="20"/>
                 <w:szCs w:val="20"/>
               </w:rPr>
@@ -822,23 +855,25 @@
           <w:tcPr>
             <w:tcW w:type="dxa" w:w="2900"/>
             <w:tcBorders>
-              <w:top w:val="single" w:color="808080" w:sz="4"/>
-              <w:left w:val="single" w:color="808080" w:sz="4"/>
-              <w:bottom w:val="single" w:color="808080" w:sz="4"/>
-              <w:right w:val="single" w:color="808080" w:sz="4"/>
-            </w:tcBorders>
-            <w:tcMar>
-              <w:top w:type="dxa" w:w="60"/>
-              <w:left w:type="dxa" w:w="100"/>
-              <w:bottom w:type="dxa" w:w="60"/>
-              <w:right w:type="dxa" w:w="100"/>
-            </w:tcMar>
-          </w:tcPr>
-          <w:p>
-            <w:r>
-              <w:rPr>
-                <w:b w:val="false"/>
-                <w:bCs w:val="false"/>
+              <w:top w:val="none" w:color="FFFFFF" w:sz="0"/>
+              <w:left w:val="none" w:color="FFFFFF" w:sz="0"/>
+              <w:bottom w:val="none" w:color="FFFFFF" w:sz="0"/>
+              <w:right w:val="none" w:color="FFFFFF" w:sz="0"/>
+            </w:tcBorders>
+            <w:tcMar>
+              <w:top w:type="dxa" w:w="50"/>
+              <w:left w:type="dxa" w:w="80"/>
+              <w:bottom w:type="dxa" w:w="50"/>
+              <w:right w:type="dxa" w:w="80"/>
+            </w:tcMar>
+          </w:tcPr>
+          <w:p>
+            <w:r>
+              <w:rPr>
+                <w:b w:val="false"/>
+                <w:bCs w:val="false"/>
+                <w:i w:val="false"/>
+                <w:iCs w:val="false"/>
                 <w:sz w:val="20"/>
                 <w:szCs w:val="20"/>
               </w:rPr>
@@ -850,23 +885,25 @@
           <w:tcPr>
             <w:tcW w:type="dxa" w:w="3560"/>
             <w:tcBorders>
-              <w:top w:val="single" w:color="808080" w:sz="4"/>
-              <w:left w:val="single" w:color="808080" w:sz="4"/>
-              <w:bottom w:val="single" w:color="808080" w:sz="4"/>
-              <w:right w:val="single" w:color="808080" w:sz="4"/>
-            </w:tcBorders>
-            <w:tcMar>
-              <w:top w:type="dxa" w:w="60"/>
-              <w:left w:type="dxa" w:w="100"/>
-              <w:bottom w:type="dxa" w:w="60"/>
-              <w:right w:type="dxa" w:w="100"/>
-            </w:tcMar>
-          </w:tcPr>
-          <w:p>
-            <w:r>
-              <w:rPr>
-                <w:b w:val="false"/>
-                <w:bCs w:val="false"/>
+              <w:top w:val="none" w:color="FFFFFF" w:sz="0"/>
+              <w:left w:val="none" w:color="FFFFFF" w:sz="0"/>
+              <w:bottom w:val="none" w:color="FFFFFF" w:sz="0"/>
+              <w:right w:val="none" w:color="FFFFFF" w:sz="0"/>
+            </w:tcBorders>
+            <w:tcMar>
+              <w:top w:type="dxa" w:w="50"/>
+              <w:left w:type="dxa" w:w="80"/>
+              <w:bottom w:type="dxa" w:w="50"/>
+              <w:right w:type="dxa" w:w="80"/>
+            </w:tcMar>
+          </w:tcPr>
+          <w:p>
+            <w:r>
+              <w:rPr>
+                <w:b w:val="false"/>
+                <w:bCs w:val="false"/>
+                <w:i w:val="false"/>
+                <w:iCs w:val="false"/>
                 <w:sz w:val="20"/>
                 <w:szCs w:val="20"/>
               </w:rPr>
@@ -884,23 +921,25 @@
           <w:tcPr>
             <w:tcW w:type="dxa" w:w="2900"/>
             <w:tcBorders>
-              <w:top w:val="single" w:color="808080" w:sz="4"/>
-              <w:left w:val="single" w:color="808080" w:sz="4"/>
-              <w:bottom w:val="single" w:color="808080" w:sz="4"/>
-              <w:right w:val="single" w:color="808080" w:sz="4"/>
-            </w:tcBorders>
-            <w:tcMar>
-              <w:top w:type="dxa" w:w="60"/>
-              <w:left w:type="dxa" w:w="100"/>
-              <w:bottom w:type="dxa" w:w="60"/>
-              <w:right w:type="dxa" w:w="100"/>
-            </w:tcMar>
-          </w:tcPr>
-          <w:p>
-            <w:r>
-              <w:rPr>
-                <w:b w:val="false"/>
-                <w:bCs w:val="false"/>
+              <w:top w:val="none" w:color="FFFFFF" w:sz="0"/>
+              <w:left w:val="none" w:color="FFFFFF" w:sz="0"/>
+              <w:bottom w:val="single" w:color="000000" w:sz="12"/>
+              <w:right w:val="none" w:color="FFFFFF" w:sz="0"/>
+            </w:tcBorders>
+            <w:tcMar>
+              <w:top w:type="dxa" w:w="50"/>
+              <w:left w:type="dxa" w:w="80"/>
+              <w:bottom w:type="dxa" w:w="50"/>
+              <w:right w:type="dxa" w:w="80"/>
+            </w:tcMar>
+          </w:tcPr>
+          <w:p>
+            <w:r>
+              <w:rPr>
+                <w:b w:val="false"/>
+                <w:bCs w:val="false"/>
+                <w:i w:val="false"/>
+                <w:iCs w:val="false"/>
                 <w:sz w:val="20"/>
                 <w:szCs w:val="20"/>
               </w:rPr>
@@ -912,23 +951,25 @@
           <w:tcPr>
             <w:tcW w:type="dxa" w:w="2900"/>
             <w:tcBorders>
-              <w:top w:val="single" w:color="808080" w:sz="4"/>
-              <w:left w:val="single" w:color="808080" w:sz="4"/>
-              <w:bottom w:val="single" w:color="808080" w:sz="4"/>
-              <w:right w:val="single" w:color="808080" w:sz="4"/>
-            </w:tcBorders>
-            <w:tcMar>
-              <w:top w:type="dxa" w:w="60"/>
-              <w:left w:type="dxa" w:w="100"/>
-              <w:bottom w:type="dxa" w:w="60"/>
-              <w:right w:type="dxa" w:w="100"/>
-            </w:tcMar>
-          </w:tcPr>
-          <w:p>
-            <w:r>
-              <w:rPr>
-                <w:b w:val="false"/>
-                <w:bCs w:val="false"/>
+              <w:top w:val="none" w:color="FFFFFF" w:sz="0"/>
+              <w:left w:val="none" w:color="FFFFFF" w:sz="0"/>
+              <w:bottom w:val="single" w:color="000000" w:sz="12"/>
+              <w:right w:val="none" w:color="FFFFFF" w:sz="0"/>
+            </w:tcBorders>
+            <w:tcMar>
+              <w:top w:type="dxa" w:w="50"/>
+              <w:left w:type="dxa" w:w="80"/>
+              <w:bottom w:type="dxa" w:w="50"/>
+              <w:right w:type="dxa" w:w="80"/>
+            </w:tcMar>
+          </w:tcPr>
+          <w:p>
+            <w:r>
+              <w:rPr>
+                <w:b w:val="false"/>
+                <w:bCs w:val="false"/>
+                <w:i w:val="false"/>
+                <w:iCs w:val="false"/>
                 <w:sz w:val="20"/>
                 <w:szCs w:val="20"/>
               </w:rPr>
@@ -940,23 +981,25 @@
           <w:tcPr>
             <w:tcW w:type="dxa" w:w="3560"/>
             <w:tcBorders>
-              <w:top w:val="single" w:color="808080" w:sz="4"/>
-              <w:left w:val="single" w:color="808080" w:sz="4"/>
-              <w:bottom w:val="single" w:color="808080" w:sz="4"/>
-              <w:right w:val="single" w:color="808080" w:sz="4"/>
-            </w:tcBorders>
-            <w:tcMar>
-              <w:top w:type="dxa" w:w="60"/>
-              <w:left w:type="dxa" w:w="100"/>
-              <w:bottom w:type="dxa" w:w="60"/>
-              <w:right w:type="dxa" w:w="100"/>
-            </w:tcMar>
-          </w:tcPr>
-          <w:p>
-            <w:r>
-              <w:rPr>
-                <w:b w:val="false"/>
-                <w:bCs w:val="false"/>
+              <w:top w:val="none" w:color="FFFFFF" w:sz="0"/>
+              <w:left w:val="none" w:color="FFFFFF" w:sz="0"/>
+              <w:bottom w:val="single" w:color="000000" w:sz="12"/>
+              <w:right w:val="none" w:color="FFFFFF" w:sz="0"/>
+            </w:tcBorders>
+            <w:tcMar>
+              <w:top w:type="dxa" w:w="50"/>
+              <w:left w:type="dxa" w:w="80"/>
+              <w:bottom w:type="dxa" w:w="50"/>
+              <w:right w:type="dxa" w:w="80"/>
+            </w:tcMar>
+          </w:tcPr>
+          <w:p>
+            <w:r>
+              <w:rPr>
+                <w:b w:val="false"/>
+                <w:bCs w:val="false"/>
+                <w:i w:val="false"/>
+                <w:iCs w:val="false"/>
                 <w:sz w:val="20"/>
                 <w:szCs w:val="20"/>
               </w:rPr>
@@ -978,7 +1021,7 @@
         <w:jc w:val="both"/>
       </w:pPr>
       <w:r>
-        <w:t xml:space="preserve">Figure 3 shows how the device is used at a service counter. The camera and touchscreen face the Deaf user, while the speaker and microphone face the hearing staff member. MediaPipe [5] extracts body, hand and face landmarks from each camera frame. In natural signing, signs flow into each other with minimal pauses, and segmenting them automatically is still an open research problem [7]. The user therefore signs one sign at a time and returns the hands to a rest position between signs, and the device uses this rest pose to mark where each sign ends. A lightweight landmark-based model, following the 1D-CNN and transformer design of [6], classifies each sign and outputs its five most likely labels with confidence scores. The model will be trained on the ASL Citizen dataset [2] and evaluated on its signer-independent test split and on recordings from our own test users.</w:t>
+        <w:t xml:space="preserve">Figure 2 shows how the device is used at a service counter. The camera and touchscreen face the Deaf user, while the speaker and microphone face the hearing staff member. MediaPipe [5] extracts body, hand and face landmarks from each camera frame. In natural signing, signs flow into each other with minimal pauses, and segmenting them automatically is still an open research problem [7]. The user therefore signs one sign at a time and returns the hands to a rest position between signs, and the device uses this rest pose to mark where each sign ends. A lightweight landmark-based model, following the 1D-CNN and transformer design of [6], classifies each sign and outputs its five most likely labels with confidence scores. The model will be trained on the ASL Citizen dataset [2] and evaluated on its signer-independent test split and on recordings from our own test users.</w:t>
       </w:r>
     </w:p>
     <w:p>
@@ -990,9 +1033,9 @@
       <w:r>
         <w:drawing>
           <wp:inline distT="0" distB="0" distL="0" distR="0">
-            <wp:extent cx="5669280" cy="2638425"/>
+            <wp:extent cx="5120640" cy="2952750"/>
             <wp:effectExtent t="0" r="0" b="0" l="0"/>
-            <wp:docPr id="1" name="Figure 3." descr="The proposed device in use at a service counter (side view). The camera and touchscreen face the Deaf user; the speaker and microphone face the hearing staff member. All processing runs on the Jetson Orin Nano inside the base, without a network connection." title="Figure 3."/>
+            <wp:docPr id="1" name="Figure 2." descr="The proposed device in use at a service counter (side view). The camera and touchscreen face the Deaf user; the speaker and microphone face the hearing staff member. All processing runs on the Jetson Orin Nano inside the base, without a network connection." title="Figure 2."/>
             <wp:cNvGraphicFramePr>
               <a:graphicFrameLocks xmlns:a="http://schemas.openxmlformats.org/drawingml/2006/main" noChangeAspect="1"/>
             </wp:cNvGraphicFramePr>
@@ -1006,7 +1049,7 @@
                     </pic:cNvPicPr>
                   </pic:nvPicPr>
                   <pic:blipFill>
-                    <a:blip r:embed="rId7" cstate="none"/>
+                    <a:blip r:embed="rId8" cstate="none"/>
                     <a:srcRect/>
                     <a:stretch>
                       <a:fillRect/>
@@ -1015,7 +1058,7 @@
                   <pic:spPr bwMode="auto">
                     <a:xfrm>
                       <a:off x="0" y="0"/>
-                      <a:ext cx="5669280" cy="2638425"/>
+                      <a:ext cx="5120640" cy="2952750"/>
                     </a:xfrm>
                     <a:prstGeom prst="rect">
                       <a:avLst/>
@@ -1041,7 +1084,7 @@
           <w:sz w:val="20"/>
           <w:szCs w:val="20"/>
         </w:rPr>
-        <w:t xml:space="preserve">Figure 3. </w:t>
+        <w:t xml:space="preserve">Figure 2. </w:t>
       </w:r>
       <w:r>
         <w:rPr>
@@ -1088,7 +1131,7 @@
         <w:jc w:val="both"/>
       </w:pPr>
       <w:r>
-        <w:t xml:space="preserve">No automatic ASL translation system is yet reliable enough for general use [1]. The best-known commercial effort, SignAll, combines multiple cameras with natural language processing to translate ASL into English text [15]. Patents show several other approaches, summarized in Table 1: multiple cameras with a depth sensor [16], single-camera recognition with cloud processing [17], sensor gloves [18], and an earlier glove- or camera-based system with speech output [19]. The closest to our design is Sign-Speak's system [17]. Like ours, it works from a single camera and, in one embodiment, lets the user choose among the three most likely translations. As Figure 4 shows, however, its recognition runs on a remote server, so it needs a network connection and sends the user's data off the device. Our device differs from all four in combining single-camera input, fully offline processing on an embedded GPU, confidence-gated output and speech in several languages. It is also a form factor the Deaf community is open to: 69% of the participants in [1] were comfortable using a stand-alone system of this kind, compared with 38% for wearables.</w:t>
+        <w:t xml:space="preserve">No automatic ASL translation system is yet reliable enough for general use [1]. The best-known commercial effort, SignAll, combines multiple cameras with natural language processing to translate ASL into English text [15]. Patents show several other approaches, summarized in Table 2: multiple cameras with a depth sensor [16], single-camera recognition with cloud processing [17], sensor gloves [18], and an earlier glove- or camera-based system with speech output [19]. The closest to our design is Sign-Speak's system [17]. Like ours, it works from a single camera and, in one embodiment, lets the user choose among the three most likely translations. As Figure 3 shows, however, its recognition runs on a remote server, so it needs a network connection and sends the user's data off the device. Our device differs from all four in combining single-camera input, fully offline processing on an embedded GPU, confidence-gated output and speech in several languages. It is also a form factor the Deaf community is open to: 69% of the participants in [1] were comfortable using a stand-alone system of this kind, compared with 38% for wearables.</w:t>
       </w:r>
     </w:p>
     <w:p>
@@ -1104,7 +1147,7 @@
           <w:sz w:val="20"/>
           <w:szCs w:val="20"/>
         </w:rPr>
-        <w:t xml:space="preserve">Table 1. </w:t>
+        <w:t xml:space="preserve">Table 2. </w:t>
       </w:r>
       <w:r>
         <w:rPr>
@@ -1141,17 +1184,16 @@
           <w:tcPr>
             <w:tcW w:type="dxa" w:w="1700"/>
             <w:tcBorders>
-              <w:top w:val="single" w:color="808080" w:sz="4"/>
-              <w:left w:val="single" w:color="808080" w:sz="4"/>
-              <w:bottom w:val="single" w:color="808080" w:sz="4"/>
-              <w:right w:val="single" w:color="808080" w:sz="4"/>
-            </w:tcBorders>
-            <w:shd w:fill="E7E6E6" w:color="auto" w:val="clear"/>
-            <w:tcMar>
-              <w:top w:type="dxa" w:w="60"/>
-              <w:left w:type="dxa" w:w="100"/>
-              <w:bottom w:type="dxa" w:w="60"/>
-              <w:right w:type="dxa" w:w="100"/>
+              <w:top w:val="single" w:color="000000" w:sz="12"/>
+              <w:left w:val="none" w:color="FFFFFF" w:sz="0"/>
+              <w:bottom w:val="single" w:color="000000" w:sz="4"/>
+              <w:right w:val="none" w:color="FFFFFF" w:sz="0"/>
+            </w:tcBorders>
+            <w:tcMar>
+              <w:top w:type="dxa" w:w="80"/>
+              <w:left w:type="dxa" w:w="80"/>
+              <w:bottom w:type="dxa" w:w="80"/>
+              <w:right w:type="dxa" w:w="80"/>
             </w:tcMar>
           </w:tcPr>
           <w:p>
@@ -1159,6 +1201,8 @@
               <w:rPr>
                 <w:b/>
                 <w:bCs/>
+                <w:i w:val="false"/>
+                <w:iCs w:val="false"/>
                 <w:sz w:val="20"/>
                 <w:szCs w:val="20"/>
               </w:rPr>
@@ -1170,17 +1214,16 @@
           <w:tcPr>
             <w:tcW w:type="dxa" w:w="2100"/>
             <w:tcBorders>
-              <w:top w:val="single" w:color="808080" w:sz="4"/>
-              <w:left w:val="single" w:color="808080" w:sz="4"/>
-              <w:bottom w:val="single" w:color="808080" w:sz="4"/>
-              <w:right w:val="single" w:color="808080" w:sz="4"/>
-            </w:tcBorders>
-            <w:shd w:fill="E7E6E6" w:color="auto" w:val="clear"/>
-            <w:tcMar>
-              <w:top w:type="dxa" w:w="60"/>
-              <w:left w:type="dxa" w:w="100"/>
-              <w:bottom w:type="dxa" w:w="60"/>
-              <w:right w:type="dxa" w:w="100"/>
+              <w:top w:val="single" w:color="000000" w:sz="12"/>
+              <w:left w:val="none" w:color="FFFFFF" w:sz="0"/>
+              <w:bottom w:val="single" w:color="000000" w:sz="4"/>
+              <w:right w:val="none" w:color="FFFFFF" w:sz="0"/>
+            </w:tcBorders>
+            <w:tcMar>
+              <w:top w:type="dxa" w:w="80"/>
+              <w:left w:type="dxa" w:w="80"/>
+              <w:bottom w:type="dxa" w:w="80"/>
+              <w:right w:type="dxa" w:w="80"/>
             </w:tcMar>
           </w:tcPr>
           <w:p>
@@ -1188,6 +1231,8 @@
               <w:rPr>
                 <w:b/>
                 <w:bCs/>
+                <w:i w:val="false"/>
+                <w:iCs w:val="false"/>
                 <w:sz w:val="20"/>
                 <w:szCs w:val="20"/>
               </w:rPr>
@@ -1199,17 +1244,16 @@
           <w:tcPr>
             <w:tcW w:type="dxa" w:w="1900"/>
             <w:tcBorders>
-              <w:top w:val="single" w:color="808080" w:sz="4"/>
-              <w:left w:val="single" w:color="808080" w:sz="4"/>
-              <w:bottom w:val="single" w:color="808080" w:sz="4"/>
-              <w:right w:val="single" w:color="808080" w:sz="4"/>
-            </w:tcBorders>
-            <w:shd w:fill="E7E6E6" w:color="auto" w:val="clear"/>
-            <w:tcMar>
-              <w:top w:type="dxa" w:w="60"/>
-              <w:left w:type="dxa" w:w="100"/>
-              <w:bottom w:type="dxa" w:w="60"/>
-              <w:right w:type="dxa" w:w="100"/>
+              <w:top w:val="single" w:color="000000" w:sz="12"/>
+              <w:left w:val="none" w:color="FFFFFF" w:sz="0"/>
+              <w:bottom w:val="single" w:color="000000" w:sz="4"/>
+              <w:right w:val="none" w:color="FFFFFF" w:sz="0"/>
+            </w:tcBorders>
+            <w:tcMar>
+              <w:top w:type="dxa" w:w="80"/>
+              <w:left w:type="dxa" w:w="80"/>
+              <w:bottom w:type="dxa" w:w="80"/>
+              <w:right w:type="dxa" w:w="80"/>
             </w:tcMar>
           </w:tcPr>
           <w:p>
@@ -1217,6 +1261,8 @@
               <w:rPr>
                 <w:b/>
                 <w:bCs/>
+                <w:i w:val="false"/>
+                <w:iCs w:val="false"/>
                 <w:sz w:val="20"/>
                 <w:szCs w:val="20"/>
               </w:rPr>
@@ -1228,17 +1274,16 @@
           <w:tcPr>
             <w:tcW w:type="dxa" w:w="3660"/>
             <w:tcBorders>
-              <w:top w:val="single" w:color="808080" w:sz="4"/>
-              <w:left w:val="single" w:color="808080" w:sz="4"/>
-              <w:bottom w:val="single" w:color="808080" w:sz="4"/>
-              <w:right w:val="single" w:color="808080" w:sz="4"/>
-            </w:tcBorders>
-            <w:shd w:fill="E7E6E6" w:color="auto" w:val="clear"/>
-            <w:tcMar>
-              <w:top w:type="dxa" w:w="60"/>
-              <w:left w:type="dxa" w:w="100"/>
-              <w:bottom w:type="dxa" w:w="60"/>
-              <w:right w:type="dxa" w:w="100"/>
+              <w:top w:val="single" w:color="000000" w:sz="12"/>
+              <w:left w:val="none" w:color="FFFFFF" w:sz="0"/>
+              <w:bottom w:val="single" w:color="000000" w:sz="4"/>
+              <w:right w:val="none" w:color="FFFFFF" w:sz="0"/>
+            </w:tcBorders>
+            <w:tcMar>
+              <w:top w:type="dxa" w:w="80"/>
+              <w:left w:type="dxa" w:w="80"/>
+              <w:bottom w:type="dxa" w:w="80"/>
+              <w:right w:type="dxa" w:w="80"/>
             </w:tcMar>
           </w:tcPr>
           <w:p>
@@ -1246,6 +1291,8 @@
               <w:rPr>
                 <w:b/>
                 <w:bCs/>
+                <w:i w:val="false"/>
+                <w:iCs w:val="false"/>
                 <w:sz w:val="20"/>
                 <w:szCs w:val="20"/>
               </w:rPr>
@@ -1263,23 +1310,25 @@
           <w:tcPr>
             <w:tcW w:type="dxa" w:w="1700"/>
             <w:tcBorders>
-              <w:top w:val="single" w:color="808080" w:sz="4"/>
-              <w:left w:val="single" w:color="808080" w:sz="4"/>
-              <w:bottom w:val="single" w:color="808080" w:sz="4"/>
-              <w:right w:val="single" w:color="808080" w:sz="4"/>
-            </w:tcBorders>
-            <w:tcMar>
-              <w:top w:type="dxa" w:w="60"/>
-              <w:left w:type="dxa" w:w="100"/>
-              <w:bottom w:type="dxa" w:w="60"/>
-              <w:right w:type="dxa" w:w="100"/>
-            </w:tcMar>
-          </w:tcPr>
-          <w:p>
-            <w:r>
-              <w:rPr>
-                <w:b w:val="false"/>
-                <w:bCs w:val="false"/>
+              <w:top w:val="single" w:color="000000" w:sz="4"/>
+              <w:left w:val="none" w:color="FFFFFF" w:sz="0"/>
+              <w:bottom w:val="none" w:color="FFFFFF" w:sz="0"/>
+              <w:right w:val="none" w:color="FFFFFF" w:sz="0"/>
+            </w:tcBorders>
+            <w:tcMar>
+              <w:top w:type="dxa" w:w="50"/>
+              <w:left w:type="dxa" w:w="80"/>
+              <w:bottom w:type="dxa" w:w="50"/>
+              <w:right w:type="dxa" w:w="80"/>
+            </w:tcMar>
+          </w:tcPr>
+          <w:p>
+            <w:r>
+              <w:rPr>
+                <w:b w:val="false"/>
+                <w:bCs w:val="false"/>
+                <w:i w:val="false"/>
+                <w:iCs w:val="false"/>
                 <w:sz w:val="20"/>
                 <w:szCs w:val="20"/>
               </w:rPr>
@@ -1291,23 +1340,25 @@
           <w:tcPr>
             <w:tcW w:type="dxa" w:w="2100"/>
             <w:tcBorders>
-              <w:top w:val="single" w:color="808080" w:sz="4"/>
-              <w:left w:val="single" w:color="808080" w:sz="4"/>
-              <w:bottom w:val="single" w:color="808080" w:sz="4"/>
-              <w:right w:val="single" w:color="808080" w:sz="4"/>
-            </w:tcBorders>
-            <w:tcMar>
-              <w:top w:type="dxa" w:w="60"/>
-              <w:left w:type="dxa" w:w="100"/>
-              <w:bottom w:type="dxa" w:w="60"/>
-              <w:right w:type="dxa" w:w="100"/>
-            </w:tcMar>
-          </w:tcPr>
-          <w:p>
-            <w:r>
-              <w:rPr>
-                <w:b w:val="false"/>
-                <w:bCs w:val="false"/>
+              <w:top w:val="single" w:color="000000" w:sz="4"/>
+              <w:left w:val="none" w:color="FFFFFF" w:sz="0"/>
+              <w:bottom w:val="none" w:color="FFFFFF" w:sz="0"/>
+              <w:right w:val="none" w:color="FFFFFF" w:sz="0"/>
+            </w:tcBorders>
+            <w:tcMar>
+              <w:top w:type="dxa" w:w="50"/>
+              <w:left w:type="dxa" w:w="80"/>
+              <w:bottom w:type="dxa" w:w="50"/>
+              <w:right w:type="dxa" w:w="80"/>
+            </w:tcMar>
+          </w:tcPr>
+          <w:p>
+            <w:r>
+              <w:rPr>
+                <w:b w:val="false"/>
+                <w:bCs w:val="false"/>
+                <w:i w:val="false"/>
+                <w:iCs w:val="false"/>
                 <w:sz w:val="20"/>
                 <w:szCs w:val="20"/>
               </w:rPr>
@@ -1319,23 +1370,25 @@
           <w:tcPr>
             <w:tcW w:type="dxa" w:w="1900"/>
             <w:tcBorders>
-              <w:top w:val="single" w:color="808080" w:sz="4"/>
-              <w:left w:val="single" w:color="808080" w:sz="4"/>
-              <w:bottom w:val="single" w:color="808080" w:sz="4"/>
-              <w:right w:val="single" w:color="808080" w:sz="4"/>
-            </w:tcBorders>
-            <w:tcMar>
-              <w:top w:type="dxa" w:w="60"/>
-              <w:left w:type="dxa" w:w="100"/>
-              <w:bottom w:type="dxa" w:w="60"/>
-              <w:right w:type="dxa" w:w="100"/>
-            </w:tcMar>
-          </w:tcPr>
-          <w:p>
-            <w:r>
-              <w:rPr>
-                <w:b w:val="false"/>
-                <w:bCs w:val="false"/>
+              <w:top w:val="single" w:color="000000" w:sz="4"/>
+              <w:left w:val="none" w:color="FFFFFF" w:sz="0"/>
+              <w:bottom w:val="none" w:color="FFFFFF" w:sz="0"/>
+              <w:right w:val="none" w:color="FFFFFF" w:sz="0"/>
+            </w:tcBorders>
+            <w:tcMar>
+              <w:top w:type="dxa" w:w="50"/>
+              <w:left w:type="dxa" w:w="80"/>
+              <w:bottom w:type="dxa" w:w="50"/>
+              <w:right w:type="dxa" w:w="80"/>
+            </w:tcMar>
+          </w:tcPr>
+          <w:p>
+            <w:r>
+              <w:rPr>
+                <w:b w:val="false"/>
+                <w:bCs w:val="false"/>
+                <w:i w:val="false"/>
+                <w:iCs w:val="false"/>
                 <w:sz w:val="20"/>
                 <w:szCs w:val="20"/>
               </w:rPr>
@@ -1347,23 +1400,25 @@
           <w:tcPr>
             <w:tcW w:type="dxa" w:w="3660"/>
             <w:tcBorders>
-              <w:top w:val="single" w:color="808080" w:sz="4"/>
-              <w:left w:val="single" w:color="808080" w:sz="4"/>
-              <w:bottom w:val="single" w:color="808080" w:sz="4"/>
-              <w:right w:val="single" w:color="808080" w:sz="4"/>
-            </w:tcBorders>
-            <w:tcMar>
-              <w:top w:type="dxa" w:w="60"/>
-              <w:left w:type="dxa" w:w="100"/>
-              <w:bottom w:type="dxa" w:w="60"/>
-              <w:right w:type="dxa" w:w="100"/>
-            </w:tcMar>
-          </w:tcPr>
-          <w:p>
-            <w:r>
-              <w:rPr>
-                <w:b w:val="false"/>
-                <w:bCs w:val="false"/>
+              <w:top w:val="single" w:color="000000" w:sz="4"/>
+              <w:left w:val="none" w:color="FFFFFF" w:sz="0"/>
+              <w:bottom w:val="none" w:color="FFFFFF" w:sz="0"/>
+              <w:right w:val="none" w:color="FFFFFF" w:sz="0"/>
+            </w:tcBorders>
+            <w:tcMar>
+              <w:top w:type="dxa" w:w="50"/>
+              <w:left w:type="dxa" w:w="80"/>
+              <w:bottom w:type="dxa" w:w="50"/>
+              <w:right w:type="dxa" w:w="80"/>
+            </w:tcMar>
+          </w:tcPr>
+          <w:p>
+            <w:r>
+              <w:rPr>
+                <w:b w:val="false"/>
+                <w:bCs w:val="false"/>
+                <w:i w:val="false"/>
+                <w:iCs w:val="false"/>
                 <w:sz w:val="20"/>
                 <w:szCs w:val="20"/>
               </w:rPr>
@@ -1381,23 +1436,25 @@
           <w:tcPr>
             <w:tcW w:type="dxa" w:w="1700"/>
             <w:tcBorders>
-              <w:top w:val="single" w:color="808080" w:sz="4"/>
-              <w:left w:val="single" w:color="808080" w:sz="4"/>
-              <w:bottom w:val="single" w:color="808080" w:sz="4"/>
-              <w:right w:val="single" w:color="808080" w:sz="4"/>
-            </w:tcBorders>
-            <w:tcMar>
-              <w:top w:type="dxa" w:w="60"/>
-              <w:left w:type="dxa" w:w="100"/>
-              <w:bottom w:type="dxa" w:w="60"/>
-              <w:right w:type="dxa" w:w="100"/>
-            </w:tcMar>
-          </w:tcPr>
-          <w:p>
-            <w:r>
-              <w:rPr>
-                <w:b w:val="false"/>
-                <w:bCs w:val="false"/>
+              <w:top w:val="none" w:color="FFFFFF" w:sz="0"/>
+              <w:left w:val="none" w:color="FFFFFF" w:sz="0"/>
+              <w:bottom w:val="none" w:color="FFFFFF" w:sz="0"/>
+              <w:right w:val="none" w:color="FFFFFF" w:sz="0"/>
+            </w:tcBorders>
+            <w:tcMar>
+              <w:top w:type="dxa" w:w="50"/>
+              <w:left w:type="dxa" w:w="80"/>
+              <w:bottom w:type="dxa" w:w="50"/>
+              <w:right w:type="dxa" w:w="80"/>
+            </w:tcMar>
+          </w:tcPr>
+          <w:p>
+            <w:r>
+              <w:rPr>
+                <w:b w:val="false"/>
+                <w:bCs w:val="false"/>
+                <w:i w:val="false"/>
+                <w:iCs w:val="false"/>
                 <w:sz w:val="20"/>
                 <w:szCs w:val="20"/>
               </w:rPr>
@@ -1409,23 +1466,25 @@
           <w:tcPr>
             <w:tcW w:type="dxa" w:w="2100"/>
             <w:tcBorders>
-              <w:top w:val="single" w:color="808080" w:sz="4"/>
-              <w:left w:val="single" w:color="808080" w:sz="4"/>
-              <w:bottom w:val="single" w:color="808080" w:sz="4"/>
-              <w:right w:val="single" w:color="808080" w:sz="4"/>
-            </w:tcBorders>
-            <w:tcMar>
-              <w:top w:type="dxa" w:w="60"/>
-              <w:left w:type="dxa" w:w="100"/>
-              <w:bottom w:type="dxa" w:w="60"/>
-              <w:right w:type="dxa" w:w="100"/>
-            </w:tcMar>
-          </w:tcPr>
-          <w:p>
-            <w:r>
-              <w:rPr>
-                <w:b w:val="false"/>
-                <w:bCs w:val="false"/>
+              <w:top w:val="none" w:color="FFFFFF" w:sz="0"/>
+              <w:left w:val="none" w:color="FFFFFF" w:sz="0"/>
+              <w:bottom w:val="none" w:color="FFFFFF" w:sz="0"/>
+              <w:right w:val="none" w:color="FFFFFF" w:sz="0"/>
+            </w:tcBorders>
+            <w:tcMar>
+              <w:top w:type="dxa" w:w="50"/>
+              <w:left w:type="dxa" w:w="80"/>
+              <w:bottom w:type="dxa" w:w="50"/>
+              <w:right w:type="dxa" w:w="80"/>
+            </w:tcMar>
+          </w:tcPr>
+          <w:p>
+            <w:r>
+              <w:rPr>
+                <w:b w:val="false"/>
+                <w:bCs w:val="false"/>
+                <w:i w:val="false"/>
+                <w:iCs w:val="false"/>
                 <w:sz w:val="20"/>
                 <w:szCs w:val="20"/>
               </w:rPr>
@@ -1437,23 +1496,25 @@
           <w:tcPr>
             <w:tcW w:type="dxa" w:w="1900"/>
             <w:tcBorders>
-              <w:top w:val="single" w:color="808080" w:sz="4"/>
-              <w:left w:val="single" w:color="808080" w:sz="4"/>
-              <w:bottom w:val="single" w:color="808080" w:sz="4"/>
-              <w:right w:val="single" w:color="808080" w:sz="4"/>
-            </w:tcBorders>
-            <w:tcMar>
-              <w:top w:type="dxa" w:w="60"/>
-              <w:left w:type="dxa" w:w="100"/>
-              <w:bottom w:type="dxa" w:w="60"/>
-              <w:right w:type="dxa" w:w="100"/>
-            </w:tcMar>
-          </w:tcPr>
-          <w:p>
-            <w:r>
-              <w:rPr>
-                <w:b w:val="false"/>
-                <w:bCs w:val="false"/>
+              <w:top w:val="none" w:color="FFFFFF" w:sz="0"/>
+              <w:left w:val="none" w:color="FFFFFF" w:sz="0"/>
+              <w:bottom w:val="none" w:color="FFFFFF" w:sz="0"/>
+              <w:right w:val="none" w:color="FFFFFF" w:sz="0"/>
+            </w:tcBorders>
+            <w:tcMar>
+              <w:top w:type="dxa" w:w="50"/>
+              <w:left w:type="dxa" w:w="80"/>
+              <w:bottom w:type="dxa" w:w="50"/>
+              <w:right w:type="dxa" w:w="80"/>
+            </w:tcMar>
+          </w:tcPr>
+          <w:p>
+            <w:r>
+              <w:rPr>
+                <w:b w:val="false"/>
+                <w:bCs w:val="false"/>
+                <w:i w:val="false"/>
+                <w:iCs w:val="false"/>
                 <w:sz w:val="20"/>
                 <w:szCs w:val="20"/>
               </w:rPr>
@@ -1465,23 +1526,25 @@
           <w:tcPr>
             <w:tcW w:type="dxa" w:w="3660"/>
             <w:tcBorders>
-              <w:top w:val="single" w:color="808080" w:sz="4"/>
-              <w:left w:val="single" w:color="808080" w:sz="4"/>
-              <w:bottom w:val="single" w:color="808080" w:sz="4"/>
-              <w:right w:val="single" w:color="808080" w:sz="4"/>
-            </w:tcBorders>
-            <w:tcMar>
-              <w:top w:type="dxa" w:w="60"/>
-              <w:left w:type="dxa" w:w="100"/>
-              <w:bottom w:type="dxa" w:w="60"/>
-              <w:right w:type="dxa" w:w="100"/>
-            </w:tcMar>
-          </w:tcPr>
-          <w:p>
-            <w:r>
-              <w:rPr>
-                <w:b w:val="false"/>
-                <w:bCs w:val="false"/>
+              <w:top w:val="none" w:color="FFFFFF" w:sz="0"/>
+              <w:left w:val="none" w:color="FFFFFF" w:sz="0"/>
+              <w:bottom w:val="none" w:color="FFFFFF" w:sz="0"/>
+              <w:right w:val="none" w:color="FFFFFF" w:sz="0"/>
+            </w:tcBorders>
+            <w:tcMar>
+              <w:top w:type="dxa" w:w="50"/>
+              <w:left w:type="dxa" w:w="80"/>
+              <w:bottom w:type="dxa" w:w="50"/>
+              <w:right w:type="dxa" w:w="80"/>
+            </w:tcMar>
+          </w:tcPr>
+          <w:p>
+            <w:r>
+              <w:rPr>
+                <w:b w:val="false"/>
+                <w:bCs w:val="false"/>
+                <w:i w:val="false"/>
+                <w:iCs w:val="false"/>
                 <w:sz w:val="20"/>
                 <w:szCs w:val="20"/>
               </w:rPr>
@@ -1499,23 +1562,25 @@
           <w:tcPr>
             <w:tcW w:type="dxa" w:w="1700"/>
             <w:tcBorders>
-              <w:top w:val="single" w:color="808080" w:sz="4"/>
-              <w:left w:val="single" w:color="808080" w:sz="4"/>
-              <w:bottom w:val="single" w:color="808080" w:sz="4"/>
-              <w:right w:val="single" w:color="808080" w:sz="4"/>
-            </w:tcBorders>
-            <w:tcMar>
-              <w:top w:type="dxa" w:w="60"/>
-              <w:left w:type="dxa" w:w="100"/>
-              <w:bottom w:type="dxa" w:w="60"/>
-              <w:right w:type="dxa" w:w="100"/>
-            </w:tcMar>
-          </w:tcPr>
-          <w:p>
-            <w:r>
-              <w:rPr>
-                <w:b w:val="false"/>
-                <w:bCs w:val="false"/>
+              <w:top w:val="none" w:color="FFFFFF" w:sz="0"/>
+              <w:left w:val="none" w:color="FFFFFF" w:sz="0"/>
+              <w:bottom w:val="none" w:color="FFFFFF" w:sz="0"/>
+              <w:right w:val="none" w:color="FFFFFF" w:sz="0"/>
+            </w:tcBorders>
+            <w:tcMar>
+              <w:top w:type="dxa" w:w="50"/>
+              <w:left w:type="dxa" w:w="80"/>
+              <w:bottom w:type="dxa" w:w="50"/>
+              <w:right w:type="dxa" w:w="80"/>
+            </w:tcMar>
+          </w:tcPr>
+          <w:p>
+            <w:r>
+              <w:rPr>
+                <w:b w:val="false"/>
+                <w:bCs w:val="false"/>
+                <w:i w:val="false"/>
+                <w:iCs w:val="false"/>
                 <w:sz w:val="20"/>
                 <w:szCs w:val="20"/>
               </w:rPr>
@@ -1527,23 +1592,25 @@
           <w:tcPr>
             <w:tcW w:type="dxa" w:w="2100"/>
             <w:tcBorders>
-              <w:top w:val="single" w:color="808080" w:sz="4"/>
-              <w:left w:val="single" w:color="808080" w:sz="4"/>
-              <w:bottom w:val="single" w:color="808080" w:sz="4"/>
-              <w:right w:val="single" w:color="808080" w:sz="4"/>
-            </w:tcBorders>
-            <w:tcMar>
-              <w:top w:type="dxa" w:w="60"/>
-              <w:left w:type="dxa" w:w="100"/>
-              <w:bottom w:type="dxa" w:w="60"/>
-              <w:right w:type="dxa" w:w="100"/>
-            </w:tcMar>
-          </w:tcPr>
-          <w:p>
-            <w:r>
-              <w:rPr>
-                <w:b w:val="false"/>
-                <w:bCs w:val="false"/>
+              <w:top w:val="none" w:color="FFFFFF" w:sz="0"/>
+              <w:left w:val="none" w:color="FFFFFF" w:sz="0"/>
+              <w:bottom w:val="none" w:color="FFFFFF" w:sz="0"/>
+              <w:right w:val="none" w:color="FFFFFF" w:sz="0"/>
+            </w:tcBorders>
+            <w:tcMar>
+              <w:top w:type="dxa" w:w="50"/>
+              <w:left w:type="dxa" w:w="80"/>
+              <w:bottom w:type="dxa" w:w="50"/>
+              <w:right w:type="dxa" w:w="80"/>
+            </w:tcMar>
+          </w:tcPr>
+          <w:p>
+            <w:r>
+              <w:rPr>
+                <w:b w:val="false"/>
+                <w:bCs w:val="false"/>
+                <w:i w:val="false"/>
+                <w:iCs w:val="false"/>
                 <w:sz w:val="20"/>
                 <w:szCs w:val="20"/>
               </w:rPr>
@@ -1555,23 +1622,25 @@
           <w:tcPr>
             <w:tcW w:type="dxa" w:w="1900"/>
             <w:tcBorders>
-              <w:top w:val="single" w:color="808080" w:sz="4"/>
-              <w:left w:val="single" w:color="808080" w:sz="4"/>
-              <w:bottom w:val="single" w:color="808080" w:sz="4"/>
-              <w:right w:val="single" w:color="808080" w:sz="4"/>
-            </w:tcBorders>
-            <w:tcMar>
-              <w:top w:type="dxa" w:w="60"/>
-              <w:left w:type="dxa" w:w="100"/>
-              <w:bottom w:type="dxa" w:w="60"/>
-              <w:right w:type="dxa" w:w="100"/>
-            </w:tcMar>
-          </w:tcPr>
-          <w:p>
-            <w:r>
-              <w:rPr>
-                <w:b w:val="false"/>
-                <w:bCs w:val="false"/>
+              <w:top w:val="none" w:color="FFFFFF" w:sz="0"/>
+              <w:left w:val="none" w:color="FFFFFF" w:sz="0"/>
+              <w:bottom w:val="none" w:color="FFFFFF" w:sz="0"/>
+              <w:right w:val="none" w:color="FFFFFF" w:sz="0"/>
+            </w:tcBorders>
+            <w:tcMar>
+              <w:top w:type="dxa" w:w="50"/>
+              <w:left w:type="dxa" w:w="80"/>
+              <w:bottom w:type="dxa" w:w="50"/>
+              <w:right w:type="dxa" w:w="80"/>
+            </w:tcMar>
+          </w:tcPr>
+          <w:p>
+            <w:r>
+              <w:rPr>
+                <w:b w:val="false"/>
+                <w:bCs w:val="false"/>
+                <w:i w:val="false"/>
+                <w:iCs w:val="false"/>
                 <w:sz w:val="20"/>
                 <w:szCs w:val="20"/>
               </w:rPr>
@@ -1583,23 +1652,25 @@
           <w:tcPr>
             <w:tcW w:type="dxa" w:w="3660"/>
             <w:tcBorders>
-              <w:top w:val="single" w:color="808080" w:sz="4"/>
-              <w:left w:val="single" w:color="808080" w:sz="4"/>
-              <w:bottom w:val="single" w:color="808080" w:sz="4"/>
-              <w:right w:val="single" w:color="808080" w:sz="4"/>
-            </w:tcBorders>
-            <w:tcMar>
-              <w:top w:type="dxa" w:w="60"/>
-              <w:left w:type="dxa" w:w="100"/>
-              <w:bottom w:type="dxa" w:w="60"/>
-              <w:right w:type="dxa" w:w="100"/>
-            </w:tcMar>
-          </w:tcPr>
-          <w:p>
-            <w:r>
-              <w:rPr>
-                <w:b w:val="false"/>
-                <w:bCs w:val="false"/>
+              <w:top w:val="none" w:color="FFFFFF" w:sz="0"/>
+              <w:left w:val="none" w:color="FFFFFF" w:sz="0"/>
+              <w:bottom w:val="none" w:color="FFFFFF" w:sz="0"/>
+              <w:right w:val="none" w:color="FFFFFF" w:sz="0"/>
+            </w:tcBorders>
+            <w:tcMar>
+              <w:top w:type="dxa" w:w="50"/>
+              <w:left w:type="dxa" w:w="80"/>
+              <w:bottom w:type="dxa" w:w="50"/>
+              <w:right w:type="dxa" w:w="80"/>
+            </w:tcMar>
+          </w:tcPr>
+          <w:p>
+            <w:r>
+              <w:rPr>
+                <w:b w:val="false"/>
+                <w:bCs w:val="false"/>
+                <w:i w:val="false"/>
+                <w:iCs w:val="false"/>
                 <w:sz w:val="20"/>
                 <w:szCs w:val="20"/>
               </w:rPr>
@@ -1617,23 +1688,25 @@
           <w:tcPr>
             <w:tcW w:type="dxa" w:w="1700"/>
             <w:tcBorders>
-              <w:top w:val="single" w:color="808080" w:sz="4"/>
-              <w:left w:val="single" w:color="808080" w:sz="4"/>
-              <w:bottom w:val="single" w:color="808080" w:sz="4"/>
-              <w:right w:val="single" w:color="808080" w:sz="4"/>
-            </w:tcBorders>
-            <w:tcMar>
-              <w:top w:type="dxa" w:w="60"/>
-              <w:left w:type="dxa" w:w="100"/>
-              <w:bottom w:type="dxa" w:w="60"/>
-              <w:right w:type="dxa" w:w="100"/>
-            </w:tcMar>
-          </w:tcPr>
-          <w:p>
-            <w:r>
-              <w:rPr>
-                <w:b w:val="false"/>
-                <w:bCs w:val="false"/>
+              <w:top w:val="none" w:color="FFFFFF" w:sz="0"/>
+              <w:left w:val="none" w:color="FFFFFF" w:sz="0"/>
+              <w:bottom w:val="none" w:color="FFFFFF" w:sz="0"/>
+              <w:right w:val="none" w:color="FFFFFF" w:sz="0"/>
+            </w:tcBorders>
+            <w:tcMar>
+              <w:top w:type="dxa" w:w="50"/>
+              <w:left w:type="dxa" w:w="80"/>
+              <w:bottom w:type="dxa" w:w="50"/>
+              <w:right w:type="dxa" w:w="80"/>
+            </w:tcMar>
+          </w:tcPr>
+          <w:p>
+            <w:r>
+              <w:rPr>
+                <w:b w:val="false"/>
+                <w:bCs w:val="false"/>
+                <w:i w:val="false"/>
+                <w:iCs w:val="false"/>
                 <w:sz w:val="20"/>
                 <w:szCs w:val="20"/>
               </w:rPr>
@@ -1645,23 +1718,25 @@
           <w:tcPr>
             <w:tcW w:type="dxa" w:w="2100"/>
             <w:tcBorders>
-              <w:top w:val="single" w:color="808080" w:sz="4"/>
-              <w:left w:val="single" w:color="808080" w:sz="4"/>
-              <w:bottom w:val="single" w:color="808080" w:sz="4"/>
-              <w:right w:val="single" w:color="808080" w:sz="4"/>
-            </w:tcBorders>
-            <w:tcMar>
-              <w:top w:type="dxa" w:w="60"/>
-              <w:left w:type="dxa" w:w="100"/>
-              <w:bottom w:type="dxa" w:w="60"/>
-              <w:right w:type="dxa" w:w="100"/>
-            </w:tcMar>
-          </w:tcPr>
-          <w:p>
-            <w:r>
-              <w:rPr>
-                <w:b w:val="false"/>
-                <w:bCs w:val="false"/>
+              <w:top w:val="none" w:color="FFFFFF" w:sz="0"/>
+              <w:left w:val="none" w:color="FFFFFF" w:sz="0"/>
+              <w:bottom w:val="none" w:color="FFFFFF" w:sz="0"/>
+              <w:right w:val="none" w:color="FFFFFF" w:sz="0"/>
+            </w:tcBorders>
+            <w:tcMar>
+              <w:top w:type="dxa" w:w="50"/>
+              <w:left w:type="dxa" w:w="80"/>
+              <w:bottom w:type="dxa" w:w="50"/>
+              <w:right w:type="dxa" w:w="80"/>
+            </w:tcMar>
+          </w:tcPr>
+          <w:p>
+            <w:r>
+              <w:rPr>
+                <w:b w:val="false"/>
+                <w:bCs w:val="false"/>
+                <w:i w:val="false"/>
+                <w:iCs w:val="false"/>
                 <w:sz w:val="20"/>
                 <w:szCs w:val="20"/>
               </w:rPr>
@@ -1673,23 +1748,25 @@
           <w:tcPr>
             <w:tcW w:type="dxa" w:w="1900"/>
             <w:tcBorders>
-              <w:top w:val="single" w:color="808080" w:sz="4"/>
-              <w:left w:val="single" w:color="808080" w:sz="4"/>
-              <w:bottom w:val="single" w:color="808080" w:sz="4"/>
-              <w:right w:val="single" w:color="808080" w:sz="4"/>
-            </w:tcBorders>
-            <w:tcMar>
-              <w:top w:type="dxa" w:w="60"/>
-              <w:left w:type="dxa" w:w="100"/>
-              <w:bottom w:type="dxa" w:w="60"/>
-              <w:right w:type="dxa" w:w="100"/>
-            </w:tcMar>
-          </w:tcPr>
-          <w:p>
-            <w:r>
-              <w:rPr>
-                <w:b w:val="false"/>
-                <w:bCs w:val="false"/>
+              <w:top w:val="none" w:color="FFFFFF" w:sz="0"/>
+              <w:left w:val="none" w:color="FFFFFF" w:sz="0"/>
+              <w:bottom w:val="none" w:color="FFFFFF" w:sz="0"/>
+              <w:right w:val="none" w:color="FFFFFF" w:sz="0"/>
+            </w:tcBorders>
+            <w:tcMar>
+              <w:top w:type="dxa" w:w="50"/>
+              <w:left w:type="dxa" w:w="80"/>
+              <w:bottom w:type="dxa" w:w="50"/>
+              <w:right w:type="dxa" w:w="80"/>
+            </w:tcMar>
+          </w:tcPr>
+          <w:p>
+            <w:r>
+              <w:rPr>
+                <w:b w:val="false"/>
+                <w:bCs w:val="false"/>
+                <w:i w:val="false"/>
+                <w:iCs w:val="false"/>
                 <w:sz w:val="20"/>
                 <w:szCs w:val="20"/>
               </w:rPr>
@@ -1701,23 +1778,25 @@
           <w:tcPr>
             <w:tcW w:type="dxa" w:w="3660"/>
             <w:tcBorders>
-              <w:top w:val="single" w:color="808080" w:sz="4"/>
-              <w:left w:val="single" w:color="808080" w:sz="4"/>
-              <w:bottom w:val="single" w:color="808080" w:sz="4"/>
-              <w:right w:val="single" w:color="808080" w:sz="4"/>
-            </w:tcBorders>
-            <w:tcMar>
-              <w:top w:type="dxa" w:w="60"/>
-              <w:left w:type="dxa" w:w="100"/>
-              <w:bottom w:type="dxa" w:w="60"/>
-              <w:right w:type="dxa" w:w="100"/>
-            </w:tcMar>
-          </w:tcPr>
-          <w:p>
-            <w:r>
-              <w:rPr>
-                <w:b w:val="false"/>
-                <w:bCs w:val="false"/>
+              <w:top w:val="none" w:color="FFFFFF" w:sz="0"/>
+              <w:left w:val="none" w:color="FFFFFF" w:sz="0"/>
+              <w:bottom w:val="none" w:color="FFFFFF" w:sz="0"/>
+              <w:right w:val="none" w:color="FFFFFF" w:sz="0"/>
+            </w:tcBorders>
+            <w:tcMar>
+              <w:top w:type="dxa" w:w="50"/>
+              <w:left w:type="dxa" w:w="80"/>
+              <w:bottom w:type="dxa" w:w="50"/>
+              <w:right w:type="dxa" w:w="80"/>
+            </w:tcMar>
+          </w:tcPr>
+          <w:p>
+            <w:r>
+              <w:rPr>
+                <w:b w:val="false"/>
+                <w:bCs w:val="false"/>
+                <w:i w:val="false"/>
+                <w:iCs w:val="false"/>
                 <w:sz w:val="20"/>
                 <w:szCs w:val="20"/>
               </w:rPr>
@@ -1735,24 +1814,25 @@
           <w:tcPr>
             <w:tcW w:type="dxa" w:w="1700"/>
             <w:tcBorders>
-              <w:top w:val="single" w:color="808080" w:sz="4"/>
-              <w:left w:val="single" w:color="808080" w:sz="4"/>
-              <w:bottom w:val="single" w:color="808080" w:sz="4"/>
-              <w:right w:val="single" w:color="808080" w:sz="4"/>
-            </w:tcBorders>
-            <w:shd w:fill="F2F2F2" w:color="auto" w:val="clear"/>
-            <w:tcMar>
-              <w:top w:type="dxa" w:w="60"/>
-              <w:left w:type="dxa" w:w="100"/>
-              <w:bottom w:type="dxa" w:w="60"/>
-              <w:right w:type="dxa" w:w="100"/>
-            </w:tcMar>
-          </w:tcPr>
-          <w:p>
-            <w:r>
-              <w:rPr>
-                <w:b/>
-                <w:bCs/>
+              <w:top w:val="none" w:color="FFFFFF" w:sz="0"/>
+              <w:left w:val="none" w:color="FFFFFF" w:sz="0"/>
+              <w:bottom w:val="single" w:color="000000" w:sz="12"/>
+              <w:right w:val="none" w:color="FFFFFF" w:sz="0"/>
+            </w:tcBorders>
+            <w:tcMar>
+              <w:top w:type="dxa" w:w="50"/>
+              <w:left w:type="dxa" w:w="80"/>
+              <w:bottom w:type="dxa" w:w="50"/>
+              <w:right w:type="dxa" w:w="80"/>
+            </w:tcMar>
+          </w:tcPr>
+          <w:p>
+            <w:r>
+              <w:rPr>
+                <w:b w:val="false"/>
+                <w:bCs w:val="false"/>
+                <w:i/>
+                <w:iCs/>
                 <w:sz w:val="20"/>
                 <w:szCs w:val="20"/>
               </w:rPr>
@@ -1764,24 +1844,25 @@
           <w:tcPr>
             <w:tcW w:type="dxa" w:w="2100"/>
             <w:tcBorders>
-              <w:top w:val="single" w:color="808080" w:sz="4"/>
-              <w:left w:val="single" w:color="808080" w:sz="4"/>
-              <w:bottom w:val="single" w:color="808080" w:sz="4"/>
-              <w:right w:val="single" w:color="808080" w:sz="4"/>
-            </w:tcBorders>
-            <w:shd w:fill="F2F2F2" w:color="auto" w:val="clear"/>
-            <w:tcMar>
-              <w:top w:type="dxa" w:w="60"/>
-              <w:left w:type="dxa" w:w="100"/>
-              <w:bottom w:type="dxa" w:w="60"/>
-              <w:right w:type="dxa" w:w="100"/>
-            </w:tcMar>
-          </w:tcPr>
-          <w:p>
-            <w:r>
-              <w:rPr>
-                <w:b/>
-                <w:bCs/>
+              <w:top w:val="none" w:color="FFFFFF" w:sz="0"/>
+              <w:left w:val="none" w:color="FFFFFF" w:sz="0"/>
+              <w:bottom w:val="single" w:color="000000" w:sz="12"/>
+              <w:right w:val="none" w:color="FFFFFF" w:sz="0"/>
+            </w:tcBorders>
+            <w:tcMar>
+              <w:top w:type="dxa" w:w="50"/>
+              <w:left w:type="dxa" w:w="80"/>
+              <w:bottom w:type="dxa" w:w="50"/>
+              <w:right w:type="dxa" w:w="80"/>
+            </w:tcMar>
+          </w:tcPr>
+          <w:p>
+            <w:r>
+              <w:rPr>
+                <w:b w:val="false"/>
+                <w:bCs w:val="false"/>
+                <w:i w:val="false"/>
+                <w:iCs w:val="false"/>
                 <w:sz w:val="20"/>
                 <w:szCs w:val="20"/>
               </w:rPr>
@@ -1793,24 +1874,25 @@
           <w:tcPr>
             <w:tcW w:type="dxa" w:w="1900"/>
             <w:tcBorders>
-              <w:top w:val="single" w:color="808080" w:sz="4"/>
-              <w:left w:val="single" w:color="808080" w:sz="4"/>
-              <w:bottom w:val="single" w:color="808080" w:sz="4"/>
-              <w:right w:val="single" w:color="808080" w:sz="4"/>
-            </w:tcBorders>
-            <w:shd w:fill="F2F2F2" w:color="auto" w:val="clear"/>
-            <w:tcMar>
-              <w:top w:type="dxa" w:w="60"/>
-              <w:left w:type="dxa" w:w="100"/>
-              <w:bottom w:type="dxa" w:w="60"/>
-              <w:right w:type="dxa" w:w="100"/>
-            </w:tcMar>
-          </w:tcPr>
-          <w:p>
-            <w:r>
-              <w:rPr>
-                <w:b/>
-                <w:bCs/>
+              <w:top w:val="none" w:color="FFFFFF" w:sz="0"/>
+              <w:left w:val="none" w:color="FFFFFF" w:sz="0"/>
+              <w:bottom w:val="single" w:color="000000" w:sz="12"/>
+              <w:right w:val="none" w:color="FFFFFF" w:sz="0"/>
+            </w:tcBorders>
+            <w:tcMar>
+              <w:top w:type="dxa" w:w="50"/>
+              <w:left w:type="dxa" w:w="80"/>
+              <w:bottom w:type="dxa" w:w="50"/>
+              <w:right w:type="dxa" w:w="80"/>
+            </w:tcMar>
+          </w:tcPr>
+          <w:p>
+            <w:r>
+              <w:rPr>
+                <w:b w:val="false"/>
+                <w:bCs w:val="false"/>
+                <w:i w:val="false"/>
+                <w:iCs w:val="false"/>
                 <w:sz w:val="20"/>
                 <w:szCs w:val="20"/>
               </w:rPr>
@@ -1822,24 +1904,25 @@
           <w:tcPr>
             <w:tcW w:type="dxa" w:w="3660"/>
             <w:tcBorders>
-              <w:top w:val="single" w:color="808080" w:sz="4"/>
-              <w:left w:val="single" w:color="808080" w:sz="4"/>
-              <w:bottom w:val="single" w:color="808080" w:sz="4"/>
-              <w:right w:val="single" w:color="808080" w:sz="4"/>
-            </w:tcBorders>
-            <w:shd w:fill="F2F2F2" w:color="auto" w:val="clear"/>
-            <w:tcMar>
-              <w:top w:type="dxa" w:w="60"/>
-              <w:left w:type="dxa" w:w="100"/>
-              <w:bottom w:type="dxa" w:w="60"/>
-              <w:right w:type="dxa" w:w="100"/>
-            </w:tcMar>
-          </w:tcPr>
-          <w:p>
-            <w:r>
-              <w:rPr>
-                <w:b/>
-                <w:bCs/>
+              <w:top w:val="none" w:color="FFFFFF" w:sz="0"/>
+              <w:left w:val="none" w:color="FFFFFF" w:sz="0"/>
+              <w:bottom w:val="single" w:color="000000" w:sz="12"/>
+              <w:right w:val="none" w:color="FFFFFF" w:sz="0"/>
+            </w:tcBorders>
+            <w:tcMar>
+              <w:top w:type="dxa" w:w="50"/>
+              <w:left w:type="dxa" w:w="80"/>
+              <w:bottom w:type="dxa" w:w="50"/>
+              <w:right w:type="dxa" w:w="80"/>
+            </w:tcMar>
+          </w:tcPr>
+          <w:p>
+            <w:r>
+              <w:rPr>
+                <w:b w:val="false"/>
+                <w:bCs w:val="false"/>
+                <w:i w:val="false"/>
+                <w:iCs w:val="false"/>
                 <w:sz w:val="20"/>
                 <w:szCs w:val="20"/>
               </w:rPr>
@@ -1865,87 +1948,7 @@
           <wp:inline distT="0" distB="0" distL="0" distR="0">
             <wp:extent cx="5120640" cy="2981325"/>
             <wp:effectExtent t="0" r="0" b="0" l="0"/>
-            <wp:docPr id="1" name="Figure 4." descr="Translation architecture in the Sign-Speak patent. A mobile capture device sends data to a remote server, where features are extracted and signs are matched against a sign and sentence base. Reproduced from U.S. Patent Appl. Pub. 2022/0327961 A1 [17]." title="Figure 4."/>
-            <wp:cNvGraphicFramePr>
-              <a:graphicFrameLocks xmlns:a="http://schemas.openxmlformats.org/drawingml/2006/main" noChangeAspect="1"/>
-            </wp:cNvGraphicFramePr>
-            <a:graphic xmlns:a="http://schemas.openxmlformats.org/drawingml/2006/main">
-              <a:graphicData uri="http://schemas.openxmlformats.org/drawingml/2006/picture">
-                <pic:pic xmlns:pic="http://schemas.openxmlformats.org/drawingml/2006/picture">
-                  <pic:nvPicPr>
-                    <pic:cNvPr id="0" name="" descr=""/>
-                    <pic:cNvPicPr>
-                      <a:picLocks noChangeAspect="1" noChangeArrowheads="1"/>
-                    </pic:cNvPicPr>
-                  </pic:nvPicPr>
-                  <pic:blipFill>
-                    <a:blip r:embed="rId8" cstate="none"/>
-                    <a:srcRect/>
-                    <a:stretch>
-                      <a:fillRect/>
-                    </a:stretch>
-                  </pic:blipFill>
-                  <pic:spPr bwMode="auto">
-                    <a:xfrm>
-                      <a:off x="0" y="0"/>
-                      <a:ext cx="5120640" cy="2981325"/>
-                    </a:xfrm>
-                    <a:prstGeom prst="rect">
-                      <a:avLst/>
-                    </a:prstGeom>
-                  </pic:spPr>
-                </pic:pic>
-              </a:graphicData>
-            </a:graphic>
-          </wp:inline>
-        </w:drawing>
-      </w:r>
-    </w:p>
-    <w:p>
-      <w:pPr>
-        <w:spacing w:after="240"/>
-        <w:ind w:left="360" w:right="360"/>
-        <w:jc w:val="both"/>
-      </w:pPr>
-      <w:r>
-        <w:rPr>
-          <w:b/>
-          <w:bCs/>
-          <w:sz w:val="20"/>
-          <w:szCs w:val="20"/>
-        </w:rPr>
-        <w:t xml:space="preserve">Figure 4. </w:t>
-      </w:r>
-      <w:r>
-        <w:rPr>
-          <w:sz w:val="20"/>
-          <w:szCs w:val="20"/>
-        </w:rPr>
-        <w:t xml:space="preserve">Translation architecture in the Sign-Speak patent. A mobile capture device sends data to a remote server, where features are extracted and signs are matched against a sign and sentence base. Reproduced from U.S. Patent Appl. Pub. 2022/0327961 A1 [17].</w:t>
-      </w:r>
-    </w:p>
-    <w:p>
-      <w:pPr>
-        <w:spacing w:after="120" w:line="360"/>
-        <w:ind w:firstLine="720"/>
-        <w:jc w:val="both"/>
-      </w:pPr>
-      <w:r>
-        <w:t xml:space="preserve">Surveys of Deaf communities also identify the ethical risks of this technology. In [1], more than 80% of participants were concerned about hearing people profiting from ASL, systems missing ASL grammatical features, automatic translation weakening the legal right to other accommodations, and poorer performance for some users than others. A 2025 global survey found the same pattern: about 80% of Deaf respondents were concerned about hearing people making money from sign language technology, and about 70% about the lack of Deaf people leading or contributing to it (Figure 5) [14]. We address these concerns directly. The device is presented as a way to communicate when an interpreter is unavailable, not as a substitute that could justify withholding one. Its limits are stated plainly: it recognizes individual signs and does not capture facial grammar or continuous signing. Accuracy will be reported for each test signer, not only as an average. We will seek input from Deaf ASL users when choosing the vocabulary and testing the device, as recommended in [13] and [14]. Because video never leaves the device, the design also avoids the privacy risk of streaming a user's image to a remote server.</w:t>
-      </w:r>
-    </w:p>
-    <w:p>
-      <w:pPr>
-        <w:keepNext/>
-        <w:spacing w:after="60" w:before="240"/>
-        <w:jc w:val="center"/>
-      </w:pPr>
-      <w:r>
-        <w:drawing>
-          <wp:inline distT="0" distB="0" distL="0" distR="0">
-            <wp:extent cx="5760720" cy="1619250"/>
-            <wp:effectExtent t="0" r="0" b="0" l="0"/>
-            <wp:docPr id="1" name="Figure 5." descr="Concerns about sign language technologies among Deaf, hard-of-hearing and hearing respondents in a global survey; numbers in parentheses are the number of mentions. Reproduced from Atwell et al. [14] under the CC BY 4.0 license." title="Figure 5."/>
+            <wp:docPr id="1" name="Figure 3." descr="Translation architecture in the Sign-Speak patent. A mobile capture device sends data to a remote server, where features are extracted and signs are matched against a sign and sentence base. Reproduced from U.S. Patent Appl. Pub. 2022/0327961 A1 [17]." title="Figure 3."/>
             <wp:cNvGraphicFramePr>
               <a:graphicFrameLocks xmlns:a="http://schemas.openxmlformats.org/drawingml/2006/main" noChangeAspect="1"/>
             </wp:cNvGraphicFramePr>
@@ -1968,6 +1971,86 @@
                   <pic:spPr bwMode="auto">
                     <a:xfrm>
                       <a:off x="0" y="0"/>
+                      <a:ext cx="5120640" cy="2981325"/>
+                    </a:xfrm>
+                    <a:prstGeom prst="rect">
+                      <a:avLst/>
+                    </a:prstGeom>
+                  </pic:spPr>
+                </pic:pic>
+              </a:graphicData>
+            </a:graphic>
+          </wp:inline>
+        </w:drawing>
+      </w:r>
+    </w:p>
+    <w:p>
+      <w:pPr>
+        <w:spacing w:after="240"/>
+        <w:ind w:left="360" w:right="360"/>
+        <w:jc w:val="both"/>
+      </w:pPr>
+      <w:r>
+        <w:rPr>
+          <w:b/>
+          <w:bCs/>
+          <w:sz w:val="20"/>
+          <w:szCs w:val="20"/>
+        </w:rPr>
+        <w:t xml:space="preserve">Figure 3. </w:t>
+      </w:r>
+      <w:r>
+        <w:rPr>
+          <w:sz w:val="20"/>
+          <w:szCs w:val="20"/>
+        </w:rPr>
+        <w:t xml:space="preserve">Translation architecture in the Sign-Speak patent. A mobile capture device sends data to a remote server, where features are extracted and signs are matched against a sign and sentence base. Reproduced from U.S. Patent Appl. Pub. 2022/0327961 A1 [17].</w:t>
+      </w:r>
+    </w:p>
+    <w:p>
+      <w:pPr>
+        <w:spacing w:after="120" w:line="360"/>
+        <w:ind w:firstLine="720"/>
+        <w:jc w:val="both"/>
+      </w:pPr>
+      <w:r>
+        <w:t xml:space="preserve">Surveys of Deaf communities also identify the ethical risks of this technology. In [1], more than 80% of participants were concerned about hearing people profiting from ASL, systems missing ASL grammatical features, automatic translation weakening the legal right to other accommodations, and poorer performance for some users than others. A 2025 global survey found the same pattern: about 80% of Deaf respondents were concerned about hearing people making money from sign language technology, and about 70% about the lack of Deaf people leading or contributing to it (Figure 4) [14]. We address these concerns directly. The device is presented as a way to communicate when an interpreter is unavailable, not as a substitute that could justify withholding one. Its limits are stated plainly: it recognizes individual signs and does not capture facial grammar or continuous signing. Accuracy will be reported for each test signer, not only as an average. We will seek input from Deaf ASL users when choosing the vocabulary and testing the device, as recommended in [13] and [14]. Because video never leaves the device, the design also avoids the privacy risk of streaming a user's image to a remote server.</w:t>
+      </w:r>
+    </w:p>
+    <w:p>
+      <w:pPr>
+        <w:keepNext/>
+        <w:spacing w:after="60" w:before="240"/>
+        <w:jc w:val="center"/>
+      </w:pPr>
+      <w:r>
+        <w:drawing>
+          <wp:inline distT="0" distB="0" distL="0" distR="0">
+            <wp:extent cx="5760720" cy="1619250"/>
+            <wp:effectExtent t="0" r="0" b="0" l="0"/>
+            <wp:docPr id="1" name="Figure 4." descr="Concerns about sign language technologies among Deaf, hard-of-hearing and hearing respondents in a global survey; numbers in parentheses are the number of mentions. Reproduced from Atwell et al. [14] under the CC BY 4.0 license." title="Figure 4."/>
+            <wp:cNvGraphicFramePr>
+              <a:graphicFrameLocks xmlns:a="http://schemas.openxmlformats.org/drawingml/2006/main" noChangeAspect="1"/>
+            </wp:cNvGraphicFramePr>
+            <a:graphic xmlns:a="http://schemas.openxmlformats.org/drawingml/2006/main">
+              <a:graphicData uri="http://schemas.openxmlformats.org/drawingml/2006/picture">
+                <pic:pic xmlns:pic="http://schemas.openxmlformats.org/drawingml/2006/picture">
+                  <pic:nvPicPr>
+                    <pic:cNvPr id="0" name="" descr=""/>
+                    <pic:cNvPicPr>
+                      <a:picLocks noChangeAspect="1" noChangeArrowheads="1"/>
+                    </pic:cNvPicPr>
+                  </pic:nvPicPr>
+                  <pic:blipFill>
+                    <a:blip r:embed="rId10" cstate="none"/>
+                    <a:srcRect/>
+                    <a:stretch>
+                      <a:fillRect/>
+                    </a:stretch>
+                  </pic:blipFill>
+                  <pic:spPr bwMode="auto">
+                    <a:xfrm>
+                      <a:off x="0" y="0"/>
                       <a:ext cx="5760720" cy="1619250"/>
                     </a:xfrm>
                     <a:prstGeom prst="rect">
@@ -1994,7 +2077,7 @@
           <w:sz w:val="20"/>
           <w:szCs w:val="20"/>
         </w:rPr>
-        <w:t xml:space="preserve">Figure 5. </w:t>
+        <w:t xml:space="preserve">Figure 4. </w:t>
       </w:r>
       <w:r>
         <w:rPr>

</xml_diff>

<commit_message>
Apply template review: subheadings, reference format, acronyms
Following the team's review against the ECE 414 template: adds subsections
3.1-3.7, rewrites references in the template's author-title-venue-year
format with years, pages and access dates, moves citations to sentence
ends, spells out GPU, RGB, 1D-CNN, NLLB and CC BY at first use, labels
figures "Fig. N.", keeps tables from splitting across pages, replaces
the budget placeholder with a pointer to Section 9, and adds the team's two
CVPR 2026 references.

Co-Authored-By: Claude Opus 5.5 <noreply@anthropic.com>
Claude-Session: https://claude.ai/code/session_01Ghe1P8BgNsyGdHuD4xCbdv
</commit_message>
<xml_diff>
--- a/docs/Introduction_Draft.docx
+++ b/docs/Introduction_Draft.docx
@@ -4,9 +4,18 @@
   <w:body>
     <w:p>
       <w:pPr>
-        <w:pStyle w:val="Heading1"/>
-      </w:pPr>
-      <w:r>
+        <w:pStyle w:val="IntroSection"/>
+        <w:keepNext/>
+        <w:spacing w:after="120" w:before="0"/>
+      </w:pPr>
+      <w:r>
+        <w:rPr>
+          <w:rFonts w:ascii="Times New Roman" w:cs="Times New Roman" w:eastAsia="Times New Roman" w:hAnsi="Times New Roman"/>
+          <w:b/>
+          <w:bCs/>
+          <w:sz w:val="24"/>
+          <w:szCs w:val="24"/>
+        </w:rPr>
         <w:t xml:space="preserve">3. Introduction</w:t>
       </w:r>
     </w:p>
@@ -17,7 +26,29 @@
         <w:jc w:val="both"/>
       </w:pPr>
       <w:r>
+        <w:rPr>
+          <w:rFonts w:ascii="Times New Roman" w:cs="Times New Roman" w:eastAsia="Times New Roman" w:hAnsi="Times New Roman"/>
+          <w:sz w:val="24"/>
+          <w:szCs w:val="24"/>
+        </w:rPr>
         <w:t xml:space="preserve">American Sign Language (ASL) is a complete natural language with its own grammar and vocabulary, distinct from English, and it is the primary language of about 500,000 Deaf and hard-of-hearing people in the United States [1]. When a Deaf ASL user needs to communicate with a hearing person who does not sign, a certified interpreter is usually needed, but one is often unavailable. Automatic translation could help fill this gap.</w:t>
+      </w:r>
+    </w:p>
+    <w:p>
+      <w:pPr>
+        <w:pStyle w:val="IntroSubsection"/>
+        <w:keepNext/>
+        <w:spacing w:after="100" w:before="200"/>
+      </w:pPr>
+      <w:r>
+        <w:rPr>
+          <w:rFonts w:ascii="Times New Roman" w:cs="Times New Roman" w:eastAsia="Times New Roman" w:hAnsi="Times New Roman"/>
+          <w:b/>
+          <w:bCs/>
+          <w:sz w:val="24"/>
+          <w:szCs w:val="24"/>
+        </w:rPr>
+        <w:t xml:space="preserve">3.1 Background</w:t>
       </w:r>
     </w:p>
     <w:p>
@@ -27,7 +58,66 @@
         <w:jc w:val="both"/>
       </w:pPr>
       <w:r>
-        <w:t xml:space="preserve">The size of this gap is visible in a recent survey of 32 U.S. Deaf and hard-of-hearing ASL users [1]. Participants most often wanted an interpreter but could not get one in medical settings, followed by professional and educational settings. These are exactly the settings where interpreting is legally mandated, which shows that the problem is not only one of law but of availability. Interpreters are costly, often must be booked in advance, and can take hours to arrive, especially in rural areas or at short notice [1].</w:t>
+        <w:rPr>
+          <w:rFonts w:ascii="Times New Roman" w:cs="Times New Roman" w:eastAsia="Times New Roman" w:hAnsi="Times New Roman"/>
+          <w:sz w:val="24"/>
+          <w:szCs w:val="24"/>
+        </w:rPr>
+        <w:t xml:space="preserve">Automatic sign language processing has advanced quickly, but no system yet translates ASL reliably enough for general real-world use [1]. Research is divided into two tasks. </w:t>
+      </w:r>
+      <w:r>
+        <w:rPr>
+          <w:rFonts w:ascii="Times New Roman" w:cs="Times New Roman" w:eastAsia="Times New Roman" w:hAnsi="Times New Roman"/>
+          <w:i/>
+          <w:iCs/>
+          <w:sz w:val="24"/>
+          <w:szCs w:val="24"/>
+        </w:rPr>
+        <w:t xml:space="preserve">Isolated sign language recognition</w:t>
+      </w:r>
+      <w:r>
+        <w:rPr>
+          <w:rFonts w:ascii="Times New Roman" w:cs="Times New Roman" w:eastAsia="Times New Roman" w:hAnsi="Times New Roman"/>
+          <w:sz w:val="24"/>
+          <w:szCs w:val="24"/>
+        </w:rPr>
+        <w:t xml:space="preserve"> (ISLR) identifies a single sign from a fixed vocabulary. On the ASL Citizen dataset, which contains 83,399 videos of 2,731 signs from 52 signers, the best published baseline reaches 63.1% top-1 accuracy on signers not seen during training [2]. </w:t>
+      </w:r>
+      <w:r>
+        <w:rPr>
+          <w:rFonts w:ascii="Times New Roman" w:cs="Times New Roman" w:eastAsia="Times New Roman" w:hAnsi="Times New Roman"/>
+          <w:i/>
+          <w:iCs/>
+          <w:sz w:val="24"/>
+          <w:szCs w:val="24"/>
+        </w:rPr>
+        <w:t xml:space="preserve">Sign language translation</w:t>
+      </w:r>
+      <w:r>
+        <w:rPr>
+          <w:rFonts w:ascii="Times New Roman" w:cs="Times New Roman" w:eastAsia="Times New Roman" w:hAnsi="Times New Roman"/>
+          <w:sz w:val="24"/>
+          <w:szCs w:val="24"/>
+        </w:rPr>
+        <w:t xml:space="preserve"> (SLT) converts continuous signing into full sentences. SLT models have traditionally been trained on </w:t>
+      </w:r>
+      <w:r>
+        <w:rPr>
+          <w:rFonts w:ascii="Times New Roman" w:cs="Times New Roman" w:eastAsia="Times New Roman" w:hAnsi="Times New Roman"/>
+          <w:i/>
+          <w:iCs/>
+          <w:sz w:val="24"/>
+          <w:szCs w:val="24"/>
+        </w:rPr>
+        <w:t xml:space="preserve">glosses</w:t>
+      </w:r>
+      <w:r>
+        <w:rPr>
+          <w:rFonts w:ascii="Times New Roman" w:cs="Times New Roman" w:eastAsia="Times New Roman" w:hAnsi="Times New Roman"/>
+          <w:sz w:val="24"/>
+          <w:szCs w:val="24"/>
+        </w:rPr>
+        <w:t xml:space="preserve">, written labels for each sign in a sentence, which are expensive to annotate and scarce for ASL [3].</w:t>
       </w:r>
     </w:p>
     <w:p>
@@ -37,37 +127,12 @@
         <w:jc w:val="both"/>
       </w:pPr>
       <w:r>
-        <w:t xml:space="preserve">Automatic sign language processing has advanced quickly, but no system yet translates ASL reliably enough for general real-world use [1]. Research is divided into two tasks. </w:t>
-      </w:r>
-      <w:r>
-        <w:rPr>
-          <w:i/>
-          <w:iCs/>
-        </w:rPr>
-        <w:t xml:space="preserve">Isolated sign language recognition</w:t>
-      </w:r>
-      <w:r>
-        <w:t xml:space="preserve"> (ISLR) identifies a single sign from a fixed vocabulary. On the ASL Citizen dataset, which contains 83,399 videos of 2,731 signs from 52 signers, the best published baseline reaches 63.1% top-1 accuracy on signers not seen during training [2]. </w:t>
-      </w:r>
-      <w:r>
-        <w:rPr>
-          <w:i/>
-          <w:iCs/>
-        </w:rPr>
-        <w:t xml:space="preserve">Sign language translation</w:t>
-      </w:r>
-      <w:r>
-        <w:t xml:space="preserve"> (SLT) converts continuous signing into full sentences. SLT models have traditionally been trained on </w:t>
-      </w:r>
-      <w:r>
-        <w:rPr>
-          <w:i/>
-          <w:iCs/>
-        </w:rPr>
-        <w:t xml:space="preserve">glosses</w:t>
-      </w:r>
-      <w:r>
-        <w:t xml:space="preserve">, written labels for each sign in a sentence, which are expensive to annotate and scarce for ASL [3].</w:t>
+        <w:rPr>
+          <w:rFonts w:ascii="Times New Roman" w:cs="Times New Roman" w:eastAsia="Times New Roman" w:hAnsi="Times New Roman"/>
+          <w:sz w:val="24"/>
+          <w:szCs w:val="24"/>
+        </w:rPr>
+        <w:t xml:space="preserve">Recent research is therefore moving toward gloss-free and self-supervised models. SignDino, for example, learns sign representations from video without any gloss or text labels [4]. Gan et al. similarly learn sign features without text supervision and use them for gloss-free translation [5]. A parallel trend is lightweight models that work on body and hand landmarks rather than on full video frames, which makes them small and fast enough for embedded hardware. MediaPipe is a widely used framework for extracting such landmarks [6]. The winning solution of the Google – Isolated Sign Language Recognition competition on Kaggle, a one-dimensional convolutional neural network (1D-CNN) combined with a transformer, is one example of a landmark-based recognizer [7]. Pose-only models have also been applied to continuous sign language recognition [8].</w:t>
       </w:r>
     </w:p>
     <w:p>
@@ -77,7 +142,29 @@
         <w:jc w:val="both"/>
       </w:pPr>
       <w:r>
-        <w:t xml:space="preserve">Recent research is therefore moving toward gloss-free and self-supervised models. SignDino, for example, learns sign representations from video without any gloss or text labels [4]. A parallel trend is lightweight models that work on body and hand landmarks extracted by tools such as MediaPipe [5], rather than on full video frames, which makes them small and fast enough for embedded hardware. The winning solution of the Google – Isolated Sign Language Recognition competition on Kaggle, a 1D convolutional network combined with a transformer, is one example [6].</w:t>
+        <w:rPr>
+          <w:rFonts w:ascii="Times New Roman" w:cs="Times New Roman" w:eastAsia="Times New Roman" w:hAnsi="Times New Roman"/>
+          <w:sz w:val="24"/>
+          <w:szCs w:val="24"/>
+        </w:rPr>
+        <w:t xml:space="preserve">Because gloss-free continuous translation still requires large models and datasets, our project uses landmark-based isolated recognition over a limited vocabulary. This approach runs offline on an embedded graphics processing unit (GPU), can be evaluated sign by sign, and produces confidence scores that the device can use to abstain rather than guess.</w:t>
+      </w:r>
+    </w:p>
+    <w:p>
+      <w:pPr>
+        <w:pStyle w:val="IntroSubsection"/>
+        <w:keepNext/>
+        <w:spacing w:after="100" w:before="200"/>
+      </w:pPr>
+      <w:r>
+        <w:rPr>
+          <w:rFonts w:ascii="Times New Roman" w:cs="Times New Roman" w:eastAsia="Times New Roman" w:hAnsi="Times New Roman"/>
+          <w:b/>
+          <w:bCs/>
+          <w:sz w:val="24"/>
+          <w:szCs w:val="24"/>
+        </w:rPr>
+        <w:t xml:space="preserve">3.2 Problem Statement</w:t>
       </w:r>
     </w:p>
     <w:p>
@@ -87,7 +174,12 @@
         <w:jc w:val="both"/>
       </w:pPr>
       <w:r>
-        <w:t xml:space="preserve">Because gloss-free continuous translation still requires large models and datasets, our project uses landmark-based isolated recognition over a limited vocabulary. This approach runs offline on an embedded GPU, can be evaluated sign by sign, and produces confidence scores that the device can use to abstain rather than guess.</w:t>
+        <w:rPr>
+          <w:rFonts w:ascii="Times New Roman" w:cs="Times New Roman" w:eastAsia="Times New Roman" w:hAnsi="Times New Roman"/>
+          <w:sz w:val="24"/>
+          <w:szCs w:val="24"/>
+        </w:rPr>
+        <w:t xml:space="preserve">Deaf ASL users often cannot get an interpreter when they need one. In a recent survey of 32 U.S. Deaf and hard-of-hearing ASL users, participants most often wanted an interpreter but could not get one in medical settings, followed by professional and educational settings [1]. These are exactly the settings where interpreting is legally mandated, which shows that the problem is not only one of law but of availability [1]. Interpreters are costly, often must be booked in advance, and can take hours to arrive, especially in rural areas or at short notice [1].</w:t>
       </w:r>
     </w:p>
     <w:p>
@@ -97,6 +189,11 @@
         <w:jc w:val="both"/>
       </w:pPr>
       <w:r>
+        <w:rPr>
+          <w:rFonts w:ascii="Times New Roman" w:cs="Times New Roman" w:eastAsia="Times New Roman" w:hAnsi="Times New Roman"/>
+          <w:sz w:val="24"/>
+          <w:szCs w:val="24"/>
+        </w:rPr>
         <w:t xml:space="preserve">Existing automated approaches also have three practical weaknesses. First, they typically output a translation even when uncertain, and a wrong translation can be worse than none, especially in high-stakes settings. Second, cloud-based systems need a reliable internet connection and stream video of the user to remote servers, which raises privacy concerns. Third, most are one-way: they convert signing to text but give the hearing person no way to reply without a second device.</w:t>
       </w:r>
     </w:p>
@@ -107,7 +204,29 @@
         <w:jc w:val="both"/>
       </w:pPr>
       <w:r>
+        <w:rPr>
+          <w:rFonts w:ascii="Times New Roman" w:cs="Times New Roman" w:eastAsia="Times New Roman" w:hAnsi="Times New Roman"/>
+          <w:sz w:val="24"/>
+          <w:szCs w:val="24"/>
+        </w:rPr>
         <w:t xml:space="preserve">Our device addresses each of these weaknesses. All processing runs locally on an embedded GPU, so the device works without a network connection and no video leaves it. A built-in microphone converts the hearing person's speech to on-screen text, so a single device supports a two-way conversation. The device speaks a sentence only after the user confirms it on screen, and when its confidence is low it shows a list of candidate signs instead of guessing. The device is intended to provide access when an interpreter is unavailable, such as at a service counter, a front desk, or while waiting for an interpreter to arrive. It is not a replacement for certified interpreters.</w:t>
+      </w:r>
+    </w:p>
+    <w:p>
+      <w:pPr>
+        <w:pStyle w:val="IntroSubsection"/>
+        <w:keepNext/>
+        <w:spacing w:after="100" w:before="200"/>
+      </w:pPr>
+      <w:r>
+        <w:rPr>
+          <w:rFonts w:ascii="Times New Roman" w:cs="Times New Roman" w:eastAsia="Times New Roman" w:hAnsi="Times New Roman"/>
+          <w:b/>
+          <w:bCs/>
+          <w:sz w:val="24"/>
+          <w:szCs w:val="24"/>
+        </w:rPr>
+        <w:t xml:space="preserve">3.3 Objectives</w:t>
       </w:r>
     </w:p>
     <w:p>
@@ -117,6 +236,11 @@
         <w:jc w:val="both"/>
       </w:pPr>
       <w:r>
+        <w:rPr>
+          <w:rFonts w:ascii="Times New Roman" w:cs="Times New Roman" w:eastAsia="Times New Roman" w:hAnsi="Times New Roman"/>
+          <w:sz w:val="24"/>
+          <w:szCs w:val="24"/>
+        </w:rPr>
         <w:t xml:space="preserve">The objective of this project is to design and build a portable prototype that lets a Deaf ASL user hold a short two-way conversation with a hearing person who speaks English, Turkish or Spanish, without an internet connection. The prototype is scoped to structured, everyday exchanges such as those at a service counter or front desk. Its technical goals, summarized in Table 1, are to recognize a vocabulary of 100–250 ASL signs at no less than 75% top-1 and 90% top-5 accuracy on signers not seen during training; to speak a confirmed sentence in the selected language within 1.2 s of the user's confirmation; to show the hearing person's spoken reply as English text; and to run entirely on an embedded GPU. The project also has a reliability objective: the device should abstain rather than voice a translation it is not confident in, and we will report its accuracy on the sentences it does speak, not only its overall accuracy. These figures are design targets; measured results will be reported as the project progresses.</w:t>
       </w:r>
     </w:p>
@@ -127,7 +251,12 @@
         <w:jc w:val="both"/>
       </w:pPr>
       <w:r>
-        <w:t xml:space="preserve">We chose the service-counter setting based on Deaf users' own priorities. Figure 1 summarizes the survey ratings by setting. “Going into a business” received the highest willingness to use automatic translation, and every participant showed at least some willingness there; self-service kiosks and informal educational activities followed, while mental healthcare, education settings and formal personal events ranked lowest (Figure 1b) [1]. Business settings also show a moderate unmet need for interpreters (Figure 1a), so a device there would fill a real gap where users are most open to the technology. Participants also held their lowest accuracy expectations for kiosk-type exchanges and their highest for medical settings [1]. A service counter is therefore a realistic first target for a system with a vocabulary of a few hundred signs.</w:t>
+        <w:rPr>
+          <w:rFonts w:ascii="Times New Roman" w:cs="Times New Roman" w:eastAsia="Times New Roman" w:hAnsi="Times New Roman"/>
+          <w:sz w:val="24"/>
+          <w:szCs w:val="24"/>
+        </w:rPr>
+        <w:t xml:space="preserve">We chose the service-counter setting based on Deaf users' own priorities. Fig. 1 summarizes the survey ratings by setting. “Going into a business” received the highest willingness to use automatic translation, and every participant showed at least some willingness there; self-service kiosks and informal educational activities followed, while mental healthcare, education settings and formal personal events ranked lowest (Fig. 1(b)) [1]. Business settings also show a moderate unmet need for interpreters (Fig. 1(a)), so a device there would fill a real gap where users are most open to the technology. Participants also held their lowest accuracy expectations for kiosk-type exchanges and their highest for medical settings [1]. A service counter is therefore a realistic first target for a system with a vocabulary of a few hundred signs.</w:t>
       </w:r>
     </w:p>
     <w:p>
@@ -141,7 +270,7 @@
           <wp:inline distT="0" distB="0" distL="0" distR="0">
             <wp:extent cx="5760720" cy="3181350"/>
             <wp:effectExtent t="0" r="0" b="0" l="0"/>
-            <wp:docPr id="1" name="Figure 1." descr="Mean ratings by setting from a survey of 32 Deaf and hard-of-hearing ASL users: (a) how often they wanted a professional interpreter but could not get one; (b) how willing they would be to use automatic sign language translation. Settings are ordered by (b); the target setting of this project is highlighted. Data from Tran et al. [1]; means computed from the published response distributions." title="Figure 1."/>
+            <wp:docPr id="1" name="Fig. 1." descr="Mean ratings by setting from a survey of 32 Deaf and hard-of-hearing ASL users: (a) how often they wanted a professional interpreter but could not get one; (b) how willing they would be to use automatic sign language translation. Settings are ordered by (b); the target setting of this project is highlighted. Data from Tran et al. [1]; means computed from the published response distributions." title="Fig. 1."/>
             <wp:cNvGraphicFramePr>
               <a:graphicFrameLocks xmlns:a="http://schemas.openxmlformats.org/drawingml/2006/main" noChangeAspect="1"/>
             </wp:cNvGraphicFramePr>
@@ -185,15 +314,17 @@
       </w:pPr>
       <w:r>
         <w:rPr>
+          <w:rFonts w:ascii="Times New Roman" w:cs="Times New Roman" w:eastAsia="Times New Roman" w:hAnsi="Times New Roman"/>
           <w:b/>
           <w:bCs/>
           <w:sz w:val="20"/>
           <w:szCs w:val="20"/>
         </w:rPr>
-        <w:t xml:space="preserve">Figure 1. </w:t>
-      </w:r>
-      <w:r>
-        <w:rPr>
+        <w:t xml:space="preserve">Fig. 1. </w:t>
+      </w:r>
+      <w:r>
+        <w:rPr>
+          <w:rFonts w:ascii="Times New Roman" w:cs="Times New Roman" w:eastAsia="Times New Roman" w:hAnsi="Times New Roman"/>
           <w:sz w:val="20"/>
           <w:szCs w:val="20"/>
         </w:rPr>
@@ -208,6 +339,7 @@
       </w:pPr>
       <w:r>
         <w:rPr>
+          <w:rFonts w:ascii="Times New Roman" w:cs="Times New Roman" w:eastAsia="Times New Roman" w:hAnsi="Times New Roman"/>
           <w:b/>
           <w:bCs/>
           <w:sz w:val="20"/>
@@ -217,6 +349,7 @@
       </w:r>
       <w:r>
         <w:rPr>
+          <w:rFonts w:ascii="Times New Roman" w:cs="Times New Roman" w:eastAsia="Times New Roman" w:hAnsi="Times New Roman"/>
           <w:sz w:val="20"/>
           <w:szCs w:val="20"/>
         </w:rPr>
@@ -262,8 +395,12 @@
             </w:tcMar>
           </w:tcPr>
           <w:p>
-            <w:r>
-              <w:rPr>
+            <w:pPr>
+              <w:keepNext/>
+            </w:pPr>
+            <w:r>
+              <w:rPr>
+                <w:rFonts w:ascii="Times New Roman" w:cs="Times New Roman" w:eastAsia="Times New Roman" w:hAnsi="Times New Roman"/>
                 <w:b/>
                 <w:bCs/>
                 <w:i w:val="false"/>
@@ -292,8 +429,12 @@
             </w:tcMar>
           </w:tcPr>
           <w:p>
-            <w:r>
-              <w:rPr>
+            <w:pPr>
+              <w:keepNext/>
+            </w:pPr>
+            <w:r>
+              <w:rPr>
+                <w:rFonts w:ascii="Times New Roman" w:cs="Times New Roman" w:eastAsia="Times New Roman" w:hAnsi="Times New Roman"/>
                 <w:b/>
                 <w:bCs/>
                 <w:i w:val="false"/>
@@ -322,8 +463,12 @@
             </w:tcMar>
           </w:tcPr>
           <w:p>
-            <w:r>
-              <w:rPr>
+            <w:pPr>
+              <w:keepNext/>
+            </w:pPr>
+            <w:r>
+              <w:rPr>
+                <w:rFonts w:ascii="Times New Roman" w:cs="Times New Roman" w:eastAsia="Times New Roman" w:hAnsi="Times New Roman"/>
                 <w:b/>
                 <w:bCs/>
                 <w:i w:val="false"/>
@@ -358,8 +503,12 @@
             </w:tcMar>
           </w:tcPr>
           <w:p>
-            <w:r>
-              <w:rPr>
+            <w:pPr>
+              <w:keepNext/>
+            </w:pPr>
+            <w:r>
+              <w:rPr>
+                <w:rFonts w:ascii="Times New Roman" w:cs="Times New Roman" w:eastAsia="Times New Roman" w:hAnsi="Times New Roman"/>
                 <w:b w:val="false"/>
                 <w:bCs w:val="false"/>
                 <w:i w:val="false"/>
@@ -388,8 +537,12 @@
             </w:tcMar>
           </w:tcPr>
           <w:p>
-            <w:r>
-              <w:rPr>
+            <w:pPr>
+              <w:keepNext/>
+            </w:pPr>
+            <w:r>
+              <w:rPr>
+                <w:rFonts w:ascii="Times New Roman" w:cs="Times New Roman" w:eastAsia="Times New Roman" w:hAnsi="Times New Roman"/>
                 <w:b w:val="false"/>
                 <w:bCs w:val="false"/>
                 <w:i w:val="false"/>
@@ -418,8 +571,12 @@
             </w:tcMar>
           </w:tcPr>
           <w:p>
-            <w:r>
-              <w:rPr>
+            <w:pPr>
+              <w:keepNext/>
+            </w:pPr>
+            <w:r>
+              <w:rPr>
+                <w:rFonts w:ascii="Times New Roman" w:cs="Times New Roman" w:eastAsia="Times New Roman" w:hAnsi="Times New Roman"/>
                 <w:b w:val="false"/>
                 <w:bCs w:val="false"/>
                 <w:i w:val="false"/>
@@ -454,8 +611,12 @@
             </w:tcMar>
           </w:tcPr>
           <w:p>
-            <w:r>
-              <w:rPr>
+            <w:pPr>
+              <w:keepNext/>
+            </w:pPr>
+            <w:r>
+              <w:rPr>
+                <w:rFonts w:ascii="Times New Roman" w:cs="Times New Roman" w:eastAsia="Times New Roman" w:hAnsi="Times New Roman"/>
                 <w:b w:val="false"/>
                 <w:bCs w:val="false"/>
                 <w:i w:val="false"/>
@@ -484,8 +645,12 @@
             </w:tcMar>
           </w:tcPr>
           <w:p>
-            <w:r>
-              <w:rPr>
+            <w:pPr>
+              <w:keepNext/>
+            </w:pPr>
+            <w:r>
+              <w:rPr>
+                <w:rFonts w:ascii="Times New Roman" w:cs="Times New Roman" w:eastAsia="Times New Roman" w:hAnsi="Times New Roman"/>
                 <w:b w:val="false"/>
                 <w:bCs w:val="false"/>
                 <w:i w:val="false"/>
@@ -514,8 +679,12 @@
             </w:tcMar>
           </w:tcPr>
           <w:p>
-            <w:r>
-              <w:rPr>
+            <w:pPr>
+              <w:keepNext/>
+            </w:pPr>
+            <w:r>
+              <w:rPr>
+                <w:rFonts w:ascii="Times New Roman" w:cs="Times New Roman" w:eastAsia="Times New Roman" w:hAnsi="Times New Roman"/>
                 <w:b w:val="false"/>
                 <w:bCs w:val="false"/>
                 <w:i w:val="false"/>
@@ -550,8 +719,12 @@
             </w:tcMar>
           </w:tcPr>
           <w:p>
-            <w:r>
-              <w:rPr>
+            <w:pPr>
+              <w:keepNext/>
+            </w:pPr>
+            <w:r>
+              <w:rPr>
+                <w:rFonts w:ascii="Times New Roman" w:cs="Times New Roman" w:eastAsia="Times New Roman" w:hAnsi="Times New Roman"/>
                 <w:b w:val="false"/>
                 <w:bCs w:val="false"/>
                 <w:i w:val="false"/>
@@ -580,8 +753,12 @@
             </w:tcMar>
           </w:tcPr>
           <w:p>
-            <w:r>
-              <w:rPr>
+            <w:pPr>
+              <w:keepNext/>
+            </w:pPr>
+            <w:r>
+              <w:rPr>
+                <w:rFonts w:ascii="Times New Roman" w:cs="Times New Roman" w:eastAsia="Times New Roman" w:hAnsi="Times New Roman"/>
                 <w:b w:val="false"/>
                 <w:bCs w:val="false"/>
                 <w:i w:val="false"/>
@@ -610,8 +787,12 @@
             </w:tcMar>
           </w:tcPr>
           <w:p>
-            <w:r>
-              <w:rPr>
+            <w:pPr>
+              <w:keepNext/>
+            </w:pPr>
+            <w:r>
+              <w:rPr>
+                <w:rFonts w:ascii="Times New Roman" w:cs="Times New Roman" w:eastAsia="Times New Roman" w:hAnsi="Times New Roman"/>
                 <w:b w:val="false"/>
                 <w:bCs w:val="false"/>
                 <w:i w:val="false"/>
@@ -646,8 +827,12 @@
             </w:tcMar>
           </w:tcPr>
           <w:p>
-            <w:r>
-              <w:rPr>
+            <w:pPr>
+              <w:keepNext/>
+            </w:pPr>
+            <w:r>
+              <w:rPr>
+                <w:rFonts w:ascii="Times New Roman" w:cs="Times New Roman" w:eastAsia="Times New Roman" w:hAnsi="Times New Roman"/>
                 <w:b w:val="false"/>
                 <w:bCs w:val="false"/>
                 <w:i w:val="false"/>
@@ -676,8 +861,12 @@
             </w:tcMar>
           </w:tcPr>
           <w:p>
-            <w:r>
-              <w:rPr>
+            <w:pPr>
+              <w:keepNext/>
+            </w:pPr>
+            <w:r>
+              <w:rPr>
+                <w:rFonts w:ascii="Times New Roman" w:cs="Times New Roman" w:eastAsia="Times New Roman" w:hAnsi="Times New Roman"/>
                 <w:b w:val="false"/>
                 <w:bCs w:val="false"/>
                 <w:i w:val="false"/>
@@ -706,8 +895,12 @@
             </w:tcMar>
           </w:tcPr>
           <w:p>
-            <w:r>
-              <w:rPr>
+            <w:pPr>
+              <w:keepNext/>
+            </w:pPr>
+            <w:r>
+              <w:rPr>
+                <w:rFonts w:ascii="Times New Roman" w:cs="Times New Roman" w:eastAsia="Times New Roman" w:hAnsi="Times New Roman"/>
                 <w:b w:val="false"/>
                 <w:bCs w:val="false"/>
                 <w:i w:val="false"/>
@@ -742,8 +935,12 @@
             </w:tcMar>
           </w:tcPr>
           <w:p>
-            <w:r>
-              <w:rPr>
+            <w:pPr>
+              <w:keepNext/>
+            </w:pPr>
+            <w:r>
+              <w:rPr>
+                <w:rFonts w:ascii="Times New Roman" w:cs="Times New Roman" w:eastAsia="Times New Roman" w:hAnsi="Times New Roman"/>
                 <w:b w:val="false"/>
                 <w:bCs w:val="false"/>
                 <w:i w:val="false"/>
@@ -772,8 +969,12 @@
             </w:tcMar>
           </w:tcPr>
           <w:p>
-            <w:r>
-              <w:rPr>
+            <w:pPr>
+              <w:keepNext/>
+            </w:pPr>
+            <w:r>
+              <w:rPr>
+                <w:rFonts w:ascii="Times New Roman" w:cs="Times New Roman" w:eastAsia="Times New Roman" w:hAnsi="Times New Roman"/>
                 <w:b w:val="false"/>
                 <w:bCs w:val="false"/>
                 <w:i w:val="false"/>
@@ -802,8 +1003,12 @@
             </w:tcMar>
           </w:tcPr>
           <w:p>
-            <w:r>
-              <w:rPr>
+            <w:pPr>
+              <w:keepNext/>
+            </w:pPr>
+            <w:r>
+              <w:rPr>
+                <w:rFonts w:ascii="Times New Roman" w:cs="Times New Roman" w:eastAsia="Times New Roman" w:hAnsi="Times New Roman"/>
                 <w:b w:val="false"/>
                 <w:bCs w:val="false"/>
                 <w:i w:val="false"/>
@@ -838,8 +1043,12 @@
             </w:tcMar>
           </w:tcPr>
           <w:p>
-            <w:r>
-              <w:rPr>
+            <w:pPr>
+              <w:keepNext/>
+            </w:pPr>
+            <w:r>
+              <w:rPr>
+                <w:rFonts w:ascii="Times New Roman" w:cs="Times New Roman" w:eastAsia="Times New Roman" w:hAnsi="Times New Roman"/>
                 <w:b w:val="false"/>
                 <w:bCs w:val="false"/>
                 <w:i w:val="false"/>
@@ -868,8 +1077,12 @@
             </w:tcMar>
           </w:tcPr>
           <w:p>
-            <w:r>
-              <w:rPr>
+            <w:pPr>
+              <w:keepNext/>
+            </w:pPr>
+            <w:r>
+              <w:rPr>
+                <w:rFonts w:ascii="Times New Roman" w:cs="Times New Roman" w:eastAsia="Times New Roman" w:hAnsi="Times New Roman"/>
                 <w:b w:val="false"/>
                 <w:bCs w:val="false"/>
                 <w:i w:val="false"/>
@@ -898,8 +1111,12 @@
             </w:tcMar>
           </w:tcPr>
           <w:p>
-            <w:r>
-              <w:rPr>
+            <w:pPr>
+              <w:keepNext/>
+            </w:pPr>
+            <w:r>
+              <w:rPr>
+                <w:rFonts w:ascii="Times New Roman" w:cs="Times New Roman" w:eastAsia="Times New Roman" w:hAnsi="Times New Roman"/>
                 <w:b w:val="false"/>
                 <w:bCs w:val="false"/>
                 <w:i w:val="false"/>
@@ -934,8 +1151,12 @@
             </w:tcMar>
           </w:tcPr>
           <w:p>
-            <w:r>
-              <w:rPr>
+            <w:pPr>
+              <w:keepNext w:val="false"/>
+            </w:pPr>
+            <w:r>
+              <w:rPr>
+                <w:rFonts w:ascii="Times New Roman" w:cs="Times New Roman" w:eastAsia="Times New Roman" w:hAnsi="Times New Roman"/>
                 <w:b w:val="false"/>
                 <w:bCs w:val="false"/>
                 <w:i w:val="false"/>
@@ -964,8 +1185,12 @@
             </w:tcMar>
           </w:tcPr>
           <w:p>
-            <w:r>
-              <w:rPr>
+            <w:pPr>
+              <w:keepNext w:val="false"/>
+            </w:pPr>
+            <w:r>
+              <w:rPr>
+                <w:rFonts w:ascii="Times New Roman" w:cs="Times New Roman" w:eastAsia="Times New Roman" w:hAnsi="Times New Roman"/>
                 <w:b w:val="false"/>
                 <w:bCs w:val="false"/>
                 <w:i w:val="false"/>
@@ -994,8 +1219,12 @@
             </w:tcMar>
           </w:tcPr>
           <w:p>
-            <w:r>
-              <w:rPr>
+            <w:pPr>
+              <w:keepNext w:val="false"/>
+            </w:pPr>
+            <w:r>
+              <w:rPr>
+                <w:rFonts w:ascii="Times New Roman" w:cs="Times New Roman" w:eastAsia="Times New Roman" w:hAnsi="Times New Roman"/>
                 <w:b w:val="false"/>
                 <w:bCs w:val="false"/>
                 <w:i w:val="false"/>
@@ -1013,6 +1242,23 @@
       <w:pPr>
         <w:spacing w:after="240"/>
       </w:pPr>
+    </w:p>
+    <w:p>
+      <w:pPr>
+        <w:pStyle w:val="IntroSubsection"/>
+        <w:keepNext/>
+        <w:spacing w:after="100" w:before="200"/>
+      </w:pPr>
+      <w:r>
+        <w:rPr>
+          <w:rFonts w:ascii="Times New Roman" w:cs="Times New Roman" w:eastAsia="Times New Roman" w:hAnsi="Times New Roman"/>
+          <w:b/>
+          <w:bCs/>
+          <w:sz w:val="24"/>
+          <w:szCs w:val="24"/>
+        </w:rPr>
+        <w:t xml:space="preserve">3.4 Proposed Approach</w:t>
+      </w:r>
     </w:p>
     <w:p>
       <w:pPr>
@@ -1021,7 +1267,12 @@
         <w:jc w:val="both"/>
       </w:pPr>
       <w:r>
-        <w:t xml:space="preserve">Figure 2 shows how the device is used at a service counter. The camera and touchscreen face the Deaf user, while the speaker and microphone face the hearing staff member. MediaPipe [5] extracts body, hand and face landmarks from each camera frame. In natural signing, signs flow into each other with minimal pauses, and segmenting them automatically is still an open research problem [7]. The user therefore signs one sign at a time and returns the hands to a rest position between signs, and the device uses this rest pose to mark where each sign ends. A lightweight landmark-based model, following the 1D-CNN and transformer design of [6], classifies each sign and outputs its five most likely labels with confidence scores. The model will be trained on the ASL Citizen dataset [2] and evaluated on its signer-independent test split and on recordings from our own test users.</w:t>
+        <w:rPr>
+          <w:rFonts w:ascii="Times New Roman" w:cs="Times New Roman" w:eastAsia="Times New Roman" w:hAnsi="Times New Roman"/>
+          <w:sz w:val="24"/>
+          <w:szCs w:val="24"/>
+        </w:rPr>
+        <w:t xml:space="preserve">Fig. 2 shows how the device is used at a service counter. A single red-green-blue (RGB) camera and the touchscreen face the Deaf user, while the speaker and microphone face the hearing staff member. Body, hand and face landmarks are extracted from each camera frame with MediaPipe [6]. In natural signing, signs flow into each other with minimal pauses, and segmenting them automatically is still an open research problem [9]. The user therefore signs one sign at a time and returns the hands to a rest position between signs, and the device uses this rest pose to mark where each sign ends. A lightweight landmark-based model classifies each sign and outputs its five most likely labels with confidence scores; its design follows the winning Kaggle solution [7]. The model will be trained on the ASL Citizen dataset and evaluated on its signer-independent test split, as well as on recordings from our own test users [2]. Words outside the vocabulary, such as names, will be handled by a fingerspelling fallback that recognizes letters one at a time.</w:t>
       </w:r>
     </w:p>
     <w:p>
@@ -1035,7 +1286,7 @@
           <wp:inline distT="0" distB="0" distL="0" distR="0">
             <wp:extent cx="5120640" cy="2952750"/>
             <wp:effectExtent t="0" r="0" b="0" l="0"/>
-            <wp:docPr id="1" name="Figure 2." descr="The proposed device in use at a service counter (side view). The camera and touchscreen face the Deaf user; the speaker and microphone face the hearing staff member. All processing runs on the Jetson Orin Nano inside the base, without a network connection." title="Figure 2."/>
+            <wp:docPr id="1" name="Fig. 2." descr="The proposed device in use at a service counter (side view). The camera and touchscreen face the Deaf user; the speaker and microphone face the hearing staff member. All processing runs on the Jetson Orin Nano inside the base, without a network connection." title="Fig. 2."/>
             <wp:cNvGraphicFramePr>
               <a:graphicFrameLocks xmlns:a="http://schemas.openxmlformats.org/drawingml/2006/main" noChangeAspect="1"/>
             </wp:cNvGraphicFramePr>
@@ -1079,15 +1330,17 @@
       </w:pPr>
       <w:r>
         <w:rPr>
+          <w:rFonts w:ascii="Times New Roman" w:cs="Times New Roman" w:eastAsia="Times New Roman" w:hAnsi="Times New Roman"/>
           <w:b/>
           <w:bCs/>
           <w:sz w:val="20"/>
           <w:szCs w:val="20"/>
         </w:rPr>
-        <w:t xml:space="preserve">Figure 2. </w:t>
-      </w:r>
-      <w:r>
-        <w:rPr>
+        <w:t xml:space="preserve">Fig. 2. </w:t>
+      </w:r>
+      <w:r>
+        <w:rPr>
+          <w:rFonts w:ascii="Times New Roman" w:cs="Times New Roman" w:eastAsia="Times New Roman" w:hAnsi="Times New Roman"/>
           <w:sz w:val="20"/>
           <w:szCs w:val="20"/>
         </w:rPr>
@@ -1101,7 +1354,12 @@
         <w:jc w:val="both"/>
       </w:pPr>
       <w:r>
-        <w:t xml:space="preserve">The recognized signs are ASL glosses, not English. ASL has its own word order and grammar, so a sequence such as STORE ME GO must become “I am going to the store.” A sentence builder performs this step, using templates for common phrases in the target setting and a small language model as a fallback, in line with recent work that applies pretrained language models to gloss-to-text translation [8]. The English sentence is shown on the touchscreen for the user to confirm or edit. Only confirmed sentences are translated into Turkish or Spanish with NLLB-200 [9] and spoken with Piper, an offline neural text-to-speech system [10]. In the reverse direction, a voice-activity detector starts listening when the hearing person speaks, and the microphone is muted while the device itself is speaking so that it does not transcribe its own voice. Whisper [11] then transcribes the reply and translates it into English, and the text appears on the same touchscreen. The hearing person needs no screen: they hear the device's speaker and speak into its microphone.</w:t>
+        <w:rPr>
+          <w:rFonts w:ascii="Times New Roman" w:cs="Times New Roman" w:eastAsia="Times New Roman" w:hAnsi="Times New Roman"/>
+          <w:sz w:val="24"/>
+          <w:szCs w:val="24"/>
+        </w:rPr>
+        <w:t xml:space="preserve">The recognized signs are ASL glosses, not English. ASL has its own word order and grammar, so a sequence such as STORE ME GO must become “I am going to the store.” A sentence builder performs this step, using templates for common phrases in the target setting and a small language model as a fallback, in line with recent work that applies pretrained language models to gloss-to-text translation [10]. The English sentence is shown on the touchscreen for the user to confirm or edit. Only confirmed sentences are translated into Turkish or Spanish with the No Language Left Behind (NLLB-200) translation model [11]. They are then spoken by Piper, an offline neural text-to-speech system [12]. In the reverse direction, a voice-activity detector starts listening when the hearing person speaks, and the microphone is muted while the device itself is speaking so that it does not transcribe its own voice. The reply is then transcribed and translated into English by the Whisper speech recognition model [13]. The text appears on the same touchscreen, so the hearing person needs no screen: they hear the device's speaker and speak into its microphone.</w:t>
       </w:r>
     </w:p>
     <w:p>
@@ -1111,7 +1369,29 @@
         <w:jc w:val="both"/>
       </w:pPr>
       <w:r>
-        <w:t xml:space="preserve">The device decides when to speak using the recognizer's confidence. If the confidence for a sign is above a threshold, the top sign is accepted; otherwise the touchscreen shows the five most likely candidates and the user picks one or signs again. Nothing is spoken until the user confirms the complete English sentence. This follows the idea of selective prediction, in which a model may abstain on uncertain inputs to raise accuracy on the answers it does give [12]. We will evaluate this trade-off with risk–coverage curves and report accuracy separately for each test signer.</w:t>
+        <w:rPr>
+          <w:rFonts w:ascii="Times New Roman" w:cs="Times New Roman" w:eastAsia="Times New Roman" w:hAnsi="Times New Roman"/>
+          <w:sz w:val="24"/>
+          <w:szCs w:val="24"/>
+        </w:rPr>
+        <w:t xml:space="preserve">The device decides when to speak using the recognizer's confidence. If the confidence for a sign is above a threshold, the top sign is accepted; otherwise the touchscreen shows the five most likely candidates and the user picks one or signs again. Nothing is spoken until the user confirms the complete English sentence. This follows the idea of selective prediction, in which a model may abstain on uncertain inputs to raise accuracy on the answers it does give [14]. We will evaluate this trade-off with risk–coverage curves and report accuracy separately for each test signer.</w:t>
+      </w:r>
+    </w:p>
+    <w:p>
+      <w:pPr>
+        <w:pStyle w:val="IntroSubsection"/>
+        <w:keepNext/>
+        <w:spacing w:after="100" w:before="200"/>
+      </w:pPr>
+      <w:r>
+        <w:rPr>
+          <w:rFonts w:ascii="Times New Roman" w:cs="Times New Roman" w:eastAsia="Times New Roman" w:hAnsi="Times New Roman"/>
+          <w:b/>
+          <w:bCs/>
+          <w:sz w:val="24"/>
+          <w:szCs w:val="24"/>
+        </w:rPr>
+        <w:t xml:space="preserve">3.5 Current Trends</w:t>
       </w:r>
     </w:p>
     <w:p>
@@ -1121,7 +1401,29 @@
         <w:jc w:val="both"/>
       </w:pPr>
       <w:r>
-        <w:t xml:space="preserve">Three trends shape the field. First, research is moving from gloss-based pipelines toward gloss-free and self-supervised models that learn from large amounts of unlabeled video [4], and pretrained language models are increasingly used for the language side of translation [8]. Second, models are moving onto consumer and embedded hardware. Landmark-based recognizers are small enough to run in real time on phones and single-board computers, which makes offline, privacy-preserving devices practical [5], [6]. Third, the field increasingly recognizes that sign language technology must be designed with Deaf communities rather than for them. Researchers have called for systems built around specific, real-world use cases with input from Deaf culture and linguistics experts [13], and Deaf and hard-of-hearing participants in recent studies emphasize Deaf-led design and warn of harm when they are excluded from decisions [14]. Our project follows the second and third trends directly; it does not attempt gloss-free continuous translation, which still requires large models and datasets.</w:t>
+        <w:rPr>
+          <w:rFonts w:ascii="Times New Roman" w:cs="Times New Roman" w:eastAsia="Times New Roman" w:hAnsi="Times New Roman"/>
+          <w:sz w:val="24"/>
+          <w:szCs w:val="24"/>
+        </w:rPr>
+        <w:t xml:space="preserve">Three trends shape the field. First, research is moving from gloss-based pipelines toward gloss-free and self-supervised models that learn from large amounts of unlabeled video [4], [5]. Pretrained language models are also increasingly used for the language side of translation [10]. Second, models are moving onto consumer and embedded hardware. Landmark-based recognizers are small enough to run in real time on phones and single-board computers, which makes offline, privacy-preserving devices practical [6], [7]. Third, the field increasingly recognizes that sign language technology must be designed with Deaf communities rather than for them. Researchers have called for systems built around specific, real-world use cases with input from Deaf culture and linguistics experts [15]. Deaf and hard-of-hearing participants in recent studies also emphasize Deaf-led design and warn of harm when they are excluded from decisions [16]. Our project follows the second and third trends directly; it does not attempt gloss-free continuous translation, which still requires large models and datasets.</w:t>
+      </w:r>
+    </w:p>
+    <w:p>
+      <w:pPr>
+        <w:pStyle w:val="IntroSubsection"/>
+        <w:keepNext/>
+        <w:spacing w:after="100" w:before="200"/>
+      </w:pPr>
+      <w:r>
+        <w:rPr>
+          <w:rFonts w:ascii="Times New Roman" w:cs="Times New Roman" w:eastAsia="Times New Roman" w:hAnsi="Times New Roman"/>
+          <w:b/>
+          <w:bCs/>
+          <w:sz w:val="24"/>
+          <w:szCs w:val="24"/>
+        </w:rPr>
+        <w:t xml:space="preserve">3.6 Existing Systems</w:t>
       </w:r>
     </w:p>
     <w:p>
@@ -1131,7 +1433,12 @@
         <w:jc w:val="both"/>
       </w:pPr>
       <w:r>
-        <w:t xml:space="preserve">No automatic ASL translation system is yet reliable enough for general use [1]. The best-known commercial effort, SignAll, combines multiple cameras with natural language processing to translate ASL into English text [15]. Patents show several other approaches, summarized in Table 2: multiple cameras with a depth sensor [16], single-camera recognition with cloud processing [17], sensor gloves [18], and an earlier glove- or camera-based system with speech output [19]. The closest to our design is Sign-Speak's system [17]. Like ours, it works from a single camera and, in one embodiment, lets the user choose among the three most likely translations. As Figure 3 shows, however, its recognition runs on a remote server, so it needs a network connection and sends the user's data off the device. Our device differs from all four in combining single-camera input, fully offline processing on an embedded GPU, confidence-gated output and speech in several languages. It is also a form factor the Deaf community is open to: 69% of the participants in [1] were comfortable using a stand-alone system of this kind, compared with 38% for wearables.</w:t>
+        <w:rPr>
+          <w:rFonts w:ascii="Times New Roman" w:cs="Times New Roman" w:eastAsia="Times New Roman" w:hAnsi="Times New Roman"/>
+          <w:sz w:val="24"/>
+          <w:szCs w:val="24"/>
+        </w:rPr>
+        <w:t xml:space="preserve">No automatic ASL translation system is yet reliable enough for general use [1]. The best-known commercial effort, SignAll, combines multiple cameras with natural language processing to translate ASL into English text [17]. Patents show several other approaches, summarized in Table 2. Avodah's system uses multiple cameras with a depth sensor [18]. Sign-Speak's system recognizes signs from a single camera using cloud processing [19]. Bosch's system uses gloves with motion sensors [20], and an earlier Hitachi system uses data gloves or a camera with speech output [21]. The closest to our design is Sign-Speak's system, which also works from a single camera and, in one embodiment, lets the user choose among the three most likely translations [19]. As Fig. 3 shows, however, its recognition runs on a remote server, so it needs a network connection and sends the user's data off the device [19]. Our device differs from all four in combining single-camera input, fully offline processing on an embedded GPU, confidence-gated output and speech in several languages. It is also a form factor the Deaf community is open to: 69% of the survey participants were comfortable using a stand-alone system of this kind, compared with 38% for wearables [1].</w:t>
       </w:r>
     </w:p>
     <w:p>
@@ -1142,6 +1449,7 @@
       </w:pPr>
       <w:r>
         <w:rPr>
+          <w:rFonts w:ascii="Times New Roman" w:cs="Times New Roman" w:eastAsia="Times New Roman" w:hAnsi="Times New Roman"/>
           <w:b/>
           <w:bCs/>
           <w:sz w:val="20"/>
@@ -1151,6 +1459,7 @@
       </w:r>
       <w:r>
         <w:rPr>
+          <w:rFonts w:ascii="Times New Roman" w:cs="Times New Roman" w:eastAsia="Times New Roman" w:hAnsi="Times New Roman"/>
           <w:sz w:val="20"/>
           <w:szCs w:val="20"/>
         </w:rPr>
@@ -1197,8 +1506,12 @@
             </w:tcMar>
           </w:tcPr>
           <w:p>
-            <w:r>
-              <w:rPr>
+            <w:pPr>
+              <w:keepNext/>
+            </w:pPr>
+            <w:r>
+              <w:rPr>
+                <w:rFonts w:ascii="Times New Roman" w:cs="Times New Roman" w:eastAsia="Times New Roman" w:hAnsi="Times New Roman"/>
                 <w:b/>
                 <w:bCs/>
                 <w:i w:val="false"/>
@@ -1227,8 +1540,12 @@
             </w:tcMar>
           </w:tcPr>
           <w:p>
-            <w:r>
-              <w:rPr>
+            <w:pPr>
+              <w:keepNext/>
+            </w:pPr>
+            <w:r>
+              <w:rPr>
+                <w:rFonts w:ascii="Times New Roman" w:cs="Times New Roman" w:eastAsia="Times New Roman" w:hAnsi="Times New Roman"/>
                 <w:b/>
                 <w:bCs/>
                 <w:i w:val="false"/>
@@ -1257,8 +1574,12 @@
             </w:tcMar>
           </w:tcPr>
           <w:p>
-            <w:r>
-              <w:rPr>
+            <w:pPr>
+              <w:keepNext/>
+            </w:pPr>
+            <w:r>
+              <w:rPr>
+                <w:rFonts w:ascii="Times New Roman" w:cs="Times New Roman" w:eastAsia="Times New Roman" w:hAnsi="Times New Roman"/>
                 <w:b/>
                 <w:bCs/>
                 <w:i w:val="false"/>
@@ -1287,8 +1608,12 @@
             </w:tcMar>
           </w:tcPr>
           <w:p>
-            <w:r>
-              <w:rPr>
+            <w:pPr>
+              <w:keepNext/>
+            </w:pPr>
+            <w:r>
+              <w:rPr>
+                <w:rFonts w:ascii="Times New Roman" w:cs="Times New Roman" w:eastAsia="Times New Roman" w:hAnsi="Times New Roman"/>
                 <w:b/>
                 <w:bCs/>
                 <w:i w:val="false"/>
@@ -1323,16 +1648,20 @@
             </w:tcMar>
           </w:tcPr>
           <w:p>
-            <w:r>
-              <w:rPr>
-                <w:b w:val="false"/>
-                <w:bCs w:val="false"/>
-                <w:i w:val="false"/>
-                <w:iCs w:val="false"/>
-                <w:sz w:val="20"/>
-                <w:szCs w:val="20"/>
-              </w:rPr>
-              <w:t xml:space="preserve">Avodah [16]</w:t>
+            <w:pPr>
+              <w:keepNext/>
+            </w:pPr>
+            <w:r>
+              <w:rPr>
+                <w:rFonts w:ascii="Times New Roman" w:cs="Times New Roman" w:eastAsia="Times New Roman" w:hAnsi="Times New Roman"/>
+                <w:b w:val="false"/>
+                <w:bCs w:val="false"/>
+                <w:i w:val="false"/>
+                <w:iCs w:val="false"/>
+                <w:sz w:val="20"/>
+                <w:szCs w:val="20"/>
+              </w:rPr>
+              <w:t xml:space="preserve">Avodah [18]</w:t>
             </w:r>
           </w:p>
         </w:tc>
@@ -1353,8 +1682,12 @@
             </w:tcMar>
           </w:tcPr>
           <w:p>
-            <w:r>
-              <w:rPr>
+            <w:pPr>
+              <w:keepNext/>
+            </w:pPr>
+            <w:r>
+              <w:rPr>
+                <w:rFonts w:ascii="Times New Roman" w:cs="Times New Roman" w:eastAsia="Times New Roman" w:hAnsi="Times New Roman"/>
                 <w:b w:val="false"/>
                 <w:bCs w:val="false"/>
                 <w:i w:val="false"/>
@@ -1383,8 +1716,12 @@
             </w:tcMar>
           </w:tcPr>
           <w:p>
-            <w:r>
-              <w:rPr>
+            <w:pPr>
+              <w:keepNext/>
+            </w:pPr>
+            <w:r>
+              <w:rPr>
+                <w:rFonts w:ascii="Times New Roman" w:cs="Times New Roman" w:eastAsia="Times New Roman" w:hAnsi="Times New Roman"/>
                 <w:b w:val="false"/>
                 <w:bCs w:val="false"/>
                 <w:i w:val="false"/>
@@ -1413,8 +1750,12 @@
             </w:tcMar>
           </w:tcPr>
           <w:p>
-            <w:r>
-              <w:rPr>
+            <w:pPr>
+              <w:keepNext/>
+            </w:pPr>
+            <w:r>
+              <w:rPr>
+                <w:rFonts w:ascii="Times New Roman" w:cs="Times New Roman" w:eastAsia="Times New Roman" w:hAnsi="Times New Roman"/>
                 <w:b w:val="false"/>
                 <w:bCs w:val="false"/>
                 <w:i w:val="false"/>
@@ -1449,16 +1790,20 @@
             </w:tcMar>
           </w:tcPr>
           <w:p>
-            <w:r>
-              <w:rPr>
-                <w:b w:val="false"/>
-                <w:bCs w:val="false"/>
-                <w:i w:val="false"/>
-                <w:iCs w:val="false"/>
-                <w:sz w:val="20"/>
-                <w:szCs w:val="20"/>
-              </w:rPr>
-              <w:t xml:space="preserve">Sign-Speak [17]</w:t>
+            <w:pPr>
+              <w:keepNext/>
+            </w:pPr>
+            <w:r>
+              <w:rPr>
+                <w:rFonts w:ascii="Times New Roman" w:cs="Times New Roman" w:eastAsia="Times New Roman" w:hAnsi="Times New Roman"/>
+                <w:b w:val="false"/>
+                <w:bCs w:val="false"/>
+                <w:i w:val="false"/>
+                <w:iCs w:val="false"/>
+                <w:sz w:val="20"/>
+                <w:szCs w:val="20"/>
+              </w:rPr>
+              <w:t xml:space="preserve">Sign-Speak [19]</w:t>
             </w:r>
           </w:p>
         </w:tc>
@@ -1479,8 +1824,12 @@
             </w:tcMar>
           </w:tcPr>
           <w:p>
-            <w:r>
-              <w:rPr>
+            <w:pPr>
+              <w:keepNext/>
+            </w:pPr>
+            <w:r>
+              <w:rPr>
+                <w:rFonts w:ascii="Times New Roman" w:cs="Times New Roman" w:eastAsia="Times New Roman" w:hAnsi="Times New Roman"/>
                 <w:b w:val="false"/>
                 <w:bCs w:val="false"/>
                 <w:i w:val="false"/>
@@ -1509,8 +1858,12 @@
             </w:tcMar>
           </w:tcPr>
           <w:p>
-            <w:r>
-              <w:rPr>
+            <w:pPr>
+              <w:keepNext/>
+            </w:pPr>
+            <w:r>
+              <w:rPr>
+                <w:rFonts w:ascii="Times New Roman" w:cs="Times New Roman" w:eastAsia="Times New Roman" w:hAnsi="Times New Roman"/>
                 <w:b w:val="false"/>
                 <w:bCs w:val="false"/>
                 <w:i w:val="false"/>
@@ -1539,8 +1892,12 @@
             </w:tcMar>
           </w:tcPr>
           <w:p>
-            <w:r>
-              <w:rPr>
+            <w:pPr>
+              <w:keepNext/>
+            </w:pPr>
+            <w:r>
+              <w:rPr>
+                <w:rFonts w:ascii="Times New Roman" w:cs="Times New Roman" w:eastAsia="Times New Roman" w:hAnsi="Times New Roman"/>
                 <w:b w:val="false"/>
                 <w:bCs w:val="false"/>
                 <w:i w:val="false"/>
@@ -1575,16 +1932,20 @@
             </w:tcMar>
           </w:tcPr>
           <w:p>
-            <w:r>
-              <w:rPr>
-                <w:b w:val="false"/>
-                <w:bCs w:val="false"/>
-                <w:i w:val="false"/>
-                <w:iCs w:val="false"/>
-                <w:sz w:val="20"/>
-                <w:szCs w:val="20"/>
-              </w:rPr>
-              <w:t xml:space="preserve">Bosch [18]</w:t>
+            <w:pPr>
+              <w:keepNext/>
+            </w:pPr>
+            <w:r>
+              <w:rPr>
+                <w:rFonts w:ascii="Times New Roman" w:cs="Times New Roman" w:eastAsia="Times New Roman" w:hAnsi="Times New Roman"/>
+                <w:b w:val="false"/>
+                <w:bCs w:val="false"/>
+                <w:i w:val="false"/>
+                <w:iCs w:val="false"/>
+                <w:sz w:val="20"/>
+                <w:szCs w:val="20"/>
+              </w:rPr>
+              <w:t xml:space="preserve">Bosch [20]</w:t>
             </w:r>
           </w:p>
         </w:tc>
@@ -1605,8 +1966,12 @@
             </w:tcMar>
           </w:tcPr>
           <w:p>
-            <w:r>
-              <w:rPr>
+            <w:pPr>
+              <w:keepNext/>
+            </w:pPr>
+            <w:r>
+              <w:rPr>
+                <w:rFonts w:ascii="Times New Roman" w:cs="Times New Roman" w:eastAsia="Times New Roman" w:hAnsi="Times New Roman"/>
                 <w:b w:val="false"/>
                 <w:bCs w:val="false"/>
                 <w:i w:val="false"/>
@@ -1635,8 +2000,12 @@
             </w:tcMar>
           </w:tcPr>
           <w:p>
-            <w:r>
-              <w:rPr>
+            <w:pPr>
+              <w:keepNext/>
+            </w:pPr>
+            <w:r>
+              <w:rPr>
+                <w:rFonts w:ascii="Times New Roman" w:cs="Times New Roman" w:eastAsia="Times New Roman" w:hAnsi="Times New Roman"/>
                 <w:b w:val="false"/>
                 <w:bCs w:val="false"/>
                 <w:i w:val="false"/>
@@ -1665,8 +2034,12 @@
             </w:tcMar>
           </w:tcPr>
           <w:p>
-            <w:r>
-              <w:rPr>
+            <w:pPr>
+              <w:keepNext/>
+            </w:pPr>
+            <w:r>
+              <w:rPr>
+                <w:rFonts w:ascii="Times New Roman" w:cs="Times New Roman" w:eastAsia="Times New Roman" w:hAnsi="Times New Roman"/>
                 <w:b w:val="false"/>
                 <w:bCs w:val="false"/>
                 <w:i w:val="false"/>
@@ -1701,16 +2074,20 @@
             </w:tcMar>
           </w:tcPr>
           <w:p>
-            <w:r>
-              <w:rPr>
-                <w:b w:val="false"/>
-                <w:bCs w:val="false"/>
-                <w:i w:val="false"/>
-                <w:iCs w:val="false"/>
-                <w:sz w:val="20"/>
-                <w:szCs w:val="20"/>
-              </w:rPr>
-              <w:t xml:space="preserve">Hitachi [19] (expired)</w:t>
+            <w:pPr>
+              <w:keepNext/>
+            </w:pPr>
+            <w:r>
+              <w:rPr>
+                <w:rFonts w:ascii="Times New Roman" w:cs="Times New Roman" w:eastAsia="Times New Roman" w:hAnsi="Times New Roman"/>
+                <w:b w:val="false"/>
+                <w:bCs w:val="false"/>
+                <w:i w:val="false"/>
+                <w:iCs w:val="false"/>
+                <w:sz w:val="20"/>
+                <w:szCs w:val="20"/>
+              </w:rPr>
+              <w:t xml:space="preserve">Hitachi [21] (expired)</w:t>
             </w:r>
           </w:p>
         </w:tc>
@@ -1731,8 +2108,12 @@
             </w:tcMar>
           </w:tcPr>
           <w:p>
-            <w:r>
-              <w:rPr>
+            <w:pPr>
+              <w:keepNext/>
+            </w:pPr>
+            <w:r>
+              <w:rPr>
+                <w:rFonts w:ascii="Times New Roman" w:cs="Times New Roman" w:eastAsia="Times New Roman" w:hAnsi="Times New Roman"/>
                 <w:b w:val="false"/>
                 <w:bCs w:val="false"/>
                 <w:i w:val="false"/>
@@ -1761,8 +2142,12 @@
             </w:tcMar>
           </w:tcPr>
           <w:p>
-            <w:r>
-              <w:rPr>
+            <w:pPr>
+              <w:keepNext/>
+            </w:pPr>
+            <w:r>
+              <w:rPr>
+                <w:rFonts w:ascii="Times New Roman" w:cs="Times New Roman" w:eastAsia="Times New Roman" w:hAnsi="Times New Roman"/>
                 <w:b w:val="false"/>
                 <w:bCs w:val="false"/>
                 <w:i w:val="false"/>
@@ -1791,8 +2176,12 @@
             </w:tcMar>
           </w:tcPr>
           <w:p>
-            <w:r>
-              <w:rPr>
+            <w:pPr>
+              <w:keepNext/>
+            </w:pPr>
+            <w:r>
+              <w:rPr>
+                <w:rFonts w:ascii="Times New Roman" w:cs="Times New Roman" w:eastAsia="Times New Roman" w:hAnsi="Times New Roman"/>
                 <w:b w:val="false"/>
                 <w:bCs w:val="false"/>
                 <w:i w:val="false"/>
@@ -1827,8 +2216,12 @@
             </w:tcMar>
           </w:tcPr>
           <w:p>
-            <w:r>
-              <w:rPr>
+            <w:pPr>
+              <w:keepNext w:val="false"/>
+            </w:pPr>
+            <w:r>
+              <w:rPr>
+                <w:rFonts w:ascii="Times New Roman" w:cs="Times New Roman" w:eastAsia="Times New Roman" w:hAnsi="Times New Roman"/>
                 <w:b w:val="false"/>
                 <w:bCs w:val="false"/>
                 <w:i/>
@@ -1857,8 +2250,12 @@
             </w:tcMar>
           </w:tcPr>
           <w:p>
-            <w:r>
-              <w:rPr>
+            <w:pPr>
+              <w:keepNext w:val="false"/>
+            </w:pPr>
+            <w:r>
+              <w:rPr>
+                <w:rFonts w:ascii="Times New Roman" w:cs="Times New Roman" w:eastAsia="Times New Roman" w:hAnsi="Times New Roman"/>
                 <w:b w:val="false"/>
                 <w:bCs w:val="false"/>
                 <w:i w:val="false"/>
@@ -1887,8 +2284,12 @@
             </w:tcMar>
           </w:tcPr>
           <w:p>
-            <w:r>
-              <w:rPr>
+            <w:pPr>
+              <w:keepNext w:val="false"/>
+            </w:pPr>
+            <w:r>
+              <w:rPr>
+                <w:rFonts w:ascii="Times New Roman" w:cs="Times New Roman" w:eastAsia="Times New Roman" w:hAnsi="Times New Roman"/>
                 <w:b w:val="false"/>
                 <w:bCs w:val="false"/>
                 <w:i w:val="false"/>
@@ -1917,8 +2318,12 @@
             </w:tcMar>
           </w:tcPr>
           <w:p>
-            <w:r>
-              <w:rPr>
+            <w:pPr>
+              <w:keepNext w:val="false"/>
+            </w:pPr>
+            <w:r>
+              <w:rPr>
+                <w:rFonts w:ascii="Times New Roman" w:cs="Times New Roman" w:eastAsia="Times New Roman" w:hAnsi="Times New Roman"/>
                 <w:b w:val="false"/>
                 <w:bCs w:val="false"/>
                 <w:i w:val="false"/>
@@ -1948,7 +2353,7 @@
           <wp:inline distT="0" distB="0" distL="0" distR="0">
             <wp:extent cx="5120640" cy="2981325"/>
             <wp:effectExtent t="0" r="0" b="0" l="0"/>
-            <wp:docPr id="1" name="Figure 3." descr="Translation architecture in the Sign-Speak patent. A mobile capture device sends data to a remote server, where features are extracted and signs are matched against a sign and sentence base. Reproduced from U.S. Patent Appl. Pub. 2022/0327961 A1 [17]." title="Figure 3."/>
+            <wp:docPr id="1" name="Fig. 3." descr="Translation architecture in the Sign-Speak patent. A mobile capture device sends data to a remote server, where features are extracted and signs are matched against a sign and sentence base. Reproduced from U.S. Patent Appl. Pub. 2022/0327961 A1 [19]." title="Fig. 3."/>
             <wp:cNvGraphicFramePr>
               <a:graphicFrameLocks xmlns:a="http://schemas.openxmlformats.org/drawingml/2006/main" noChangeAspect="1"/>
             </wp:cNvGraphicFramePr>
@@ -1992,19 +2397,38 @@
       </w:pPr>
       <w:r>
         <w:rPr>
+          <w:rFonts w:ascii="Times New Roman" w:cs="Times New Roman" w:eastAsia="Times New Roman" w:hAnsi="Times New Roman"/>
           <w:b/>
           <w:bCs/>
           <w:sz w:val="20"/>
           <w:szCs w:val="20"/>
         </w:rPr>
-        <w:t xml:space="preserve">Figure 3. </w:t>
-      </w:r>
-      <w:r>
-        <w:rPr>
+        <w:t xml:space="preserve">Fig. 3. </w:t>
+      </w:r>
+      <w:r>
+        <w:rPr>
+          <w:rFonts w:ascii="Times New Roman" w:cs="Times New Roman" w:eastAsia="Times New Roman" w:hAnsi="Times New Roman"/>
           <w:sz w:val="20"/>
           <w:szCs w:val="20"/>
         </w:rPr>
-        <w:t xml:space="preserve">Translation architecture in the Sign-Speak patent. A mobile capture device sends data to a remote server, where features are extracted and signs are matched against a sign and sentence base. Reproduced from U.S. Patent Appl. Pub. 2022/0327961 A1 [17].</w:t>
+        <w:t xml:space="preserve">Translation architecture in the Sign-Speak patent. A mobile capture device sends data to a remote server, where features are extracted and signs are matched against a sign and sentence base. Reproduced from U.S. Patent Appl. Pub. 2022/0327961 A1 [19].</w:t>
+      </w:r>
+    </w:p>
+    <w:p>
+      <w:pPr>
+        <w:pStyle w:val="IntroSubsection"/>
+        <w:keepNext/>
+        <w:spacing w:after="100" w:before="200"/>
+      </w:pPr>
+      <w:r>
+        <w:rPr>
+          <w:rFonts w:ascii="Times New Roman" w:cs="Times New Roman" w:eastAsia="Times New Roman" w:hAnsi="Times New Roman"/>
+          <w:b/>
+          <w:bCs/>
+          <w:sz w:val="24"/>
+          <w:szCs w:val="24"/>
+        </w:rPr>
+        <w:t xml:space="preserve">3.7 Ethics, Economics and Sustainability</w:t>
       </w:r>
     </w:p>
     <w:p>
@@ -2014,7 +2438,12 @@
         <w:jc w:val="both"/>
       </w:pPr>
       <w:r>
-        <w:t xml:space="preserve">Surveys of Deaf communities also identify the ethical risks of this technology. In [1], more than 80% of participants were concerned about hearing people profiting from ASL, systems missing ASL grammatical features, automatic translation weakening the legal right to other accommodations, and poorer performance for some users than others. A 2025 global survey found the same pattern: about 80% of Deaf respondents were concerned about hearing people making money from sign language technology, and about 70% about the lack of Deaf people leading or contributing to it (Figure 4) [14]. We address these concerns directly. The device is presented as a way to communicate when an interpreter is unavailable, not as a substitute that could justify withholding one. Its limits are stated plainly: it recognizes individual signs and does not capture facial grammar or continuous signing. Accuracy will be reported for each test signer, not only as an average. We will seek input from Deaf ASL users when choosing the vocabulary and testing the device, as recommended in [13] and [14]. Because video never leaves the device, the design also avoids the privacy risk of streaming a user's image to a remote server.</w:t>
+        <w:rPr>
+          <w:rFonts w:ascii="Times New Roman" w:cs="Times New Roman" w:eastAsia="Times New Roman" w:hAnsi="Times New Roman"/>
+          <w:sz w:val="24"/>
+          <w:szCs w:val="24"/>
+        </w:rPr>
+        <w:t xml:space="preserve">Surveys of Deaf communities also identify the ethical risks of this technology. More than 80% of the participants in the U.S. survey were concerned about hearing people profiting from ASL, systems missing ASL grammatical features, automatic translation weakening the legal right to other accommodations, and poorer performance for some users than others [1]. A 2025 global survey found the same pattern: about 80% of Deaf respondents were concerned about hearing people making money from sign language technology, and about 70% about the lack of Deaf people leading or contributing to it (Fig. 4) [16]. We address these concerns directly. The device is presented as a way to communicate when an interpreter is unavailable, not as a substitute that could justify withholding one. Its limits are stated plainly: it recognizes individual signs and does not capture facial grammar or continuous signing. Accuracy will be reported for each test signer, not only as an average. We will seek input from Deaf ASL users when choosing the vocabulary and testing the device, as recommended by previous studies [15], [16]. Because video never leaves the device, the design also avoids the privacy risk of streaming a user's image to a remote server.</w:t>
       </w:r>
     </w:p>
     <w:p>
@@ -2028,7 +2457,7 @@
           <wp:inline distT="0" distB="0" distL="0" distR="0">
             <wp:extent cx="5760720" cy="1619250"/>
             <wp:effectExtent t="0" r="0" b="0" l="0"/>
-            <wp:docPr id="1" name="Figure 4." descr="Concerns about sign language technologies among Deaf, hard-of-hearing and hearing respondents in a global survey; numbers in parentheses are the number of mentions. Reproduced from Atwell et al. [14] under the CC BY 4.0 license." title="Figure 4."/>
+            <wp:docPr id="1" name="Fig. 4." descr="Concerns about sign language technologies among Deaf, hard-of-hearing and hearing respondents in a global survey; numbers in parentheses are the number of mentions. Reproduced from Atwell et al. [16] under the Creative Commons Attribution 4.0 (CC BY 4.0) license." title="Fig. 4."/>
             <wp:cNvGraphicFramePr>
               <a:graphicFrameLocks xmlns:a="http://schemas.openxmlformats.org/drawingml/2006/main" noChangeAspect="1"/>
             </wp:cNvGraphicFramePr>
@@ -2072,19 +2501,21 @@
       </w:pPr>
       <w:r>
         <w:rPr>
+          <w:rFonts w:ascii="Times New Roman" w:cs="Times New Roman" w:eastAsia="Times New Roman" w:hAnsi="Times New Roman"/>
           <w:b/>
           <w:bCs/>
           <w:sz w:val="20"/>
           <w:szCs w:val="20"/>
         </w:rPr>
-        <w:t xml:space="preserve">Figure 4. </w:t>
-      </w:r>
-      <w:r>
-        <w:rPr>
+        <w:t xml:space="preserve">Fig. 4. </w:t>
+      </w:r>
+      <w:r>
+        <w:rPr>
+          <w:rFonts w:ascii="Times New Roman" w:cs="Times New Roman" w:eastAsia="Times New Roman" w:hAnsi="Times New Roman"/>
           <w:sz w:val="20"/>
           <w:szCs w:val="20"/>
         </w:rPr>
-        <w:t xml:space="preserve">Concerns about sign language technologies among Deaf, hard-of-hearing and hearing respondents in a global survey; numbers in parentheses are the number of mentions. Reproduced from Atwell et al. [14] under the CC BY 4.0 license.</w:t>
+        <w:t xml:space="preserve">Concerns about sign language technologies among Deaf, hard-of-hearing and hearing respondents in a global survey; numbers in parentheses are the number of mentions. Reproduced from Atwell et al. [16] under the Creative Commons Attribution 4.0 (CC BY 4.0) license.</w:t>
       </w:r>
     </w:p>
     <w:p>
@@ -2094,200 +2525,706 @@
         <w:jc w:val="both"/>
       </w:pPr>
       <w:r>
-        <w:t xml:space="preserve">Economically, certified interpreters are costly and often must be scheduled in advance [1]. Our device is built from off-the-shelf components (an embedded GPU module, a camera, a microphone, a speaker and a display) and uses open-source models, so once built it has no per-use service fees or cloud costs. For sustainability, it runs on a low-power embedded module rather than a desktop GPU or cloud servers, which keeps energy use low and avoids continuous data transmission. Standard, replaceable components make the device repairable and upgradable, and the software can be moved to newer hardware instead of the device being discarded.</w:t>
-      </w:r>
-    </w:p>
-    <w:p>
-      <w:pPr>
-        <w:spacing w:after="120" w:line="360"/>
-      </w:pPr>
-      <w:r>
-        <w:rPr>
+        <w:rPr>
+          <w:rFonts w:ascii="Times New Roman" w:cs="Times New Roman" w:eastAsia="Times New Roman" w:hAnsi="Times New Roman"/>
+          <w:sz w:val="24"/>
+          <w:szCs w:val="24"/>
+        </w:rPr>
+        <w:t xml:space="preserve">Economically, certified interpreters are costly and often must be scheduled in advance [1]. Our device is built from off-the-shelf components (an embedded GPU module, a camera, a microphone, a speaker and a display) and uses open-source models, so once built it has no per-use service fees or cloud costs. A detailed cost estimate is given in Section 9. For sustainability, the device runs on a low-power embedded module rather than a desktop GPU or cloud servers, which keeps energy use low and avoids continuous data transmission. Standard, replaceable components make the device repairable and upgradable, and the software can be moved to newer hardware instead of the device being discarded.</w:t>
+      </w:r>
+    </w:p>
+    <w:p>
+      <w:r>
+        <w:br w:type="page"/>
+      </w:r>
+    </w:p>
+    <w:p>
+      <w:pPr>
+        <w:pStyle w:val="IntroSection"/>
+        <w:keepNext/>
+        <w:spacing w:after="120" w:before="0"/>
+      </w:pPr>
+      <w:r>
+        <w:rPr>
+          <w:rFonts w:ascii="Times New Roman" w:cs="Times New Roman" w:eastAsia="Times New Roman" w:hAnsi="Times New Roman"/>
+          <w:b/>
+          <w:bCs/>
+          <w:sz w:val="24"/>
+          <w:szCs w:val="24"/>
+        </w:rPr>
+        <w:t xml:space="preserve">12. References</w:t>
+      </w:r>
+    </w:p>
+    <w:p>
+      <w:pPr>
+        <w:spacing w:after="120"/>
+        <w:ind w:left="432" w:hanging="432"/>
+      </w:pPr>
+      <w:r>
+        <w:rPr>
+          <w:rFonts w:ascii="Times New Roman" w:cs="Times New Roman" w:eastAsia="Times New Roman" w:hAnsi="Times New Roman"/>
+          <w:sz w:val="24"/>
+          <w:szCs w:val="24"/>
+        </w:rPr>
+        <w:t xml:space="preserve">1.	Tran, N., Ladner, R. E., and Bragg, D. U.S. Deaf community perspectives on automatic sign language translation. </w:t>
+      </w:r>
+      <w:r>
+        <w:rPr>
+          <w:rFonts w:ascii="Times New Roman" w:cs="Times New Roman" w:eastAsia="Times New Roman" w:hAnsi="Times New Roman"/>
           <w:i/>
           <w:iCs/>
-          <w:color w:val="808080"/>
-        </w:rPr>
-        <w:t xml:space="preserve">[Add a cross-reference to the budget section once it is written.]</w:t>
-      </w:r>
-    </w:p>
-    <w:p>
-      <w:pPr>
-        <w:pStyle w:val="Heading1"/>
-        <w:spacing w:after="120" w:before="480"/>
-      </w:pPr>
-      <w:r>
-        <w:t xml:space="preserve">References (to be moved to Section 12)</w:t>
+          <w:sz w:val="24"/>
+          <w:szCs w:val="24"/>
+        </w:rPr>
+        <w:t xml:space="preserve">Proceedings of the 25th International ACM SIGACCESS Conference on Computers and Accessibility (ASSETS ’23)</w:t>
+      </w:r>
+      <w:r>
+        <w:rPr>
+          <w:rFonts w:ascii="Times New Roman" w:cs="Times New Roman" w:eastAsia="Times New Roman" w:hAnsi="Times New Roman"/>
+          <w:sz w:val="24"/>
+          <w:szCs w:val="24"/>
+        </w:rPr>
+        <w:t xml:space="preserve">, New York, NY, USA, 2023. doi:10.1145/3597638.3614507.</w:t>
       </w:r>
     </w:p>
     <w:p>
       <w:pPr>
         <w:spacing w:after="120"/>
-        <w:ind w:left="720" w:hanging="720"/>
-      </w:pPr>
-      <w:r>
-        <w:t xml:space="preserve">[1]	N. Tran, R. E. Ladner, and D. Bragg, “U.S. Deaf community perspectives on automatic sign language translation,” in Proc. 25th Int. ACM SIGACCESS Conf. Computers and Accessibility (ASSETS ’23), New York, NY, USA, 2023, doi: 10.1145/3597638.3614507.</w:t>
+        <w:ind w:left="432" w:hanging="432"/>
+      </w:pPr>
+      <w:r>
+        <w:rPr>
+          <w:rFonts w:ascii="Times New Roman" w:cs="Times New Roman" w:eastAsia="Times New Roman" w:hAnsi="Times New Roman"/>
+          <w:sz w:val="24"/>
+          <w:szCs w:val="24"/>
+        </w:rPr>
+        <w:t xml:space="preserve">2.	Desai, A., Berger, L., Minakov, F. O., Milan, V., Singh, C., Pumphrey, K., Ladner, R. E., Daumé III, H., Lu, A. X., Caselli, N., and Bragg, D. ASL Citizen: A community-sourced dataset for advancing isolated sign language recognition. </w:t>
+      </w:r>
+      <w:r>
+        <w:rPr>
+          <w:rFonts w:ascii="Times New Roman" w:cs="Times New Roman" w:eastAsia="Times New Roman" w:hAnsi="Times New Roman"/>
+          <w:i/>
+          <w:iCs/>
+          <w:sz w:val="24"/>
+          <w:szCs w:val="24"/>
+        </w:rPr>
+        <w:t xml:space="preserve">Advances in Neural Information Processing Systems</w:t>
+      </w:r>
+      <w:r>
+        <w:rPr>
+          <w:rFonts w:ascii="Times New Roman" w:cs="Times New Roman" w:eastAsia="Times New Roman" w:hAnsi="Times New Roman"/>
+          <w:sz w:val="24"/>
+          <w:szCs w:val="24"/>
+        </w:rPr>
+        <w:t xml:space="preserve">, 36 (Datasets and Benchmarks Track), 2023. arXiv:2304.05934.</w:t>
       </w:r>
     </w:p>
     <w:p>
       <w:pPr>
         <w:spacing w:after="120"/>
-        <w:ind w:left="720" w:hanging="720"/>
-      </w:pPr>
-      <w:r>
-        <w:t xml:space="preserve">[2]	A. Desai et al., “ASL Citizen: A community-sourced dataset for advancing isolated sign language recognition,” in Advances in Neural Information Processing Systems (NeurIPS) Datasets and Benchmarks Track, 2023, arXiv:2304.05934.</w:t>
+        <w:ind w:left="432" w:hanging="432"/>
+      </w:pPr>
+      <w:r>
+        <w:rPr>
+          <w:rFonts w:ascii="Times New Roman" w:cs="Times New Roman" w:eastAsia="Times New Roman" w:hAnsi="Times New Roman"/>
+          <w:sz w:val="24"/>
+          <w:szCs w:val="24"/>
+        </w:rPr>
+        <w:t xml:space="preserve">3.	Zhang, X., and Duh, K. Approaching sign language gloss translation as a low-resource machine translation task. </w:t>
+      </w:r>
+      <w:r>
+        <w:rPr>
+          <w:rFonts w:ascii="Times New Roman" w:cs="Times New Roman" w:eastAsia="Times New Roman" w:hAnsi="Times New Roman"/>
+          <w:i/>
+          <w:iCs/>
+          <w:sz w:val="24"/>
+          <w:szCs w:val="24"/>
+        </w:rPr>
+        <w:t xml:space="preserve">Proceedings of the 1st International Workshop on Automatic Translation for Signed and Spoken Languages (AT4SSL)</w:t>
+      </w:r>
+      <w:r>
+        <w:rPr>
+          <w:rFonts w:ascii="Times New Roman" w:cs="Times New Roman" w:eastAsia="Times New Roman" w:hAnsi="Times New Roman"/>
+          <w:sz w:val="24"/>
+          <w:szCs w:val="24"/>
+        </w:rPr>
+        <w:t xml:space="preserve">, 60–70, 2021.</w:t>
       </w:r>
     </w:p>
     <w:p>
       <w:pPr>
         <w:spacing w:after="120"/>
-        <w:ind w:left="720" w:hanging="720"/>
-      </w:pPr>
-      <w:r>
-        <w:t xml:space="preserve">[3]	X. Zhang and K. Duh, “Improving sign language gloss translation with low-resource machine translation techniques.” [Online]. Available: https://www.cs.jhu.edu/~xzhan138/papers/SLMT_Book_G2T.pdf</w:t>
+        <w:ind w:left="432" w:hanging="432"/>
+      </w:pPr>
+      <w:r>
+        <w:rPr>
+          <w:rFonts w:ascii="Times New Roman" w:cs="Times New Roman" w:eastAsia="Times New Roman" w:hAnsi="Times New Roman"/>
+          <w:sz w:val="24"/>
+          <w:szCs w:val="24"/>
+        </w:rPr>
+        <w:t xml:space="preserve">4.	Hu, J., He, Z., Huang, H., Li, Z., Li, Z., and Fang, Y. SignDino: Self-supervised sign language representation learning via temporal-axis self-distillation. </w:t>
+      </w:r>
+      <w:r>
+        <w:rPr>
+          <w:rFonts w:ascii="Times New Roman" w:cs="Times New Roman" w:eastAsia="Times New Roman" w:hAnsi="Times New Roman"/>
+          <w:i/>
+          <w:iCs/>
+          <w:sz w:val="24"/>
+          <w:szCs w:val="24"/>
+        </w:rPr>
+        <w:t xml:space="preserve">arXiv preprint</w:t>
+      </w:r>
+      <w:r>
+        <w:rPr>
+          <w:rFonts w:ascii="Times New Roman" w:cs="Times New Roman" w:eastAsia="Times New Roman" w:hAnsi="Times New Roman"/>
+          <w:sz w:val="24"/>
+          <w:szCs w:val="24"/>
+        </w:rPr>
+        <w:t xml:space="preserve"> arXiv:2609.06296, 2026.</w:t>
       </w:r>
     </w:p>
     <w:p>
       <w:pPr>
         <w:spacing w:after="120"/>
-        <w:ind w:left="720" w:hanging="720"/>
-      </w:pPr>
-      <w:r>
-        <w:t xml:space="preserve">[4]	J. Hu, Z. He, H. Huang, Z. Li, Z. Li, and Y. Fang, “SignDino: Self-supervised sign language representation learning via temporal-axis self-distillation,” 2026, arXiv:2609.06296.</w:t>
+        <w:ind w:left="432" w:hanging="432"/>
+      </w:pPr>
+      <w:r>
+        <w:rPr>
+          <w:rFonts w:ascii="Times New Roman" w:cs="Times New Roman" w:eastAsia="Times New Roman" w:hAnsi="Times New Roman"/>
+          <w:sz w:val="24"/>
+          <w:szCs w:val="24"/>
+        </w:rPr>
+        <w:t xml:space="preserve">5.	Gan, S., Liu, X., Yin, Y., Liu, N., Liu, K., Tuerdaken, D., Jiang, Z., Xie, L., Lu, S., and Wen, H. Learning effective sign features without text for gloss-free sign language translation. </w:t>
+      </w:r>
+      <w:r>
+        <w:rPr>
+          <w:rFonts w:ascii="Times New Roman" w:cs="Times New Roman" w:eastAsia="Times New Roman" w:hAnsi="Times New Roman"/>
+          <w:i/>
+          <w:iCs/>
+          <w:sz w:val="24"/>
+          <w:szCs w:val="24"/>
+        </w:rPr>
+        <w:t xml:space="preserve">Proceedings of the IEEE/CVF Conference on Computer Vision and Pattern Recognition (CVPR)</w:t>
+      </w:r>
+      <w:r>
+        <w:rPr>
+          <w:rFonts w:ascii="Times New Roman" w:cs="Times New Roman" w:eastAsia="Times New Roman" w:hAnsi="Times New Roman"/>
+          <w:sz w:val="24"/>
+          <w:szCs w:val="24"/>
+        </w:rPr>
+        <w:t xml:space="preserve">, 9827–9836, 2026.</w:t>
       </w:r>
     </w:p>
     <w:p>
       <w:pPr>
         <w:spacing w:after="120"/>
-        <w:ind w:left="720" w:hanging="720"/>
-      </w:pPr>
-      <w:r>
-        <w:t xml:space="preserve">[5]	C. Lugaresi et al., “MediaPipe: A framework for building perception pipelines,” 2019, arXiv:1906.08172.</w:t>
+        <w:ind w:left="432" w:hanging="432"/>
+      </w:pPr>
+      <w:r>
+        <w:rPr>
+          <w:rFonts w:ascii="Times New Roman" w:cs="Times New Roman" w:eastAsia="Times New Roman" w:hAnsi="Times New Roman"/>
+          <w:sz w:val="24"/>
+          <w:szCs w:val="24"/>
+        </w:rPr>
+        <w:t xml:space="preserve">6.	Lugaresi, C., Tang, J., Nash, H., McClanahan, C., Uboweja, E., Hays, M., Zhang, F., Chang, C.-L., Yong, M. G., Lee, J., Chang, W.-T., Hua, W., Georg, M., and Grundmann, M. MediaPipe: A framework for building perception pipelines. </w:t>
+      </w:r>
+      <w:r>
+        <w:rPr>
+          <w:rFonts w:ascii="Times New Roman" w:cs="Times New Roman" w:eastAsia="Times New Roman" w:hAnsi="Times New Roman"/>
+          <w:i/>
+          <w:iCs/>
+          <w:sz w:val="24"/>
+          <w:szCs w:val="24"/>
+        </w:rPr>
+        <w:t xml:space="preserve">arXiv preprint</w:t>
+      </w:r>
+      <w:r>
+        <w:rPr>
+          <w:rFonts w:ascii="Times New Roman" w:cs="Times New Roman" w:eastAsia="Times New Roman" w:hAnsi="Times New Roman"/>
+          <w:sz w:val="24"/>
+          <w:szCs w:val="24"/>
+        </w:rPr>
+        <w:t xml:space="preserve"> arXiv:1906.08172, 2019.</w:t>
       </w:r>
     </w:p>
     <w:p>
       <w:pPr>
         <w:spacing w:after="120"/>
-        <w:ind w:left="720" w:hanging="720"/>
-      </w:pPr>
-      <w:r>
-        <w:t xml:space="preserve">[6]	H. Sohn, “1st place solution – 1DCNN combined with Transformer,” Google – Isolated Sign Language Recognition competition, Kaggle, 2023. [Online]. Available: https://www.kaggle.com/competitions/asl-signs/writeups/hoyeol-sohn-1st-place-solution-1dcnn-combined-with</w:t>
+        <w:ind w:left="432" w:hanging="432"/>
+      </w:pPr>
+      <w:r>
+        <w:rPr>
+          <w:rFonts w:ascii="Times New Roman" w:cs="Times New Roman" w:eastAsia="Times New Roman" w:hAnsi="Times New Roman"/>
+          <w:sz w:val="24"/>
+          <w:szCs w:val="24"/>
+        </w:rPr>
+        <w:t xml:space="preserve">7.	Sohn, H. 1st place solution: 1DCNN combined with Transformer. </w:t>
+      </w:r>
+      <w:r>
+        <w:rPr>
+          <w:rFonts w:ascii="Times New Roman" w:cs="Times New Roman" w:eastAsia="Times New Roman" w:hAnsi="Times New Roman"/>
+          <w:i/>
+          <w:iCs/>
+          <w:sz w:val="24"/>
+          <w:szCs w:val="24"/>
+        </w:rPr>
+        <w:t xml:space="preserve">Google – Isolated Sign Language Recognition Competition, Kaggle</w:t>
+      </w:r>
+      <w:r>
+        <w:rPr>
+          <w:rFonts w:ascii="Times New Roman" w:cs="Times New Roman" w:eastAsia="Times New Roman" w:hAnsi="Times New Roman"/>
+          <w:sz w:val="24"/>
+          <w:szCs w:val="24"/>
+        </w:rPr>
+        <w:t xml:space="preserve">, 2023. Available: https://www.kaggle.com/competitions/asl-signs/writeups/hoyeol-sohn-1st-place-solution-1dcnn-combined-with [Accessed: 25-Sep-2026].</w:t>
       </w:r>
     </w:p>
     <w:p>
       <w:pPr>
         <w:spacing w:after="120"/>
-        <w:ind w:left="720" w:hanging="720"/>
-      </w:pPr>
-      <w:r>
-        <w:t xml:space="preserve">[7]	A. Moryossef, Z. Jiang, M. Müller, S. Ebling, and Y. Goldberg, “Linguistically motivated sign language segmentation,” in Findings of the Association for Computational Linguistics: EMNLP 2023, arXiv:2310.13960.</w:t>
+        <w:ind w:left="432" w:hanging="432"/>
+      </w:pPr>
+      <w:r>
+        <w:rPr>
+          <w:rFonts w:ascii="Times New Roman" w:cs="Times New Roman" w:eastAsia="Times New Roman" w:hAnsi="Times New Roman"/>
+          <w:sz w:val="24"/>
+          <w:szCs w:val="24"/>
+        </w:rPr>
+        <w:t xml:space="preserve">8.	Licciardello, R., Fargetta, G., Ortis, A., and Battiato, S. CSLRTransformer: A pose-only system for continuous sign language recognition. </w:t>
+      </w:r>
+      <w:r>
+        <w:rPr>
+          <w:rFonts w:ascii="Times New Roman" w:cs="Times New Roman" w:eastAsia="Times New Roman" w:hAnsi="Times New Roman"/>
+          <w:i/>
+          <w:iCs/>
+          <w:sz w:val="24"/>
+          <w:szCs w:val="24"/>
+        </w:rPr>
+        <w:t xml:space="preserve">Proceedings of the IEEE/CVF Conference on Computer Vision and Pattern Recognition (CVPR) Workshops</w:t>
+      </w:r>
+      <w:r>
+        <w:rPr>
+          <w:rFonts w:ascii="Times New Roman" w:cs="Times New Roman" w:eastAsia="Times New Roman" w:hAnsi="Times New Roman"/>
+          <w:sz w:val="24"/>
+          <w:szCs w:val="24"/>
+        </w:rPr>
+        <w:t xml:space="preserve">, 2026.</w:t>
       </w:r>
     </w:p>
     <w:p>
       <w:pPr>
         <w:spacing w:after="120"/>
-        <w:ind w:left="720" w:hanging="720"/>
-      </w:pPr>
-      <w:r>
-        <w:t xml:space="preserve">[8]	P. Fayyazsanavi, A. Anastasopoulos, and J. Košecká, “Gloss2Text: Sign language gloss translation using LLMs and semantically aware label smoothing,” 2024, arXiv:2407.01394.</w:t>
+        <w:ind w:left="432" w:hanging="432"/>
+      </w:pPr>
+      <w:r>
+        <w:rPr>
+          <w:rFonts w:ascii="Times New Roman" w:cs="Times New Roman" w:eastAsia="Times New Roman" w:hAnsi="Times New Roman"/>
+          <w:sz w:val="24"/>
+          <w:szCs w:val="24"/>
+        </w:rPr>
+        <w:t xml:space="preserve">9.	Moryossef, A., Jiang, Z., Müller, M., Ebling, S., and Goldberg, Y. Linguistically motivated sign language segmentation. </w:t>
+      </w:r>
+      <w:r>
+        <w:rPr>
+          <w:rFonts w:ascii="Times New Roman" w:cs="Times New Roman" w:eastAsia="Times New Roman" w:hAnsi="Times New Roman"/>
+          <w:i/>
+          <w:iCs/>
+          <w:sz w:val="24"/>
+          <w:szCs w:val="24"/>
+        </w:rPr>
+        <w:t xml:space="preserve">Findings of the Association for Computational Linguistics: EMNLP 2023</w:t>
+      </w:r>
+      <w:r>
+        <w:rPr>
+          <w:rFonts w:ascii="Times New Roman" w:cs="Times New Roman" w:eastAsia="Times New Roman" w:hAnsi="Times New Roman"/>
+          <w:sz w:val="24"/>
+          <w:szCs w:val="24"/>
+        </w:rPr>
+        <w:t xml:space="preserve">, 12703–12724, 2023.</w:t>
       </w:r>
     </w:p>
     <w:p>
       <w:pPr>
         <w:spacing w:after="120"/>
-        <w:ind w:left="720" w:hanging="720"/>
-      </w:pPr>
-      <w:r>
-        <w:t xml:space="preserve">[9]	NLLB Team et al., “No Language Left Behind: Scaling human-centered machine translation,” 2022, arXiv:2207.04672.</w:t>
+        <w:ind w:left="432" w:hanging="432"/>
+      </w:pPr>
+      <w:r>
+        <w:rPr>
+          <w:rFonts w:ascii="Times New Roman" w:cs="Times New Roman" w:eastAsia="Times New Roman" w:hAnsi="Times New Roman"/>
+          <w:sz w:val="24"/>
+          <w:szCs w:val="24"/>
+        </w:rPr>
+        <w:t xml:space="preserve">10.	Fayyazsanavi, P., Anastasopoulos, A., and Košecká, J. Gloss2Text: Sign language gloss translation using LLMs and semantically aware label smoothing. </w:t>
+      </w:r>
+      <w:r>
+        <w:rPr>
+          <w:rFonts w:ascii="Times New Roman" w:cs="Times New Roman" w:eastAsia="Times New Roman" w:hAnsi="Times New Roman"/>
+          <w:i/>
+          <w:iCs/>
+          <w:sz w:val="24"/>
+          <w:szCs w:val="24"/>
+        </w:rPr>
+        <w:t xml:space="preserve">Findings of the Association for Computational Linguistics: EMNLP 2024</w:t>
+      </w:r>
+      <w:r>
+        <w:rPr>
+          <w:rFonts w:ascii="Times New Roman" w:cs="Times New Roman" w:eastAsia="Times New Roman" w:hAnsi="Times New Roman"/>
+          <w:sz w:val="24"/>
+          <w:szCs w:val="24"/>
+        </w:rPr>
+        <w:t xml:space="preserve">, 16162–16171, 2024.</w:t>
       </w:r>
     </w:p>
     <w:p>
       <w:pPr>
         <w:spacing w:after="120"/>
-        <w:ind w:left="720" w:hanging="720"/>
-      </w:pPr>
-      <w:r>
-        <w:t xml:space="preserve">[10]	Rhasspy, “Piper: A fast, local neural text to speech system.” [Online]. Available: https://github.com/rhasspy/piper</w:t>
+        <w:ind w:left="432" w:hanging="432"/>
+      </w:pPr>
+      <w:r>
+        <w:rPr>
+          <w:rFonts w:ascii="Times New Roman" w:cs="Times New Roman" w:eastAsia="Times New Roman" w:hAnsi="Times New Roman"/>
+          <w:sz w:val="24"/>
+          <w:szCs w:val="24"/>
+        </w:rPr>
+        <w:t xml:space="preserve">11.	NLLB Team, Costa-jussà, M. R., Cross, J., et al. No Language Left Behind: Scaling human-centered machine translation. </w:t>
+      </w:r>
+      <w:r>
+        <w:rPr>
+          <w:rFonts w:ascii="Times New Roman" w:cs="Times New Roman" w:eastAsia="Times New Roman" w:hAnsi="Times New Roman"/>
+          <w:i/>
+          <w:iCs/>
+          <w:sz w:val="24"/>
+          <w:szCs w:val="24"/>
+        </w:rPr>
+        <w:t xml:space="preserve">arXiv preprint</w:t>
+      </w:r>
+      <w:r>
+        <w:rPr>
+          <w:rFonts w:ascii="Times New Roman" w:cs="Times New Roman" w:eastAsia="Times New Roman" w:hAnsi="Times New Roman"/>
+          <w:sz w:val="24"/>
+          <w:szCs w:val="24"/>
+        </w:rPr>
+        <w:t xml:space="preserve"> arXiv:2207.04672, 2022.</w:t>
       </w:r>
     </w:p>
     <w:p>
       <w:pPr>
         <w:spacing w:after="120"/>
-        <w:ind w:left="720" w:hanging="720"/>
-      </w:pPr>
-      <w:r>
-        <w:t xml:space="preserve">[11]	A. Radford, J. W. Kim, T. Xu, G. Brockman, C. McLeavey, and I. Sutskever, “Robust speech recognition via large-scale weak supervision,” 2022, arXiv:2212.04356.</w:t>
+        <w:ind w:left="432" w:hanging="432"/>
+      </w:pPr>
+      <w:r>
+        <w:rPr>
+          <w:rFonts w:ascii="Times New Roman" w:cs="Times New Roman" w:eastAsia="Times New Roman" w:hAnsi="Times New Roman"/>
+          <w:sz w:val="24"/>
+          <w:szCs w:val="24"/>
+        </w:rPr>
+        <w:t xml:space="preserve">12.	Hansen, M. Piper: A fast, local neural text to speech system. </w:t>
+      </w:r>
+      <w:r>
+        <w:rPr>
+          <w:rFonts w:ascii="Times New Roman" w:cs="Times New Roman" w:eastAsia="Times New Roman" w:hAnsi="Times New Roman"/>
+          <w:i/>
+          <w:iCs/>
+          <w:sz w:val="24"/>
+          <w:szCs w:val="24"/>
+        </w:rPr>
+        <w:t xml:space="preserve">GitHub repository</w:t>
+      </w:r>
+      <w:r>
+        <w:rPr>
+          <w:rFonts w:ascii="Times New Roman" w:cs="Times New Roman" w:eastAsia="Times New Roman" w:hAnsi="Times New Roman"/>
+          <w:sz w:val="24"/>
+          <w:szCs w:val="24"/>
+        </w:rPr>
+        <w:t xml:space="preserve">, 2023. Available: https://github.com/rhasspy/piper [Accessed: 25-Sep-2026].</w:t>
       </w:r>
     </w:p>
     <w:p>
       <w:pPr>
         <w:spacing w:after="120"/>
-        <w:ind w:left="720" w:hanging="720"/>
-      </w:pPr>
-      <w:r>
-        <w:t xml:space="preserve">[12]	J. Traub et al., “Overcoming common flaws in the evaluation of selective classification systems,” 2024, arXiv:2407.01032.</w:t>
+        <w:ind w:left="432" w:hanging="432"/>
+      </w:pPr>
+      <w:r>
+        <w:rPr>
+          <w:rFonts w:ascii="Times New Roman" w:cs="Times New Roman" w:eastAsia="Times New Roman" w:hAnsi="Times New Roman"/>
+          <w:sz w:val="24"/>
+          <w:szCs w:val="24"/>
+        </w:rPr>
+        <w:t xml:space="preserve">13.	Radford, A., Kim, J. W., Xu, T., Brockman, G., McLeavey, C., and Sutskever, I. Robust speech recognition via large-scale weak supervision. </w:t>
+      </w:r>
+      <w:r>
+        <w:rPr>
+          <w:rFonts w:ascii="Times New Roman" w:cs="Times New Roman" w:eastAsia="Times New Roman" w:hAnsi="Times New Roman"/>
+          <w:i/>
+          <w:iCs/>
+          <w:sz w:val="24"/>
+          <w:szCs w:val="24"/>
+        </w:rPr>
+        <w:t xml:space="preserve">Proceedings of the 40th International Conference on Machine Learning (ICML), PMLR</w:t>
+      </w:r>
+      <w:r>
+        <w:rPr>
+          <w:rFonts w:ascii="Times New Roman" w:cs="Times New Roman" w:eastAsia="Times New Roman" w:hAnsi="Times New Roman"/>
+          <w:sz w:val="24"/>
+          <w:szCs w:val="24"/>
+        </w:rPr>
+        <w:t xml:space="preserve">, 202, 28492–28518, 2023.</w:t>
       </w:r>
     </w:p>
     <w:p>
       <w:pPr>
         <w:spacing w:after="120"/>
-        <w:ind w:left="720" w:hanging="720"/>
-      </w:pPr>
-      <w:r>
-        <w:t xml:space="preserve">[13]	D. Bragg et al., “Sign language recognition, generation, and translation: An interdisciplinary perspective,” in Proc. 21st Int. ACM SIGACCESS Conf. Computers and Accessibility (ASSETS ’19), 2019, pp. 16–31, doi: 10.1145/3308561.3353774.</w:t>
+        <w:ind w:left="432" w:hanging="432"/>
+      </w:pPr>
+      <w:r>
+        <w:rPr>
+          <w:rFonts w:ascii="Times New Roman" w:cs="Times New Roman" w:eastAsia="Times New Roman" w:hAnsi="Times New Roman"/>
+          <w:sz w:val="24"/>
+          <w:szCs w:val="24"/>
+        </w:rPr>
+        <w:t xml:space="preserve">14.	Traub, J., Bungert, T. J., Lüth, C. T., Baumgartner, M., Maier-Hein, K. H., Maier-Hein, L., and Jaeger, P. F. Overcoming common flaws in the evaluation of selective classification systems. </w:t>
+      </w:r>
+      <w:r>
+        <w:rPr>
+          <w:rFonts w:ascii="Times New Roman" w:cs="Times New Roman" w:eastAsia="Times New Roman" w:hAnsi="Times New Roman"/>
+          <w:i/>
+          <w:iCs/>
+          <w:sz w:val="24"/>
+          <w:szCs w:val="24"/>
+        </w:rPr>
+        <w:t xml:space="preserve">Advances in Neural Information Processing Systems</w:t>
+      </w:r>
+      <w:r>
+        <w:rPr>
+          <w:rFonts w:ascii="Times New Roman" w:cs="Times New Roman" w:eastAsia="Times New Roman" w:hAnsi="Times New Roman"/>
+          <w:sz w:val="24"/>
+          <w:szCs w:val="24"/>
+        </w:rPr>
+        <w:t xml:space="preserve">, 37, 2024.</w:t>
       </w:r>
     </w:p>
     <w:p>
       <w:pPr>
         <w:spacing w:after="120"/>
-        <w:ind w:left="720" w:hanging="720"/>
-      </w:pPr>
-      <w:r>
-        <w:t xml:space="preserve">[14]	K. Atwell, S. Imai, D. Bragg, and M. Alikhani, “‘Nothing about us without us’: Perspectives of global Deaf and hard-of-hearing community members on sign language technologies,” 2025, arXiv:2512.08839.</w:t>
+        <w:ind w:left="432" w:hanging="432"/>
+      </w:pPr>
+      <w:r>
+        <w:rPr>
+          <w:rFonts w:ascii="Times New Roman" w:cs="Times New Roman" w:eastAsia="Times New Roman" w:hAnsi="Times New Roman"/>
+          <w:sz w:val="24"/>
+          <w:szCs w:val="24"/>
+        </w:rPr>
+        <w:t xml:space="preserve">15.	Bragg, D., Koller, O., Bellard, M., Berke, L., Boudreault, P., Braffort, A., Caselli, N., Huenerfauth, M., Kacorri, H., Verhoef, T., Vogler, C., and Morris, M. R. Sign language recognition, generation, and translation: An interdisciplinary perspective. </w:t>
+      </w:r>
+      <w:r>
+        <w:rPr>
+          <w:rFonts w:ascii="Times New Roman" w:cs="Times New Roman" w:eastAsia="Times New Roman" w:hAnsi="Times New Roman"/>
+          <w:i/>
+          <w:iCs/>
+          <w:sz w:val="24"/>
+          <w:szCs w:val="24"/>
+        </w:rPr>
+        <w:t xml:space="preserve">Proceedings of the 21st International ACM SIGACCESS Conference on Computers and Accessibility (ASSETS ’19)</w:t>
+      </w:r>
+      <w:r>
+        <w:rPr>
+          <w:rFonts w:ascii="Times New Roman" w:cs="Times New Roman" w:eastAsia="Times New Roman" w:hAnsi="Times New Roman"/>
+          <w:sz w:val="24"/>
+          <w:szCs w:val="24"/>
+        </w:rPr>
+        <w:t xml:space="preserve">, 16–31, 2019.</w:t>
       </w:r>
     </w:p>
     <w:p>
       <w:pPr>
         <w:spacing w:after="120"/>
-        <w:ind w:left="720" w:hanging="720"/>
-      </w:pPr>
-      <w:r>
-        <w:t xml:space="preserve">[15]	SignAll, “SignAll translates sign language to English automatically,” PRWeb. [Online]. Available: https://www.prweb.com/releases/signall-translates-sign-language-to-english-automatically-868736288.html</w:t>
+        <w:ind w:left="432" w:hanging="432"/>
+      </w:pPr>
+      <w:r>
+        <w:rPr>
+          <w:rFonts w:ascii="Times New Roman" w:cs="Times New Roman" w:eastAsia="Times New Roman" w:hAnsi="Times New Roman"/>
+          <w:sz w:val="24"/>
+          <w:szCs w:val="24"/>
+        </w:rPr>
+        <w:t xml:space="preserve">16.	Atwell, K., Imai, S., Bragg, D., and Alikhani, M. “Nothing about us without us”: Perspectives of global Deaf and hard-of-hearing community members on sign language technologies. </w:t>
+      </w:r>
+      <w:r>
+        <w:rPr>
+          <w:rFonts w:ascii="Times New Roman" w:cs="Times New Roman" w:eastAsia="Times New Roman" w:hAnsi="Times New Roman"/>
+          <w:i/>
+          <w:iCs/>
+          <w:sz w:val="24"/>
+          <w:szCs w:val="24"/>
+        </w:rPr>
+        <w:t xml:space="preserve">arXiv preprint</w:t>
+      </w:r>
+      <w:r>
+        <w:rPr>
+          <w:rFonts w:ascii="Times New Roman" w:cs="Times New Roman" w:eastAsia="Times New Roman" w:hAnsi="Times New Roman"/>
+          <w:sz w:val="24"/>
+          <w:szCs w:val="24"/>
+        </w:rPr>
+        <w:t xml:space="preserve"> arXiv:2512.08839, 2025.</w:t>
       </w:r>
     </w:p>
     <w:p>
       <w:pPr>
         <w:spacing w:after="120"/>
-        <w:ind w:left="720" w:hanging="720"/>
-      </w:pPr>
-      <w:r>
-        <w:t xml:space="preserve">[16]	M. Menefee, D. Nash, and T. Chandler, “Automated sign language translation and communication using multiple input and output modalities,” U.S. Patent 10 489 639 B2, Nov. 26, 2019.</w:t>
+        <w:ind w:left="432" w:hanging="432"/>
+      </w:pPr>
+      <w:r>
+        <w:rPr>
+          <w:rFonts w:ascii="Times New Roman" w:cs="Times New Roman" w:eastAsia="Times New Roman" w:hAnsi="Times New Roman"/>
+          <w:sz w:val="24"/>
+          <w:szCs w:val="24"/>
+        </w:rPr>
+        <w:t xml:space="preserve">17.	SignAll Technologies. SignAll translates sign language to English automatically. </w:t>
+      </w:r>
+      <w:r>
+        <w:rPr>
+          <w:rFonts w:ascii="Times New Roman" w:cs="Times New Roman" w:eastAsia="Times New Roman" w:hAnsi="Times New Roman"/>
+          <w:i/>
+          <w:iCs/>
+          <w:sz w:val="24"/>
+          <w:szCs w:val="24"/>
+        </w:rPr>
+        <w:t xml:space="preserve">PRWeb press release</w:t>
+      </w:r>
+      <w:r>
+        <w:rPr>
+          <w:rFonts w:ascii="Times New Roman" w:cs="Times New Roman" w:eastAsia="Times New Roman" w:hAnsi="Times New Roman"/>
+          <w:sz w:val="24"/>
+          <w:szCs w:val="24"/>
+        </w:rPr>
+        <w:t xml:space="preserve">, 2018. Available: https://www.prweb.com/releases/signall-translates-sign-language-to-english-automatically-868736288.html [Accessed: 25-Sep-2026].</w:t>
       </w:r>
     </w:p>
     <w:p>
       <w:pPr>
         <w:spacing w:after="120"/>
-        <w:ind w:left="720" w:hanging="720"/>
-      </w:pPr>
-      <w:r>
-        <w:t xml:space="preserve">[17]	N. A. Kelly, “Realtime AI sign language recognition,” U.S. Patent Appl. Pub. 2022/0327961 A1, Oct. 13, 2022.</w:t>
+        <w:ind w:left="432" w:hanging="432"/>
+      </w:pPr>
+      <w:r>
+        <w:rPr>
+          <w:rFonts w:ascii="Times New Roman" w:cs="Times New Roman" w:eastAsia="Times New Roman" w:hAnsi="Times New Roman"/>
+          <w:sz w:val="24"/>
+          <w:szCs w:val="24"/>
+        </w:rPr>
+        <w:t xml:space="preserve">18.	Menefee, M., Nash, D., and Chandler, T. Automated sign language translation and communication using multiple input and output modalities. </w:t>
+      </w:r>
+      <w:r>
+        <w:rPr>
+          <w:rFonts w:ascii="Times New Roman" w:cs="Times New Roman" w:eastAsia="Times New Roman" w:hAnsi="Times New Roman"/>
+          <w:i/>
+          <w:iCs/>
+          <w:sz w:val="24"/>
+          <w:szCs w:val="24"/>
+        </w:rPr>
+        <w:t xml:space="preserve">U.S. Patent</w:t>
+      </w:r>
+      <w:r>
+        <w:rPr>
+          <w:rFonts w:ascii="Times New Roman" w:cs="Times New Roman" w:eastAsia="Times New Roman" w:hAnsi="Times New Roman"/>
+          <w:sz w:val="24"/>
+          <w:szCs w:val="24"/>
+        </w:rPr>
+        <w:t xml:space="preserve"> No. 10,489,639 B2, 2019.</w:t>
       </w:r>
     </w:p>
     <w:p>
       <w:pPr>
         <w:spacing w:after="120"/>
-        <w:ind w:left="720" w:hanging="720"/>
-      </w:pPr>
-      <w:r>
-        <w:t xml:space="preserve">[18]	Z. Zhou et al., “System and method for automated sign language recognition,” U.S. Patent Appl. Pub. 2016/0307469 A1, Oct. 20, 2016.</w:t>
+        <w:ind w:left="432" w:hanging="432"/>
+      </w:pPr>
+      <w:r>
+        <w:rPr>
+          <w:rFonts w:ascii="Times New Roman" w:cs="Times New Roman" w:eastAsia="Times New Roman" w:hAnsi="Times New Roman"/>
+          <w:sz w:val="24"/>
+          <w:szCs w:val="24"/>
+        </w:rPr>
+        <w:t xml:space="preserve">19.	Kelly, N. A. Realtime AI sign language recognition. </w:t>
+      </w:r>
+      <w:r>
+        <w:rPr>
+          <w:rFonts w:ascii="Times New Roman" w:cs="Times New Roman" w:eastAsia="Times New Roman" w:hAnsi="Times New Roman"/>
+          <w:i/>
+          <w:iCs/>
+          <w:sz w:val="24"/>
+          <w:szCs w:val="24"/>
+        </w:rPr>
+        <w:t xml:space="preserve">U.S. Patent Application Publication</w:t>
+      </w:r>
+      <w:r>
+        <w:rPr>
+          <w:rFonts w:ascii="Times New Roman" w:cs="Times New Roman" w:eastAsia="Times New Roman" w:hAnsi="Times New Roman"/>
+          <w:sz w:val="24"/>
+          <w:szCs w:val="24"/>
+        </w:rPr>
+        <w:t xml:space="preserve"> No. 2022/0327961 A1, 2022.</w:t>
       </w:r>
     </w:p>
     <w:p>
       <w:pPr>
         <w:spacing w:after="120"/>
-        <w:ind w:left="720" w:hanging="720"/>
-      </w:pPr>
-      <w:r>
-        <w:t xml:space="preserve">[19]	H. Sakou et al., “Sign recognition apparatus and method and sign translation system using same,” U.S. Patent 5 887 069, Mar. 23, 1999.</w:t>
+        <w:ind w:left="432" w:hanging="432"/>
+      </w:pPr>
+      <w:r>
+        <w:rPr>
+          <w:rFonts w:ascii="Times New Roman" w:cs="Times New Roman" w:eastAsia="Times New Roman" w:hAnsi="Times New Roman"/>
+          <w:sz w:val="24"/>
+          <w:szCs w:val="24"/>
+        </w:rPr>
+        <w:t xml:space="preserve">20.	Zhou, Z., Menne, T., Li, K., Xu, K., Feng, Z., and Lee, C.-H. System and method for automated sign language recognition. </w:t>
+      </w:r>
+      <w:r>
+        <w:rPr>
+          <w:rFonts w:ascii="Times New Roman" w:cs="Times New Roman" w:eastAsia="Times New Roman" w:hAnsi="Times New Roman"/>
+          <w:i/>
+          <w:iCs/>
+          <w:sz w:val="24"/>
+          <w:szCs w:val="24"/>
+        </w:rPr>
+        <w:t xml:space="preserve">U.S. Patent Application Publication</w:t>
+      </w:r>
+      <w:r>
+        <w:rPr>
+          <w:rFonts w:ascii="Times New Roman" w:cs="Times New Roman" w:eastAsia="Times New Roman" w:hAnsi="Times New Roman"/>
+          <w:sz w:val="24"/>
+          <w:szCs w:val="24"/>
+        </w:rPr>
+        <w:t xml:space="preserve"> No. 2016/0307469 A1, 2016.</w:t>
+      </w:r>
+    </w:p>
+    <w:p>
+      <w:pPr>
+        <w:spacing w:after="120"/>
+        <w:ind w:left="432" w:hanging="432"/>
+      </w:pPr>
+      <w:r>
+        <w:rPr>
+          <w:rFonts w:ascii="Times New Roman" w:cs="Times New Roman" w:eastAsia="Times New Roman" w:hAnsi="Times New Roman"/>
+          <w:sz w:val="24"/>
+          <w:szCs w:val="24"/>
+        </w:rPr>
+        <w:t xml:space="preserve">21.	Sakou, H., Sagawa, H., Abe, M., Ichikawa, A., Inoue, K., Arai, K., Shimura, T., and Toda, Y. Sign recognition apparatus and method and sign translation system using same. </w:t>
+      </w:r>
+      <w:r>
+        <w:rPr>
+          <w:rFonts w:ascii="Times New Roman" w:cs="Times New Roman" w:eastAsia="Times New Roman" w:hAnsi="Times New Roman"/>
+          <w:i/>
+          <w:iCs/>
+          <w:sz w:val="24"/>
+          <w:szCs w:val="24"/>
+        </w:rPr>
+        <w:t xml:space="preserve">U.S. Patent</w:t>
+      </w:r>
+      <w:r>
+        <w:rPr>
+          <w:rFonts w:ascii="Times New Roman" w:cs="Times New Roman" w:eastAsia="Times New Roman" w:hAnsi="Times New Roman"/>
+          <w:sz w:val="24"/>
+          <w:szCs w:val="24"/>
+        </w:rPr>
+        <w:t xml:space="preserve"> No. 5,887,069, 1999.</w:t>
       </w:r>
     </w:p>
     <w:sectPr>
@@ -2656,20 +3593,34 @@
       <w:szCs w:val="20"/>
     </w:rPr>
   </w:style>
-  <w:style w:type="paragraph" w:styleId="Heading1">
-    <w:name w:val="Heading 1"/>
+  <w:style w:type="paragraph" w:styleId="IntroSection">
+    <w:name w:val="Intro Section"/>
     <w:basedOn w:val="Normal"/>
     <w:next w:val="Normal"/>
     <w:qFormat/>
     <w:pPr>
-      <w:spacing w:after="120" w:before="240"/>
       <w:outlineLvl w:val="0"/>
     </w:pPr>
     <w:rPr>
       <w:rFonts w:ascii="Times New Roman" w:cs="Times New Roman" w:eastAsia="Times New Roman" w:hAnsi="Times New Roman"/>
       <w:b/>
       <w:bCs/>
-      <w:color w:val="000000"/>
+      <w:sz w:val="24"/>
+      <w:szCs w:val="24"/>
+    </w:rPr>
+  </w:style>
+  <w:style w:type="paragraph" w:styleId="IntroSubsection">
+    <w:name w:val="Intro Subsection"/>
+    <w:basedOn w:val="Normal"/>
+    <w:next w:val="Normal"/>
+    <w:qFormat/>
+    <w:pPr>
+      <w:outlineLvl w:val="1"/>
+    </w:pPr>
+    <w:rPr>
+      <w:rFonts w:ascii="Times New Roman" w:cs="Times New Roman" w:eastAsia="Times New Roman" w:hAnsi="Times New Roman"/>
+      <w:b/>
+      <w:bCs/>
       <w:sz w:val="24"/>
       <w:szCs w:val="24"/>
     </w:rPr>

</xml_diff>